<commit_message>
docs(phase2): add Requirements Engineering to Word report
</commit_message>
<xml_diff>
--- a/PharmaChain_SSE_Report.docx
+++ b/PharmaChain_SSE_Report.docx
@@ -4,22 +4,31 @@
   <w:body>
     <w:p>
       <w:pPr>
-        <w:pStyle w:val="Title"/>
+        <w:spacing w:before="1600"/>
         <w:jc w:val="center"/>
       </w:pPr>
       <w:r>
+        <w:rPr>
+          <w:b/>
+          <w:color w:val="1F3A5F"/>
+          <w:sz w:val="80"/>
+        </w:rPr>
         <w:t>PharmaChain</w:t>
       </w:r>
     </w:p>
     <w:p>
       <w:pPr>
-        <w:pStyle w:val="Heading1"/>
         <w:jc w:val="center"/>
       </w:pPr>
       <w:r>
+        <w:rPr>
+          <w:color w:val="2E74B5"/>
+          <w:sz w:val="32"/>
+        </w:rPr>
         <w:t>Secure Pharmaceutical Supply Chain Tracking System</w:t>
       </w:r>
     </w:p>
+    <w:p/>
     <w:p/>
     <w:p>
       <w:pPr>
@@ -54,22 +63,20 @@
         <w:br/>
       </w:r>
     </w:p>
-    <w:p>
-      <w:r>
-        <w:br w:type="page"/>
-      </w:r>
-    </w:p>
+    <w:p/>
+    <w:p/>
+    <w:p/>
     <w:p>
       <w:pPr>
-        <w:pStyle w:val="Heading1"/>
+        <w:jc w:val="center"/>
       </w:pPr>
       <w:r>
-        <w:t>Table of Contents</w:t>
-      </w:r>
-    </w:p>
-    <w:p>
-      <w:r>
-        <w:t>(Right-click in Word and select 'Update Field' after opening.)</w:t>
+        <w:rPr>
+          <w:i/>
+          <w:color w:val="1F3A5F"/>
+          <w:sz w:val="24"/>
+        </w:rPr>
+        <w:t>"Trusted at every step - from factory to patient."</w:t>
       </w:r>
     </w:p>
     <w:p>
@@ -80,14 +87,54 @@
     <w:p>
       <w:pPr>
         <w:pStyle w:val="Heading1"/>
+        <w:spacing w:before="360" w:after="160"/>
       </w:pPr>
       <w:r>
+        <w:rPr>
+          <w:rFonts w:ascii="Calibri" w:hAnsi="Calibri"/>
+          <w:b/>
+          <w:color w:val="1F3A5F"/>
+          <w:sz w:val="40"/>
+        </w:rPr>
+        <w:t>Table of Contents</w:t>
+      </w:r>
+    </w:p>
+    <w:p>
+      <w:r>
+        <w:t>(In Word: right-click below and choose 'Update Field' to populate. Or use References -&gt; Table of Contents.)</w:t>
+      </w:r>
+    </w:p>
+    <w:p/>
+    <w:p>
+      <w:r>
+        <w:br w:type="page"/>
+      </w:r>
+    </w:p>
+    <w:p>
+      <w:pPr>
+        <w:pStyle w:val="Heading1"/>
+        <w:spacing w:before="360" w:after="160"/>
+      </w:pPr>
+      <w:r>
+        <w:rPr>
+          <w:rFonts w:ascii="Calibri" w:hAnsi="Calibri"/>
+          <w:b/>
+          <w:color w:val="1F3A5F"/>
+          <w:sz w:val="40"/>
+        </w:rPr>
         <w:t>Global Traceability Thread</w:t>
       </w:r>
     </w:p>
     <w:p>
       <w:r>
-        <w:t>SR-03 - Every ownership transfer must be digitally signed, hash-chained, and audit-logged.</w:t>
+        <w:rPr>
+          <w:b/>
+          <w:color w:val="2E74B5"/>
+        </w:rPr>
+        <w:t>SR-03</w:t>
+      </w:r>
+      <w:r>
+        <w:t xml:space="preserve"> - Every ownership transfer must be digitally signed, hash-chained, and audit-logged.</w:t>
       </w:r>
     </w:p>
     <w:p>
@@ -103,16 +150,30 @@
     <w:p>
       <w:pPr>
         <w:pStyle w:val="Heading1"/>
+        <w:spacing w:before="360" w:after="160"/>
       </w:pPr>
       <w:r>
+        <w:rPr>
+          <w:rFonts w:ascii="Calibri" w:hAnsi="Calibri"/>
+          <w:b/>
+          <w:color w:val="1F3A5F"/>
+          <w:sz w:val="40"/>
+        </w:rPr>
         <w:t>Phase 1 - Agile Process and Development Approach</w:t>
       </w:r>
     </w:p>
     <w:p>
       <w:pPr>
         <w:pStyle w:val="Heading2"/>
+        <w:spacing w:before="240" w:after="120"/>
       </w:pPr>
       <w:r>
+        <w:rPr>
+          <w:rFonts w:ascii="Calibri" w:hAnsi="Calibri"/>
+          <w:b/>
+          <w:color w:val="2E74B5"/>
+          <w:sz w:val="30"/>
+        </w:rPr>
         <w:t>1.1 Selected Approach: Scrum-XP</w:t>
       </w:r>
     </w:p>
@@ -124,8 +185,15 @@
     <w:p>
       <w:pPr>
         <w:pStyle w:val="Heading3"/>
+        <w:spacing w:before="160" w:after="80"/>
       </w:pPr>
       <w:r>
+        <w:rPr>
+          <w:rFonts w:ascii="Calibri" w:hAnsi="Calibri"/>
+          <w:b/>
+          <w:color w:val="1F3A5F"/>
+          <w:sz w:val="25"/>
+        </w:rPr>
         <w:t>Justification</w:t>
       </w:r>
     </w:p>
@@ -172,8 +240,15 @@
     <w:p>
       <w:pPr>
         <w:pStyle w:val="Heading3"/>
+        <w:spacing w:before="160" w:after="80"/>
       </w:pPr>
       <w:r>
+        <w:rPr>
+          <w:rFonts w:ascii="Calibri" w:hAnsi="Calibri"/>
+          <w:b/>
+          <w:color w:val="1F3A5F"/>
+          <w:sz w:val="25"/>
+        </w:rPr>
         <w:t>Sprint Configuration</w:t>
       </w:r>
     </w:p>
@@ -212,49 +287,79 @@
     <w:p>
       <w:pPr>
         <w:pStyle w:val="Heading2"/>
+        <w:spacing w:before="240" w:after="120"/>
       </w:pPr>
       <w:r>
+        <w:rPr>
+          <w:rFonts w:ascii="Calibri" w:hAnsi="Calibri"/>
+          <w:b/>
+          <w:color w:val="2E74B5"/>
+          <w:sz w:val="30"/>
+        </w:rPr>
         <w:t>1.2 Agile Manifesto Mapping</w:t>
       </w:r>
     </w:p>
     <w:tbl>
       <w:tblPr>
-        <w:tblStyle w:val="LightGrid-Accent1"/>
+        <w:tblStyle w:val="TableGrid"/>
         <w:tblW w:type="auto" w:w="0"/>
+        <w:jc w:val="center"/>
+        <w:tblLayout w:type="autofit"/>
         <w:tblLook w:firstColumn="1" w:firstRow="1" w:lastColumn="0" w:lastRow="0" w:noHBand="0" w:noVBand="1" w:val="04A0"/>
       </w:tblPr>
       <w:tblGrid>
-        <w:gridCol w:w="2880"/>
-        <w:gridCol w:w="2880"/>
-        <w:gridCol w:w="2880"/>
+        <w:gridCol w:w="3249"/>
+        <w:gridCol w:w="3249"/>
+        <w:gridCol w:w="3249"/>
       </w:tblGrid>
       <w:tr>
         <w:tc>
           <w:tcPr>
-            <w:tcW w:type="dxa" w:w="2880"/>
+            <w:tcW w:type="dxa" w:w="3249"/>
+            <w:vAlign w:val="center"/>
+            <w:shd w:val="clear" w:color="auto" w:fill="1F3A5F"/>
           </w:tcPr>
           <w:p>
             <w:r>
+              <w:rPr>
+                <w:b/>
+                <w:color w:val="FFFFFF"/>
+                <w:sz w:val="21"/>
+              </w:rPr>
               <w:t>#</w:t>
             </w:r>
           </w:p>
         </w:tc>
         <w:tc>
           <w:tcPr>
-            <w:tcW w:type="dxa" w:w="2880"/>
+            <w:tcW w:type="dxa" w:w="3249"/>
+            <w:vAlign w:val="center"/>
+            <w:shd w:val="clear" w:color="auto" w:fill="1F3A5F"/>
           </w:tcPr>
           <w:p>
             <w:r>
+              <w:rPr>
+                <w:b/>
+                <w:color w:val="FFFFFF"/>
+                <w:sz w:val="21"/>
+              </w:rPr>
               <w:t>Principle</w:t>
             </w:r>
           </w:p>
         </w:tc>
         <w:tc>
           <w:tcPr>
-            <w:tcW w:type="dxa" w:w="2880"/>
+            <w:tcW w:type="dxa" w:w="3249"/>
+            <w:vAlign w:val="center"/>
+            <w:shd w:val="clear" w:color="auto" w:fill="1F3A5F"/>
           </w:tcPr>
           <w:p>
             <w:r>
+              <w:rPr>
+                <w:b/>
+                <w:color w:val="FFFFFF"/>
+                <w:sz w:val="21"/>
+              </w:rPr>
               <w:t>Application to PharmaChain</w:t>
             </w:r>
           </w:p>
@@ -263,7 +368,8 @@
       <w:tr>
         <w:tc>
           <w:tcPr>
-            <w:tcW w:type="dxa" w:w="2880"/>
+            <w:tcW w:type="dxa" w:w="3249"/>
+            <w:vAlign w:val="center"/>
           </w:tcPr>
           <w:p>
             <w:r>
@@ -273,7 +379,8 @@
         </w:tc>
         <w:tc>
           <w:tcPr>
-            <w:tcW w:type="dxa" w:w="2880"/>
+            <w:tcW w:type="dxa" w:w="3249"/>
+            <w:vAlign w:val="center"/>
           </w:tcPr>
           <w:p>
             <w:r>
@@ -283,7 +390,8 @@
         </w:tc>
         <w:tc>
           <w:tcPr>
-            <w:tcW w:type="dxa" w:w="2880"/>
+            <w:tcW w:type="dxa" w:w="3249"/>
+            <w:vAlign w:val="center"/>
           </w:tcPr>
           <w:p>
             <w:r>
@@ -295,7 +403,9 @@
       <w:tr>
         <w:tc>
           <w:tcPr>
-            <w:tcW w:type="dxa" w:w="2880"/>
+            <w:tcW w:type="dxa" w:w="3249"/>
+            <w:vAlign w:val="center"/>
+            <w:shd w:val="clear" w:color="auto" w:fill="F7FAFD"/>
           </w:tcPr>
           <w:p>
             <w:r>
@@ -305,7 +415,9 @@
         </w:tc>
         <w:tc>
           <w:tcPr>
-            <w:tcW w:type="dxa" w:w="2880"/>
+            <w:tcW w:type="dxa" w:w="3249"/>
+            <w:vAlign w:val="center"/>
+            <w:shd w:val="clear" w:color="auto" w:fill="F7FAFD"/>
           </w:tcPr>
           <w:p>
             <w:r>
@@ -315,7 +427,9 @@
         </w:tc>
         <w:tc>
           <w:tcPr>
-            <w:tcW w:type="dxa" w:w="2880"/>
+            <w:tcW w:type="dxa" w:w="3249"/>
+            <w:vAlign w:val="center"/>
+            <w:shd w:val="clear" w:color="auto" w:fill="F7FAFD"/>
           </w:tcPr>
           <w:p>
             <w:r>
@@ -327,7 +441,8 @@
       <w:tr>
         <w:tc>
           <w:tcPr>
-            <w:tcW w:type="dxa" w:w="2880"/>
+            <w:tcW w:type="dxa" w:w="3249"/>
+            <w:vAlign w:val="center"/>
           </w:tcPr>
           <w:p>
             <w:r>
@@ -337,7 +452,8 @@
         </w:tc>
         <w:tc>
           <w:tcPr>
-            <w:tcW w:type="dxa" w:w="2880"/>
+            <w:tcW w:type="dxa" w:w="3249"/>
+            <w:vAlign w:val="center"/>
           </w:tcPr>
           <w:p>
             <w:r>
@@ -347,7 +463,8 @@
         </w:tc>
         <w:tc>
           <w:tcPr>
-            <w:tcW w:type="dxa" w:w="2880"/>
+            <w:tcW w:type="dxa" w:w="3249"/>
+            <w:vAlign w:val="center"/>
           </w:tcPr>
           <w:p>
             <w:r>
@@ -359,7 +476,9 @@
       <w:tr>
         <w:tc>
           <w:tcPr>
-            <w:tcW w:type="dxa" w:w="2880"/>
+            <w:tcW w:type="dxa" w:w="3249"/>
+            <w:vAlign w:val="center"/>
+            <w:shd w:val="clear" w:color="auto" w:fill="F7FAFD"/>
           </w:tcPr>
           <w:p>
             <w:r>
@@ -369,7 +488,9 @@
         </w:tc>
         <w:tc>
           <w:tcPr>
-            <w:tcW w:type="dxa" w:w="2880"/>
+            <w:tcW w:type="dxa" w:w="3249"/>
+            <w:vAlign w:val="center"/>
+            <w:shd w:val="clear" w:color="auto" w:fill="F7FAFD"/>
           </w:tcPr>
           <w:p>
             <w:r>
@@ -379,7 +500,9 @@
         </w:tc>
         <w:tc>
           <w:tcPr>
-            <w:tcW w:type="dxa" w:w="2880"/>
+            <w:tcW w:type="dxa" w:w="3249"/>
+            <w:vAlign w:val="center"/>
+            <w:shd w:val="clear" w:color="auto" w:fill="F7FAFD"/>
           </w:tcPr>
           <w:p>
             <w:r>
@@ -391,7 +514,8 @@
       <w:tr>
         <w:tc>
           <w:tcPr>
-            <w:tcW w:type="dxa" w:w="2880"/>
+            <w:tcW w:type="dxa" w:w="3249"/>
+            <w:vAlign w:val="center"/>
           </w:tcPr>
           <w:p>
             <w:r>
@@ -401,7 +525,8 @@
         </w:tc>
         <w:tc>
           <w:tcPr>
-            <w:tcW w:type="dxa" w:w="2880"/>
+            <w:tcW w:type="dxa" w:w="3249"/>
+            <w:vAlign w:val="center"/>
           </w:tcPr>
           <w:p>
             <w:r>
@@ -411,7 +536,8 @@
         </w:tc>
         <w:tc>
           <w:tcPr>
-            <w:tcW w:type="dxa" w:w="2880"/>
+            <w:tcW w:type="dxa" w:w="3249"/>
+            <w:vAlign w:val="center"/>
           </w:tcPr>
           <w:p>
             <w:r>
@@ -424,16 +550,30 @@
     <w:p>
       <w:pPr>
         <w:pStyle w:val="Heading2"/>
+        <w:spacing w:before="240" w:after="120"/>
       </w:pPr>
       <w:r>
+        <w:rPr>
+          <w:rFonts w:ascii="Calibri" w:hAnsi="Calibri"/>
+          <w:b/>
+          <w:color w:val="2E74B5"/>
+          <w:sz w:val="30"/>
+        </w:rPr>
         <w:t>1.3 Refactoring Evidence</w:t>
       </w:r>
     </w:p>
     <w:p>
       <w:pPr>
         <w:pStyle w:val="Heading3"/>
+        <w:spacing w:before="160" w:after="80"/>
       </w:pPr>
       <w:r>
+        <w:rPr>
+          <w:rFonts w:ascii="Calibri" w:hAnsi="Calibri"/>
+          <w:b/>
+          <w:color w:val="1F3A5F"/>
+          <w:sz w:val="25"/>
+        </w:rPr>
         <w:t>Refactoring 1: Ownership Transfer (Monolithic to Layered)</w:t>
       </w:r>
     </w:p>
@@ -444,29 +584,158 @@
     </w:p>
     <w:p>
       <w:pPr>
-        <w:pStyle w:val="NoSpacing"/>
+        <w:spacing w:before="0" w:after="0" w:line="240" w:lineRule="auto"/>
+        <w:ind w:left="360"/>
+        <w:shd w:val="clear" w:color="auto" w:fill="F2F2F2"/>
       </w:pPr>
       <w:r>
+        <w:rPr>
+          <w:rFonts w:ascii="Consolas" w:hAnsi="Consolas"/>
+          <w:color w:val="1E1E1E"/>
+          <w:sz w:val="18"/>
+        </w:rPr>
         <w:t>@app.post('/transfer')</w:t>
-        <w:br/>
+      </w:r>
+    </w:p>
+    <w:p>
+      <w:pPr>
+        <w:spacing w:before="0" w:after="0" w:line="240" w:lineRule="auto"/>
+        <w:ind w:left="360"/>
+        <w:shd w:val="clear" w:color="auto" w:fill="F2F2F2"/>
+      </w:pPr>
+      <w:r>
+        <w:rPr>
+          <w:rFonts w:ascii="Consolas" w:hAnsi="Consolas"/>
+          <w:color w:val="1E1E1E"/>
+          <w:sz w:val="18"/>
+        </w:rPr>
         <w:t>def transfer(product_id, new_owner):</w:t>
-        <w:br/>
+      </w:r>
+    </w:p>
+    <w:p>
+      <w:pPr>
+        <w:spacing w:before="0" w:after="0" w:line="240" w:lineRule="auto"/>
+        <w:ind w:left="360"/>
+        <w:shd w:val="clear" w:color="auto" w:fill="F2F2F2"/>
+      </w:pPr>
+      <w:r>
+        <w:rPr>
+          <w:rFonts w:ascii="Consolas" w:hAnsi="Consolas"/>
+          <w:color w:val="1E1E1E"/>
+          <w:sz w:val="18"/>
+        </w:rPr>
         <w:t xml:space="preserve">    conn = sqlite3.connect('pharmachain.db')</w:t>
-        <w:br/>
+      </w:r>
+    </w:p>
+    <w:p>
+      <w:pPr>
+        <w:spacing w:before="0" w:after="0" w:line="240" w:lineRule="auto"/>
+        <w:ind w:left="360"/>
+        <w:shd w:val="clear" w:color="auto" w:fill="F2F2F2"/>
+      </w:pPr>
+      <w:r>
+        <w:rPr>
+          <w:rFonts w:ascii="Consolas" w:hAnsi="Consolas"/>
+          <w:color w:val="1E1E1E"/>
+          <w:sz w:val="18"/>
+        </w:rPr>
         <w:t xml:space="preserve">    cur = conn.cursor()</w:t>
-        <w:br/>
+      </w:r>
+    </w:p>
+    <w:p>
+      <w:pPr>
+        <w:spacing w:before="0" w:after="0" w:line="240" w:lineRule="auto"/>
+        <w:ind w:left="360"/>
+        <w:shd w:val="clear" w:color="auto" w:fill="F2F2F2"/>
+      </w:pPr>
+      <w:r>
+        <w:rPr>
+          <w:rFonts w:ascii="Consolas" w:hAnsi="Consolas"/>
+          <w:color w:val="1E1E1E"/>
+          <w:sz w:val="18"/>
+        </w:rPr>
         <w:t xml:space="preserve">    cur.execute(f"SELECT * FROM products WHERE id='{product_id}'")  # SQLi</w:t>
-        <w:br/>
+      </w:r>
+    </w:p>
+    <w:p>
+      <w:pPr>
+        <w:spacing w:before="0" w:after="0" w:line="240" w:lineRule="auto"/>
+        <w:ind w:left="360"/>
+        <w:shd w:val="clear" w:color="auto" w:fill="F2F2F2"/>
+      </w:pPr>
+      <w:r>
+        <w:rPr>
+          <w:rFonts w:ascii="Consolas" w:hAnsi="Consolas"/>
+          <w:color w:val="1E1E1E"/>
+          <w:sz w:val="18"/>
+        </w:rPr>
         <w:t xml:space="preserve">    product = cur.fetchone()</w:t>
-        <w:br/>
+      </w:r>
+    </w:p>
+    <w:p>
+      <w:pPr>
+        <w:spacing w:before="0" w:after="0" w:line="240" w:lineRule="auto"/>
+        <w:ind w:left="360"/>
+        <w:shd w:val="clear" w:color="auto" w:fill="F2F2F2"/>
+      </w:pPr>
+      <w:r>
+        <w:rPr>
+          <w:rFonts w:ascii="Consolas" w:hAnsi="Consolas"/>
+          <w:color w:val="1E1E1E"/>
+          <w:sz w:val="18"/>
+        </w:rPr>
         <w:t xml:space="preserve">    if product:</w:t>
-        <w:br/>
+      </w:r>
+    </w:p>
+    <w:p>
+      <w:pPr>
+        <w:spacing w:before="0" w:after="0" w:line="240" w:lineRule="auto"/>
+        <w:ind w:left="360"/>
+        <w:shd w:val="clear" w:color="auto" w:fill="F2F2F2"/>
+      </w:pPr>
+      <w:r>
+        <w:rPr>
+          <w:rFonts w:ascii="Consolas" w:hAnsi="Consolas"/>
+          <w:color w:val="1E1E1E"/>
+          <w:sz w:val="18"/>
+        </w:rPr>
         <w:t xml:space="preserve">        cur.execute(f"UPDATE products SET owner='{new_owner}' WHERE id='{product_id}'")</w:t>
-        <w:br/>
+      </w:r>
+    </w:p>
+    <w:p>
+      <w:pPr>
+        <w:spacing w:before="0" w:after="0" w:line="240" w:lineRule="auto"/>
+        <w:ind w:left="360"/>
+        <w:shd w:val="clear" w:color="auto" w:fill="F2F2F2"/>
+      </w:pPr>
+      <w:r>
+        <w:rPr>
+          <w:rFonts w:ascii="Consolas" w:hAnsi="Consolas"/>
+          <w:color w:val="1E1E1E"/>
+          <w:sz w:val="18"/>
+        </w:rPr>
         <w:t xml:space="preserve">        conn.commit()  # no auth, no audit, no signature</w:t>
-        <w:br/>
+      </w:r>
+    </w:p>
+    <w:p>
+      <w:pPr>
+        <w:spacing w:before="0" w:after="0" w:line="240" w:lineRule="auto"/>
+        <w:ind w:left="360"/>
+        <w:shd w:val="clear" w:color="auto" w:fill="F2F2F2"/>
+      </w:pPr>
+      <w:r>
+        <w:rPr>
+          <w:rFonts w:ascii="Consolas" w:hAnsi="Consolas"/>
+          <w:color w:val="1E1E1E"/>
+          <w:sz w:val="18"/>
+        </w:rPr>
         <w:t xml:space="preserve">    return {'status': 'ok'}</w:t>
       </w:r>
+    </w:p>
+    <w:p>
+      <w:pPr>
+        <w:spacing w:after="80"/>
+      </w:pPr>
     </w:p>
     <w:p>
       <w:r>
@@ -475,31 +744,173 @@
     </w:p>
     <w:p>
       <w:pPr>
-        <w:pStyle w:val="NoSpacing"/>
+        <w:spacing w:before="0" w:after="0" w:line="240" w:lineRule="auto"/>
+        <w:ind w:left="360"/>
+        <w:shd w:val="clear" w:color="auto" w:fill="F2F2F2"/>
       </w:pPr>
       <w:r>
+        <w:rPr>
+          <w:rFonts w:ascii="Consolas" w:hAnsi="Consolas"/>
+          <w:color w:val="1E1E1E"/>
+          <w:sz w:val="18"/>
+        </w:rPr>
         <w:t>class OwnershipService:</w:t>
-        <w:br/>
+      </w:r>
+    </w:p>
+    <w:p>
+      <w:pPr>
+        <w:spacing w:before="0" w:after="0" w:line="240" w:lineRule="auto"/>
+        <w:ind w:left="360"/>
+        <w:shd w:val="clear" w:color="auto" w:fill="F2F2F2"/>
+      </w:pPr>
+      <w:r>
+        <w:rPr>
+          <w:rFonts w:ascii="Consolas" w:hAnsi="Consolas"/>
+          <w:color w:val="1E1E1E"/>
+          <w:sz w:val="18"/>
+        </w:rPr>
         <w:t xml:space="preserve">    def transfer(self, product_id, new_owner, actor, signature):</w:t>
-        <w:br/>
+      </w:r>
+    </w:p>
+    <w:p>
+      <w:pPr>
+        <w:spacing w:before="0" w:after="0" w:line="240" w:lineRule="auto"/>
+        <w:ind w:left="360"/>
+        <w:shd w:val="clear" w:color="auto" w:fill="F2F2F2"/>
+      </w:pPr>
+      <w:r>
+        <w:rPr>
+          <w:rFonts w:ascii="Consolas" w:hAnsi="Consolas"/>
+          <w:color w:val="1E1E1E"/>
+          <w:sz w:val="18"/>
+        </w:rPr>
         <w:t xml:space="preserve">        self.authz.require(actor, 'TRANSFER_OWNERSHIP', product_id)</w:t>
-        <w:br/>
+      </w:r>
+    </w:p>
+    <w:p>
+      <w:pPr>
+        <w:spacing w:before="0" w:after="0" w:line="240" w:lineRule="auto"/>
+        <w:ind w:left="360"/>
+        <w:shd w:val="clear" w:color="auto" w:fill="F2F2F2"/>
+      </w:pPr>
+      <w:r>
+        <w:rPr>
+          <w:rFonts w:ascii="Consolas" w:hAnsi="Consolas"/>
+          <w:color w:val="1E1E1E"/>
+          <w:sz w:val="18"/>
+        </w:rPr>
         <w:t xml:space="preserve">        self.signer.verify(actor, product_id, new_owner, signature)</w:t>
-        <w:br/>
+      </w:r>
+    </w:p>
+    <w:p>
+      <w:pPr>
+        <w:spacing w:before="0" w:after="0" w:line="240" w:lineRule="auto"/>
+        <w:ind w:left="360"/>
+        <w:shd w:val="clear" w:color="auto" w:fill="F2F2F2"/>
+      </w:pPr>
+      <w:r>
+        <w:rPr>
+          <w:rFonts w:ascii="Consolas" w:hAnsi="Consolas"/>
+          <w:color w:val="1E1E1E"/>
+          <w:sz w:val="18"/>
+        </w:rPr>
         <w:t xml:space="preserve">        product = self.repo.get(product_id)</w:t>
-        <w:br/>
+      </w:r>
+    </w:p>
+    <w:p>
+      <w:pPr>
+        <w:spacing w:before="0" w:after="0" w:line="240" w:lineRule="auto"/>
+        <w:ind w:left="360"/>
+        <w:shd w:val="clear" w:color="auto" w:fill="F2F2F2"/>
+      </w:pPr>
+      <w:r>
+        <w:rPr>
+          <w:rFonts w:ascii="Consolas" w:hAnsi="Consolas"/>
+          <w:color w:val="1E1E1E"/>
+          <w:sz w:val="18"/>
+        </w:rPr>
         <w:t xml:space="preserve">        with self.repo.transaction():</w:t>
-        <w:br/>
+      </w:r>
+    </w:p>
+    <w:p>
+      <w:pPr>
+        <w:spacing w:before="0" w:after="0" w:line="240" w:lineRule="auto"/>
+        <w:ind w:left="360"/>
+        <w:shd w:val="clear" w:color="auto" w:fill="F2F2F2"/>
+      </w:pPr>
+      <w:r>
+        <w:rPr>
+          <w:rFonts w:ascii="Consolas" w:hAnsi="Consolas"/>
+          <w:color w:val="1E1E1E"/>
+          <w:sz w:val="18"/>
+        </w:rPr>
         <w:t xml:space="preserve">            product.owner = new_owner</w:t>
-        <w:br/>
+      </w:r>
+    </w:p>
+    <w:p>
+      <w:pPr>
+        <w:spacing w:before="0" w:after="0" w:line="240" w:lineRule="auto"/>
+        <w:ind w:left="360"/>
+        <w:shd w:val="clear" w:color="auto" w:fill="F2F2F2"/>
+      </w:pPr>
+      <w:r>
+        <w:rPr>
+          <w:rFonts w:ascii="Consolas" w:hAnsi="Consolas"/>
+          <w:color w:val="1E1E1E"/>
+          <w:sz w:val="18"/>
+        </w:rPr>
         <w:t xml:space="preserve">            self.repo.save(product)</w:t>
-        <w:br/>
+      </w:r>
+    </w:p>
+    <w:p>
+      <w:pPr>
+        <w:spacing w:before="0" w:after="0" w:line="240" w:lineRule="auto"/>
+        <w:ind w:left="360"/>
+        <w:shd w:val="clear" w:color="auto" w:fill="F2F2F2"/>
+      </w:pPr>
+      <w:r>
+        <w:rPr>
+          <w:rFonts w:ascii="Consolas" w:hAnsi="Consolas"/>
+          <w:color w:val="1E1E1E"/>
+          <w:sz w:val="18"/>
+        </w:rPr>
         <w:t xml:space="preserve">            tx_hash = self.ledger.append({...})</w:t>
-        <w:br/>
+      </w:r>
+    </w:p>
+    <w:p>
+      <w:pPr>
+        <w:spacing w:before="0" w:after="0" w:line="240" w:lineRule="auto"/>
+        <w:ind w:left="360"/>
+        <w:shd w:val="clear" w:color="auto" w:fill="F2F2F2"/>
+      </w:pPr>
+      <w:r>
+        <w:rPr>
+          <w:rFonts w:ascii="Consolas" w:hAnsi="Consolas"/>
+          <w:color w:val="1E1E1E"/>
+          <w:sz w:val="18"/>
+        </w:rPr>
         <w:t xml:space="preserve">        self.audit.log(actor, 'TRANSFER', product_id, tx_hash)</w:t>
-        <w:br/>
+      </w:r>
+    </w:p>
+    <w:p>
+      <w:pPr>
+        <w:spacing w:before="0" w:after="0" w:line="240" w:lineRule="auto"/>
+        <w:ind w:left="360"/>
+        <w:shd w:val="clear" w:color="auto" w:fill="F2F2F2"/>
+      </w:pPr>
+      <w:r>
+        <w:rPr>
+          <w:rFonts w:ascii="Consolas" w:hAnsi="Consolas"/>
+          <w:color w:val="1E1E1E"/>
+          <w:sz w:val="18"/>
+        </w:rPr>
         <w:t xml:space="preserve">        return TransferResult(True, tx_hash)</w:t>
       </w:r>
+    </w:p>
+    <w:p>
+      <w:pPr>
+        <w:spacing w:after="80"/>
+      </w:pPr>
     </w:p>
     <w:p>
       <w:r>
@@ -515,8 +926,15 @@
     <w:p>
       <w:pPr>
         <w:pStyle w:val="Heading3"/>
+        <w:spacing w:before="160" w:after="80"/>
       </w:pPr>
       <w:r>
+        <w:rPr>
+          <w:rFonts w:ascii="Calibri" w:hAnsi="Calibri"/>
+          <w:b/>
+          <w:color w:val="1F3A5F"/>
+          <w:sz w:val="25"/>
+        </w:rPr>
         <w:t>Refactoring 2: Serial Uniqueness Validation (DRY)</w:t>
       </w:r>
     </w:p>
@@ -533,38 +951,61 @@
     <w:p>
       <w:pPr>
         <w:pStyle w:val="Heading2"/>
+        <w:spacing w:before="240" w:after="120"/>
       </w:pPr>
       <w:r>
+        <w:rPr>
+          <w:rFonts w:ascii="Calibri" w:hAnsi="Calibri"/>
+          <w:b/>
+          <w:color w:val="2E74B5"/>
+          <w:sz w:val="30"/>
+        </w:rPr>
         <w:t>1.4 Limitations of Agile for a Security-Critical System</w:t>
       </w:r>
     </w:p>
     <w:tbl>
       <w:tblPr>
-        <w:tblStyle w:val="LightGrid-Accent1"/>
+        <w:tblStyle w:val="TableGrid"/>
         <w:tblW w:type="auto" w:w="0"/>
+        <w:jc w:val="center"/>
+        <w:tblLayout w:type="autofit"/>
         <w:tblLook w:firstColumn="1" w:firstRow="1" w:lastColumn="0" w:lastRow="0" w:noHBand="0" w:noVBand="1" w:val="04A0"/>
       </w:tblPr>
       <w:tblGrid>
-        <w:gridCol w:w="4320"/>
-        <w:gridCol w:w="4320"/>
+        <w:gridCol w:w="4873"/>
+        <w:gridCol w:w="4873"/>
       </w:tblGrid>
       <w:tr>
         <w:tc>
           <w:tcPr>
-            <w:tcW w:type="dxa" w:w="4320"/>
+            <w:tcW w:type="dxa" w:w="4873"/>
+            <w:vAlign w:val="center"/>
+            <w:shd w:val="clear" w:color="auto" w:fill="1F3A5F"/>
           </w:tcPr>
           <w:p>
             <w:r>
+              <w:rPr>
+                <w:b/>
+                <w:color w:val="FFFFFF"/>
+                <w:sz w:val="21"/>
+              </w:rPr>
               <w:t>Limitation / Risk</w:t>
             </w:r>
           </w:p>
         </w:tc>
         <w:tc>
           <w:tcPr>
-            <w:tcW w:type="dxa" w:w="4320"/>
+            <w:tcW w:type="dxa" w:w="4873"/>
+            <w:vAlign w:val="center"/>
+            <w:shd w:val="clear" w:color="auto" w:fill="1F3A5F"/>
           </w:tcPr>
           <w:p>
             <w:r>
+              <w:rPr>
+                <w:b/>
+                <w:color w:val="FFFFFF"/>
+                <w:sz w:val="21"/>
+              </w:rPr>
               <w:t>Mitigation</w:t>
             </w:r>
           </w:p>
@@ -573,7 +1014,8 @@
       <w:tr>
         <w:tc>
           <w:tcPr>
-            <w:tcW w:type="dxa" w:w="4320"/>
+            <w:tcW w:type="dxa" w:w="4873"/>
+            <w:vAlign w:val="center"/>
           </w:tcPr>
           <w:p>
             <w:r>
@@ -583,7 +1025,8 @@
         </w:tc>
         <w:tc>
           <w:tcPr>
-            <w:tcW w:type="dxa" w:w="4320"/>
+            <w:tcW w:type="dxa" w:w="4873"/>
+            <w:vAlign w:val="center"/>
           </w:tcPr>
           <w:p>
             <w:r>
@@ -595,7 +1038,9 @@
       <w:tr>
         <w:tc>
           <w:tcPr>
-            <w:tcW w:type="dxa" w:w="4320"/>
+            <w:tcW w:type="dxa" w:w="4873"/>
+            <w:vAlign w:val="center"/>
+            <w:shd w:val="clear" w:color="auto" w:fill="F7FAFD"/>
           </w:tcPr>
           <w:p>
             <w:r>
@@ -605,7 +1050,9 @@
         </w:tc>
         <w:tc>
           <w:tcPr>
-            <w:tcW w:type="dxa" w:w="4320"/>
+            <w:tcW w:type="dxa" w:w="4873"/>
+            <w:vAlign w:val="center"/>
+            <w:shd w:val="clear" w:color="auto" w:fill="F7FAFD"/>
           </w:tcPr>
           <w:p>
             <w:r>
@@ -617,7 +1064,8 @@
       <w:tr>
         <w:tc>
           <w:tcPr>
-            <w:tcW w:type="dxa" w:w="4320"/>
+            <w:tcW w:type="dxa" w:w="4873"/>
+            <w:vAlign w:val="center"/>
           </w:tcPr>
           <w:p>
             <w:r>
@@ -627,7 +1075,8 @@
         </w:tc>
         <w:tc>
           <w:tcPr>
-            <w:tcW w:type="dxa" w:w="4320"/>
+            <w:tcW w:type="dxa" w:w="4873"/>
+            <w:vAlign w:val="center"/>
           </w:tcPr>
           <w:p>
             <w:r>
@@ -639,7 +1088,9 @@
       <w:tr>
         <w:tc>
           <w:tcPr>
-            <w:tcW w:type="dxa" w:w="4320"/>
+            <w:tcW w:type="dxa" w:w="4873"/>
+            <w:vAlign w:val="center"/>
+            <w:shd w:val="clear" w:color="auto" w:fill="F7FAFD"/>
           </w:tcPr>
           <w:p>
             <w:r>
@@ -649,7 +1100,9 @@
         </w:tc>
         <w:tc>
           <w:tcPr>
-            <w:tcW w:type="dxa" w:w="4320"/>
+            <w:tcW w:type="dxa" w:w="4873"/>
+            <w:vAlign w:val="center"/>
+            <w:shd w:val="clear" w:color="auto" w:fill="F7FAFD"/>
           </w:tcPr>
           <w:p>
             <w:r>
@@ -661,7 +1114,8 @@
       <w:tr>
         <w:tc>
           <w:tcPr>
-            <w:tcW w:type="dxa" w:w="4320"/>
+            <w:tcW w:type="dxa" w:w="4873"/>
+            <w:vAlign w:val="center"/>
           </w:tcPr>
           <w:p>
             <w:r>
@@ -671,7 +1125,8 @@
         </w:tc>
         <w:tc>
           <w:tcPr>
-            <w:tcW w:type="dxa" w:w="4320"/>
+            <w:tcW w:type="dxa" w:w="4873"/>
+            <w:vAlign w:val="center"/>
           </w:tcPr>
           <w:p>
             <w:r>
@@ -686,14 +1141,3412 @@
         <w:br w:type="page"/>
       </w:r>
     </w:p>
+    <w:p>
+      <w:pPr>
+        <w:pStyle w:val="Heading1"/>
+        <w:spacing w:before="360" w:after="160"/>
+      </w:pPr>
+      <w:r>
+        <w:rPr>
+          <w:rFonts w:ascii="Calibri" w:hAnsi="Calibri"/>
+          <w:b/>
+          <w:color w:val="1F3A5F"/>
+          <w:sz w:val="40"/>
+        </w:rPr>
+        <w:t>Phase 2 - Requirements Engineering</w:t>
+      </w:r>
+    </w:p>
+    <w:p>
+      <w:pPr>
+        <w:pStyle w:val="Heading2"/>
+        <w:spacing w:before="240" w:after="120"/>
+      </w:pPr>
+      <w:r>
+        <w:rPr>
+          <w:rFonts w:ascii="Calibri" w:hAnsi="Calibri"/>
+          <w:b/>
+          <w:color w:val="2E74B5"/>
+          <w:sz w:val="30"/>
+        </w:rPr>
+        <w:t>2.1 Stakeholders and User Types</w:t>
+      </w:r>
+    </w:p>
+    <w:p>
+      <w:r>
+        <w:t>PharmaChain involves 5 primary actors (one per organization in the supply chain) plus 3 justified supporting roles required for regulatory compliance and security.</w:t>
+      </w:r>
+    </w:p>
+    <w:tbl>
+      <w:tblPr>
+        <w:tblStyle w:val="TableGrid"/>
+        <w:tblW w:type="auto" w:w="0"/>
+        <w:jc w:val="center"/>
+        <w:tblLayout w:type="autofit"/>
+        <w:tblLook w:firstColumn="1" w:firstRow="1" w:lastColumn="0" w:lastRow="0" w:noHBand="0" w:noVBand="1" w:val="04A0"/>
+      </w:tblPr>
+      <w:tblGrid>
+        <w:gridCol w:w="1949"/>
+        <w:gridCol w:w="1949"/>
+        <w:gridCol w:w="1949"/>
+        <w:gridCol w:w="1949"/>
+        <w:gridCol w:w="1949"/>
+      </w:tblGrid>
+      <w:tr>
+        <w:tc>
+          <w:tcPr>
+            <w:tcW w:type="dxa" w:w="1949"/>
+            <w:vAlign w:val="center"/>
+            <w:shd w:val="clear" w:color="auto" w:fill="1F3A5F"/>
+          </w:tcPr>
+          <w:p>
+            <w:r>
+              <w:rPr>
+                <w:b/>
+                <w:color w:val="FFFFFF"/>
+                <w:sz w:val="21"/>
+              </w:rPr>
+              <w:t>#</w:t>
+            </w:r>
+          </w:p>
+        </w:tc>
+        <w:tc>
+          <w:tcPr>
+            <w:tcW w:type="dxa" w:w="1949"/>
+            <w:vAlign w:val="center"/>
+            <w:shd w:val="clear" w:color="auto" w:fill="1F3A5F"/>
+          </w:tcPr>
+          <w:p>
+            <w:r>
+              <w:rPr>
+                <w:b/>
+                <w:color w:val="FFFFFF"/>
+                <w:sz w:val="21"/>
+              </w:rPr>
+              <w:t>Stakeholder</w:t>
+            </w:r>
+          </w:p>
+        </w:tc>
+        <w:tc>
+          <w:tcPr>
+            <w:tcW w:type="dxa" w:w="1949"/>
+            <w:vAlign w:val="center"/>
+            <w:shd w:val="clear" w:color="auto" w:fill="1F3A5F"/>
+          </w:tcPr>
+          <w:p>
+            <w:r>
+              <w:rPr>
+                <w:b/>
+                <w:color w:val="FFFFFF"/>
+                <w:sz w:val="21"/>
+              </w:rPr>
+              <w:t>Type</w:t>
+            </w:r>
+          </w:p>
+        </w:tc>
+        <w:tc>
+          <w:tcPr>
+            <w:tcW w:type="dxa" w:w="1949"/>
+            <w:vAlign w:val="center"/>
+            <w:shd w:val="clear" w:color="auto" w:fill="1F3A5F"/>
+          </w:tcPr>
+          <w:p>
+            <w:r>
+              <w:rPr>
+                <w:b/>
+                <w:color w:val="FFFFFF"/>
+                <w:sz w:val="21"/>
+              </w:rPr>
+              <w:t>Goal</w:t>
+            </w:r>
+          </w:p>
+        </w:tc>
+        <w:tc>
+          <w:tcPr>
+            <w:tcW w:type="dxa" w:w="1949"/>
+            <w:vAlign w:val="center"/>
+            <w:shd w:val="clear" w:color="auto" w:fill="1F3A5F"/>
+          </w:tcPr>
+          <w:p>
+            <w:r>
+              <w:rPr>
+                <w:b/>
+                <w:color w:val="FFFFFF"/>
+                <w:sz w:val="21"/>
+              </w:rPr>
+              <w:t>Key Concern</w:t>
+            </w:r>
+          </w:p>
+        </w:tc>
+      </w:tr>
+      <w:tr>
+        <w:tc>
+          <w:tcPr>
+            <w:tcW w:type="dxa" w:w="1949"/>
+            <w:vAlign w:val="center"/>
+          </w:tcPr>
+          <w:p>
+            <w:r>
+              <w:t>1</w:t>
+            </w:r>
+          </w:p>
+        </w:tc>
+        <w:tc>
+          <w:tcPr>
+            <w:tcW w:type="dxa" w:w="1949"/>
+            <w:vAlign w:val="center"/>
+          </w:tcPr>
+          <w:p>
+            <w:r>
+              <w:t>Manufacturer</w:t>
+            </w:r>
+          </w:p>
+        </w:tc>
+        <w:tc>
+          <w:tcPr>
+            <w:tcW w:type="dxa" w:w="1949"/>
+            <w:vAlign w:val="center"/>
+          </w:tcPr>
+          <w:p>
+            <w:r>
+              <w:t>Primary Actor</w:t>
+            </w:r>
+          </w:p>
+        </w:tc>
+        <w:tc>
+          <w:tcPr>
+            <w:tcW w:type="dxa" w:w="1949"/>
+            <w:vAlign w:val="center"/>
+          </w:tcPr>
+          <w:p>
+            <w:r>
+              <w:t>Create and serialize drug products</w:t>
+            </w:r>
+          </w:p>
+        </w:tc>
+        <w:tc>
+          <w:tcPr>
+            <w:tcW w:type="dxa" w:w="1949"/>
+            <w:vAlign w:val="center"/>
+          </w:tcPr>
+          <w:p>
+            <w:r>
+              <w:t>Anti-counterfeit, batch traceability</w:t>
+            </w:r>
+          </w:p>
+        </w:tc>
+      </w:tr>
+      <w:tr>
+        <w:tc>
+          <w:tcPr>
+            <w:tcW w:type="dxa" w:w="1949"/>
+            <w:vAlign w:val="center"/>
+            <w:shd w:val="clear" w:color="auto" w:fill="F7FAFD"/>
+          </w:tcPr>
+          <w:p>
+            <w:r>
+              <w:t>2</w:t>
+            </w:r>
+          </w:p>
+        </w:tc>
+        <w:tc>
+          <w:tcPr>
+            <w:tcW w:type="dxa" w:w="1949"/>
+            <w:vAlign w:val="center"/>
+            <w:shd w:val="clear" w:color="auto" w:fill="F7FAFD"/>
+          </w:tcPr>
+          <w:p>
+            <w:r>
+              <w:t>Distributor</w:t>
+            </w:r>
+          </w:p>
+        </w:tc>
+        <w:tc>
+          <w:tcPr>
+            <w:tcW w:type="dxa" w:w="1949"/>
+            <w:vAlign w:val="center"/>
+            <w:shd w:val="clear" w:color="auto" w:fill="F7FAFD"/>
+          </w:tcPr>
+          <w:p>
+            <w:r>
+              <w:t>Primary Actor</w:t>
+            </w:r>
+          </w:p>
+        </w:tc>
+        <w:tc>
+          <w:tcPr>
+            <w:tcW w:type="dxa" w:w="1949"/>
+            <w:vAlign w:val="center"/>
+            <w:shd w:val="clear" w:color="auto" w:fill="F7FAFD"/>
+          </w:tcPr>
+          <w:p>
+            <w:r>
+              <w:t>Move products between orgs, transfer ownership</w:t>
+            </w:r>
+          </w:p>
+        </w:tc>
+        <w:tc>
+          <w:tcPr>
+            <w:tcW w:type="dxa" w:w="1949"/>
+            <w:vAlign w:val="center"/>
+            <w:shd w:val="clear" w:color="auto" w:fill="F7FAFD"/>
+          </w:tcPr>
+          <w:p>
+            <w:r>
+              <w:t>Non-repudiation of transfer</w:t>
+            </w:r>
+          </w:p>
+        </w:tc>
+      </w:tr>
+      <w:tr>
+        <w:tc>
+          <w:tcPr>
+            <w:tcW w:type="dxa" w:w="1949"/>
+            <w:vAlign w:val="center"/>
+          </w:tcPr>
+          <w:p>
+            <w:r>
+              <w:t>3</w:t>
+            </w:r>
+          </w:p>
+        </w:tc>
+        <w:tc>
+          <w:tcPr>
+            <w:tcW w:type="dxa" w:w="1949"/>
+            <w:vAlign w:val="center"/>
+          </w:tcPr>
+          <w:p>
+            <w:r>
+              <w:t>Warehouse</w:t>
+            </w:r>
+          </w:p>
+        </w:tc>
+        <w:tc>
+          <w:tcPr>
+            <w:tcW w:type="dxa" w:w="1949"/>
+            <w:vAlign w:val="center"/>
+          </w:tcPr>
+          <w:p>
+            <w:r>
+              <w:t>Primary Actor</w:t>
+            </w:r>
+          </w:p>
+        </w:tc>
+        <w:tc>
+          <w:tcPr>
+            <w:tcW w:type="dxa" w:w="1949"/>
+            <w:vAlign w:val="center"/>
+          </w:tcPr>
+          <w:p>
+            <w:r>
+              <w:t>Receive, store, dispatch shipments</w:t>
+            </w:r>
+          </w:p>
+        </w:tc>
+        <w:tc>
+          <w:tcPr>
+            <w:tcW w:type="dxa" w:w="1949"/>
+            <w:vAlign w:val="center"/>
+          </w:tcPr>
+          <w:p>
+            <w:r>
+              <w:t>Tamper-proof receipts</w:t>
+            </w:r>
+          </w:p>
+        </w:tc>
+      </w:tr>
+      <w:tr>
+        <w:tc>
+          <w:tcPr>
+            <w:tcW w:type="dxa" w:w="1949"/>
+            <w:vAlign w:val="center"/>
+            <w:shd w:val="clear" w:color="auto" w:fill="F7FAFD"/>
+          </w:tcPr>
+          <w:p>
+            <w:r>
+              <w:t>4</w:t>
+            </w:r>
+          </w:p>
+        </w:tc>
+        <w:tc>
+          <w:tcPr>
+            <w:tcW w:type="dxa" w:w="1949"/>
+            <w:vAlign w:val="center"/>
+            <w:shd w:val="clear" w:color="auto" w:fill="F7FAFD"/>
+          </w:tcPr>
+          <w:p>
+            <w:r>
+              <w:t>Retailer</w:t>
+            </w:r>
+          </w:p>
+        </w:tc>
+        <w:tc>
+          <w:tcPr>
+            <w:tcW w:type="dxa" w:w="1949"/>
+            <w:vAlign w:val="center"/>
+            <w:shd w:val="clear" w:color="auto" w:fill="F7FAFD"/>
+          </w:tcPr>
+          <w:p>
+            <w:r>
+              <w:t>Primary Actor</w:t>
+            </w:r>
+          </w:p>
+        </w:tc>
+        <w:tc>
+          <w:tcPr>
+            <w:tcW w:type="dxa" w:w="1949"/>
+            <w:vAlign w:val="center"/>
+            <w:shd w:val="clear" w:color="auto" w:fill="F7FAFD"/>
+          </w:tcPr>
+          <w:p>
+            <w:r>
+              <w:t>Receive products, sell to customers</w:t>
+            </w:r>
+          </w:p>
+        </w:tc>
+        <w:tc>
+          <w:tcPr>
+            <w:tcW w:type="dxa" w:w="1949"/>
+            <w:vAlign w:val="center"/>
+            <w:shd w:val="clear" w:color="auto" w:fill="F7FAFD"/>
+          </w:tcPr>
+          <w:p>
+            <w:r>
+              <w:t>Authenticity verification</w:t>
+            </w:r>
+          </w:p>
+        </w:tc>
+      </w:tr>
+      <w:tr>
+        <w:tc>
+          <w:tcPr>
+            <w:tcW w:type="dxa" w:w="1949"/>
+            <w:vAlign w:val="center"/>
+          </w:tcPr>
+          <w:p>
+            <w:r>
+              <w:t>5</w:t>
+            </w:r>
+          </w:p>
+        </w:tc>
+        <w:tc>
+          <w:tcPr>
+            <w:tcW w:type="dxa" w:w="1949"/>
+            <w:vAlign w:val="center"/>
+          </w:tcPr>
+          <w:p>
+            <w:r>
+              <w:t>Customer / Patient</w:t>
+            </w:r>
+          </w:p>
+        </w:tc>
+        <w:tc>
+          <w:tcPr>
+            <w:tcW w:type="dxa" w:w="1949"/>
+            <w:vAlign w:val="center"/>
+          </w:tcPr>
+          <w:p>
+            <w:r>
+              <w:t>Primary Actor</w:t>
+            </w:r>
+          </w:p>
+        </w:tc>
+        <w:tc>
+          <w:tcPr>
+            <w:tcW w:type="dxa" w:w="1949"/>
+            <w:vAlign w:val="center"/>
+          </w:tcPr>
+          <w:p>
+            <w:r>
+              <w:t>Verify drug authenticity</w:t>
+            </w:r>
+          </w:p>
+        </w:tc>
+        <w:tc>
+          <w:tcPr>
+            <w:tcW w:type="dxa" w:w="1949"/>
+            <w:vAlign w:val="center"/>
+          </w:tcPr>
+          <w:p>
+            <w:r>
+              <w:t>Trust, privacy</w:t>
+            </w:r>
+          </w:p>
+        </w:tc>
+      </w:tr>
+      <w:tr>
+        <w:tc>
+          <w:tcPr>
+            <w:tcW w:type="dxa" w:w="1949"/>
+            <w:vAlign w:val="center"/>
+            <w:shd w:val="clear" w:color="auto" w:fill="F7FAFD"/>
+          </w:tcPr>
+          <w:p>
+            <w:r>
+              <w:t>6</w:t>
+            </w:r>
+          </w:p>
+        </w:tc>
+        <w:tc>
+          <w:tcPr>
+            <w:tcW w:type="dxa" w:w="1949"/>
+            <w:vAlign w:val="center"/>
+            <w:shd w:val="clear" w:color="auto" w:fill="F7FAFD"/>
+          </w:tcPr>
+          <w:p>
+            <w:r>
+              <w:t>Auditor / Regulator (FDA)</w:t>
+            </w:r>
+          </w:p>
+        </w:tc>
+        <w:tc>
+          <w:tcPr>
+            <w:tcW w:type="dxa" w:w="1949"/>
+            <w:vAlign w:val="center"/>
+            <w:shd w:val="clear" w:color="auto" w:fill="F7FAFD"/>
+          </w:tcPr>
+          <w:p>
+            <w:r>
+              <w:t>Secondary Actor</w:t>
+            </w:r>
+          </w:p>
+        </w:tc>
+        <w:tc>
+          <w:tcPr>
+            <w:tcW w:type="dxa" w:w="1949"/>
+            <w:vAlign w:val="center"/>
+            <w:shd w:val="clear" w:color="auto" w:fill="F7FAFD"/>
+          </w:tcPr>
+          <w:p>
+            <w:r>
+              <w:t>Inspect immutable history</w:t>
+            </w:r>
+          </w:p>
+        </w:tc>
+        <w:tc>
+          <w:tcPr>
+            <w:tcW w:type="dxa" w:w="1949"/>
+            <w:vAlign w:val="center"/>
+            <w:shd w:val="clear" w:color="auto" w:fill="F7FAFD"/>
+          </w:tcPr>
+          <w:p>
+            <w:r>
+              <w:t>Compliance, tamper evidence</w:t>
+            </w:r>
+          </w:p>
+        </w:tc>
+      </w:tr>
+      <w:tr>
+        <w:tc>
+          <w:tcPr>
+            <w:tcW w:type="dxa" w:w="1949"/>
+            <w:vAlign w:val="center"/>
+          </w:tcPr>
+          <w:p>
+            <w:r>
+              <w:t>7</w:t>
+            </w:r>
+          </w:p>
+        </w:tc>
+        <w:tc>
+          <w:tcPr>
+            <w:tcW w:type="dxa" w:w="1949"/>
+            <w:vAlign w:val="center"/>
+          </w:tcPr>
+          <w:p>
+            <w:r>
+              <w:t>System Administrator</w:t>
+            </w:r>
+          </w:p>
+        </w:tc>
+        <w:tc>
+          <w:tcPr>
+            <w:tcW w:type="dxa" w:w="1949"/>
+            <w:vAlign w:val="center"/>
+          </w:tcPr>
+          <w:p>
+            <w:r>
+              <w:t>Supporting Actor</w:t>
+            </w:r>
+          </w:p>
+        </w:tc>
+        <w:tc>
+          <w:tcPr>
+            <w:tcW w:type="dxa" w:w="1949"/>
+            <w:vAlign w:val="center"/>
+          </w:tcPr>
+          <w:p>
+            <w:r>
+              <w:t>Onboard orgs, manage keys</w:t>
+            </w:r>
+          </w:p>
+        </w:tc>
+        <w:tc>
+          <w:tcPr>
+            <w:tcW w:type="dxa" w:w="1949"/>
+            <w:vAlign w:val="center"/>
+          </w:tcPr>
+          <w:p>
+            <w:r>
+              <w:t>Least privilege, key lifecycle</w:t>
+            </w:r>
+          </w:p>
+        </w:tc>
+      </w:tr>
+      <w:tr>
+        <w:tc>
+          <w:tcPr>
+            <w:tcW w:type="dxa" w:w="1949"/>
+            <w:vAlign w:val="center"/>
+            <w:shd w:val="clear" w:color="auto" w:fill="F7FAFD"/>
+          </w:tcPr>
+          <w:p>
+            <w:r>
+              <w:t>8</w:t>
+            </w:r>
+          </w:p>
+        </w:tc>
+        <w:tc>
+          <w:tcPr>
+            <w:tcW w:type="dxa" w:w="1949"/>
+            <w:vAlign w:val="center"/>
+            <w:shd w:val="clear" w:color="auto" w:fill="F7FAFD"/>
+          </w:tcPr>
+          <w:p>
+            <w:r>
+              <w:t>Security Officer</w:t>
+            </w:r>
+          </w:p>
+        </w:tc>
+        <w:tc>
+          <w:tcPr>
+            <w:tcW w:type="dxa" w:w="1949"/>
+            <w:vAlign w:val="center"/>
+            <w:shd w:val="clear" w:color="auto" w:fill="F7FAFD"/>
+          </w:tcPr>
+          <w:p>
+            <w:r>
+              <w:t>Supporting Actor</w:t>
+            </w:r>
+          </w:p>
+        </w:tc>
+        <w:tc>
+          <w:tcPr>
+            <w:tcW w:type="dxa" w:w="1949"/>
+            <w:vAlign w:val="center"/>
+            <w:shd w:val="clear" w:color="auto" w:fill="F7FAFD"/>
+          </w:tcPr>
+          <w:p>
+            <w:r>
+              <w:t>Monitor anomalies and threats</w:t>
+            </w:r>
+          </w:p>
+        </w:tc>
+        <w:tc>
+          <w:tcPr>
+            <w:tcW w:type="dxa" w:w="1949"/>
+            <w:vAlign w:val="center"/>
+            <w:shd w:val="clear" w:color="auto" w:fill="F7FAFD"/>
+          </w:tcPr>
+          <w:p>
+            <w:r>
+              <w:t>Real-time alerts, SIEM</w:t>
+            </w:r>
+          </w:p>
+        </w:tc>
+      </w:tr>
+    </w:tbl>
+    <w:p/>
+    <w:p>
+      <w:r>
+        <w:rPr>
+          <w:b/>
+        </w:rPr>
+        <w:t xml:space="preserve">Justification for extra actors: </w:t>
+      </w:r>
+      <w:r>
+        <w:t>PharmaChain is regulated (FDA DSCSA) and cross-organizational. An Auditor is required for regulatory inspection. An Admin is needed to onboard/offboard organizations. A Security Officer is required to detect fraud, key abuse, and anomalous transfers.</w:t>
+      </w:r>
+    </w:p>
+    <w:p>
+      <w:pPr>
+        <w:pStyle w:val="Heading2"/>
+        <w:spacing w:before="240" w:after="120"/>
+      </w:pPr>
+      <w:r>
+        <w:rPr>
+          <w:rFonts w:ascii="Calibri" w:hAnsi="Calibri"/>
+          <w:b/>
+          <w:color w:val="2E74B5"/>
+          <w:sz w:val="30"/>
+        </w:rPr>
+        <w:t>2.2 Functional Requirements (FR)</w:t>
+      </w:r>
+    </w:p>
+    <w:tbl>
+      <w:tblPr>
+        <w:tblStyle w:val="TableGrid"/>
+        <w:tblW w:type="auto" w:w="0"/>
+        <w:jc w:val="center"/>
+        <w:tblLayout w:type="autofit"/>
+        <w:tblLook w:firstColumn="1" w:firstRow="1" w:lastColumn="0" w:lastRow="0" w:noHBand="0" w:noVBand="1" w:val="04A0"/>
+      </w:tblPr>
+      <w:tblGrid>
+        <w:gridCol w:w="2436"/>
+        <w:gridCol w:w="2436"/>
+        <w:gridCol w:w="2436"/>
+        <w:gridCol w:w="2436"/>
+      </w:tblGrid>
+      <w:tr>
+        <w:tc>
+          <w:tcPr>
+            <w:tcW w:type="dxa" w:w="2436"/>
+            <w:vAlign w:val="center"/>
+            <w:shd w:val="clear" w:color="auto" w:fill="1F3A5F"/>
+          </w:tcPr>
+          <w:p>
+            <w:r>
+              <w:rPr>
+                <w:b/>
+                <w:color w:val="FFFFFF"/>
+                <w:sz w:val="21"/>
+              </w:rPr>
+              <w:t>ID</w:t>
+            </w:r>
+          </w:p>
+        </w:tc>
+        <w:tc>
+          <w:tcPr>
+            <w:tcW w:type="dxa" w:w="2436"/>
+            <w:vAlign w:val="center"/>
+            <w:shd w:val="clear" w:color="auto" w:fill="1F3A5F"/>
+          </w:tcPr>
+          <w:p>
+            <w:r>
+              <w:rPr>
+                <w:b/>
+                <w:color w:val="FFFFFF"/>
+                <w:sz w:val="21"/>
+              </w:rPr>
+              <w:t>Requirement</w:t>
+            </w:r>
+          </w:p>
+        </w:tc>
+        <w:tc>
+          <w:tcPr>
+            <w:tcW w:type="dxa" w:w="2436"/>
+            <w:vAlign w:val="center"/>
+            <w:shd w:val="clear" w:color="auto" w:fill="1F3A5F"/>
+          </w:tcPr>
+          <w:p>
+            <w:r>
+              <w:rPr>
+                <w:b/>
+                <w:color w:val="FFFFFF"/>
+                <w:sz w:val="21"/>
+              </w:rPr>
+              <w:t>Actor</w:t>
+            </w:r>
+          </w:p>
+        </w:tc>
+        <w:tc>
+          <w:tcPr>
+            <w:tcW w:type="dxa" w:w="2436"/>
+            <w:vAlign w:val="center"/>
+            <w:shd w:val="clear" w:color="auto" w:fill="1F3A5F"/>
+          </w:tcPr>
+          <w:p>
+            <w:r>
+              <w:rPr>
+                <w:b/>
+                <w:color w:val="FFFFFF"/>
+                <w:sz w:val="21"/>
+              </w:rPr>
+              <w:t>Priority</w:t>
+            </w:r>
+          </w:p>
+        </w:tc>
+      </w:tr>
+      <w:tr>
+        <w:tc>
+          <w:tcPr>
+            <w:tcW w:type="dxa" w:w="2436"/>
+            <w:vAlign w:val="center"/>
+          </w:tcPr>
+          <w:p>
+            <w:r>
+              <w:t>FR-01</w:t>
+            </w:r>
+          </w:p>
+        </w:tc>
+        <w:tc>
+          <w:tcPr>
+            <w:tcW w:type="dxa" w:w="2436"/>
+            <w:vAlign w:val="center"/>
+          </w:tcPr>
+          <w:p>
+            <w:r>
+              <w:t>Register a new product with a globally unique serial number</w:t>
+            </w:r>
+          </w:p>
+        </w:tc>
+        <w:tc>
+          <w:tcPr>
+            <w:tcW w:type="dxa" w:w="2436"/>
+            <w:vAlign w:val="center"/>
+          </w:tcPr>
+          <w:p>
+            <w:r>
+              <w:t>Manufacturer</w:t>
+            </w:r>
+          </w:p>
+        </w:tc>
+        <w:tc>
+          <w:tcPr>
+            <w:tcW w:type="dxa" w:w="2436"/>
+            <w:vAlign w:val="center"/>
+          </w:tcPr>
+          <w:p>
+            <w:r>
+              <w:t>High</w:t>
+            </w:r>
+          </w:p>
+        </w:tc>
+      </w:tr>
+      <w:tr>
+        <w:tc>
+          <w:tcPr>
+            <w:tcW w:type="dxa" w:w="2436"/>
+            <w:vAlign w:val="center"/>
+            <w:shd w:val="clear" w:color="auto" w:fill="F7FAFD"/>
+          </w:tcPr>
+          <w:p>
+            <w:r>
+              <w:t>FR-02</w:t>
+            </w:r>
+          </w:p>
+        </w:tc>
+        <w:tc>
+          <w:tcPr>
+            <w:tcW w:type="dxa" w:w="2436"/>
+            <w:vAlign w:val="center"/>
+            <w:shd w:val="clear" w:color="auto" w:fill="F7FAFD"/>
+          </w:tcPr>
+          <w:p>
+            <w:r>
+              <w:t>Create a shipment linking source org, destination org, product batch</w:t>
+            </w:r>
+          </w:p>
+        </w:tc>
+        <w:tc>
+          <w:tcPr>
+            <w:tcW w:type="dxa" w:w="2436"/>
+            <w:vAlign w:val="center"/>
+            <w:shd w:val="clear" w:color="auto" w:fill="F7FAFD"/>
+          </w:tcPr>
+          <w:p>
+            <w:r>
+              <w:t>Manufacturer / Distributor</w:t>
+            </w:r>
+          </w:p>
+        </w:tc>
+        <w:tc>
+          <w:tcPr>
+            <w:tcW w:type="dxa" w:w="2436"/>
+            <w:vAlign w:val="center"/>
+            <w:shd w:val="clear" w:color="auto" w:fill="F7FAFD"/>
+          </w:tcPr>
+          <w:p>
+            <w:r>
+              <w:t>High</w:t>
+            </w:r>
+          </w:p>
+        </w:tc>
+      </w:tr>
+      <w:tr>
+        <w:tc>
+          <w:tcPr>
+            <w:tcW w:type="dxa" w:w="2436"/>
+            <w:vAlign w:val="center"/>
+          </w:tcPr>
+          <w:p>
+            <w:r>
+              <w:t>FR-03</w:t>
+            </w:r>
+          </w:p>
+        </w:tc>
+        <w:tc>
+          <w:tcPr>
+            <w:tcW w:type="dxa" w:w="2436"/>
+            <w:vAlign w:val="center"/>
+          </w:tcPr>
+          <w:p>
+            <w:r>
+              <w:t>Confirm warehouse receipt with seal/hash verification</w:t>
+            </w:r>
+          </w:p>
+        </w:tc>
+        <w:tc>
+          <w:tcPr>
+            <w:tcW w:type="dxa" w:w="2436"/>
+            <w:vAlign w:val="center"/>
+          </w:tcPr>
+          <w:p>
+            <w:r>
+              <w:t>Warehouse</w:t>
+            </w:r>
+          </w:p>
+        </w:tc>
+        <w:tc>
+          <w:tcPr>
+            <w:tcW w:type="dxa" w:w="2436"/>
+            <w:vAlign w:val="center"/>
+          </w:tcPr>
+          <w:p>
+            <w:r>
+              <w:t>High</w:t>
+            </w:r>
+          </w:p>
+        </w:tc>
+      </w:tr>
+      <w:tr>
+        <w:tc>
+          <w:tcPr>
+            <w:tcW w:type="dxa" w:w="2436"/>
+            <w:vAlign w:val="center"/>
+            <w:shd w:val="clear" w:color="auto" w:fill="F7FAFD"/>
+          </w:tcPr>
+          <w:p>
+            <w:r>
+              <w:t>FR-04</w:t>
+            </w:r>
+          </w:p>
+        </w:tc>
+        <w:tc>
+          <w:tcPr>
+            <w:tcW w:type="dxa" w:w="2436"/>
+            <w:vAlign w:val="center"/>
+            <w:shd w:val="clear" w:color="auto" w:fill="F7FAFD"/>
+          </w:tcPr>
+          <w:p>
+            <w:r>
+              <w:t>Transfer ownership between organizations with signature</w:t>
+            </w:r>
+          </w:p>
+        </w:tc>
+        <w:tc>
+          <w:tcPr>
+            <w:tcW w:type="dxa" w:w="2436"/>
+            <w:vAlign w:val="center"/>
+            <w:shd w:val="clear" w:color="auto" w:fill="F7FAFD"/>
+          </w:tcPr>
+          <w:p>
+            <w:r>
+              <w:t>Distributor / Retailer</w:t>
+            </w:r>
+          </w:p>
+        </w:tc>
+        <w:tc>
+          <w:tcPr>
+            <w:tcW w:type="dxa" w:w="2436"/>
+            <w:vAlign w:val="center"/>
+            <w:shd w:val="clear" w:color="auto" w:fill="F7FAFD"/>
+          </w:tcPr>
+          <w:p>
+            <w:r>
+              <w:t>High</w:t>
+            </w:r>
+          </w:p>
+        </w:tc>
+      </w:tr>
+      <w:tr>
+        <w:tc>
+          <w:tcPr>
+            <w:tcW w:type="dxa" w:w="2436"/>
+            <w:vAlign w:val="center"/>
+          </w:tcPr>
+          <w:p>
+            <w:r>
+              <w:t>FR-05</w:t>
+            </w:r>
+          </w:p>
+        </w:tc>
+        <w:tc>
+          <w:tcPr>
+            <w:tcW w:type="dxa" w:w="2436"/>
+            <w:vAlign w:val="center"/>
+          </w:tcPr>
+          <w:p>
+            <w:r>
+              <w:t>Confirm delivery to retailer / customer</w:t>
+            </w:r>
+          </w:p>
+        </w:tc>
+        <w:tc>
+          <w:tcPr>
+            <w:tcW w:type="dxa" w:w="2436"/>
+            <w:vAlign w:val="center"/>
+          </w:tcPr>
+          <w:p>
+            <w:r>
+              <w:t>Retailer</w:t>
+            </w:r>
+          </w:p>
+        </w:tc>
+        <w:tc>
+          <w:tcPr>
+            <w:tcW w:type="dxa" w:w="2436"/>
+            <w:vAlign w:val="center"/>
+          </w:tcPr>
+          <w:p>
+            <w:r>
+              <w:t>High</w:t>
+            </w:r>
+          </w:p>
+        </w:tc>
+      </w:tr>
+      <w:tr>
+        <w:tc>
+          <w:tcPr>
+            <w:tcW w:type="dxa" w:w="2436"/>
+            <w:vAlign w:val="center"/>
+            <w:shd w:val="clear" w:color="auto" w:fill="F7FAFD"/>
+          </w:tcPr>
+          <w:p>
+            <w:r>
+              <w:t>FR-06</w:t>
+            </w:r>
+          </w:p>
+        </w:tc>
+        <w:tc>
+          <w:tcPr>
+            <w:tcW w:type="dxa" w:w="2436"/>
+            <w:vAlign w:val="center"/>
+            <w:shd w:val="clear" w:color="auto" w:fill="F7FAFD"/>
+          </w:tcPr>
+          <w:p>
+            <w:r>
+              <w:t>Query product status and full history</w:t>
+            </w:r>
+          </w:p>
+        </w:tc>
+        <w:tc>
+          <w:tcPr>
+            <w:tcW w:type="dxa" w:w="2436"/>
+            <w:vAlign w:val="center"/>
+            <w:shd w:val="clear" w:color="auto" w:fill="F7FAFD"/>
+          </w:tcPr>
+          <w:p>
+            <w:r>
+              <w:t>Any authenticated actor</w:t>
+            </w:r>
+          </w:p>
+        </w:tc>
+        <w:tc>
+          <w:tcPr>
+            <w:tcW w:type="dxa" w:w="2436"/>
+            <w:vAlign w:val="center"/>
+            <w:shd w:val="clear" w:color="auto" w:fill="F7FAFD"/>
+          </w:tcPr>
+          <w:p>
+            <w:r>
+              <w:t>High</w:t>
+            </w:r>
+          </w:p>
+        </w:tc>
+      </w:tr>
+      <w:tr>
+        <w:tc>
+          <w:tcPr>
+            <w:tcW w:type="dxa" w:w="2436"/>
+            <w:vAlign w:val="center"/>
+          </w:tcPr>
+          <w:p>
+            <w:r>
+              <w:t>FR-07</w:t>
+            </w:r>
+          </w:p>
+        </w:tc>
+        <w:tc>
+          <w:tcPr>
+            <w:tcW w:type="dxa" w:w="2436"/>
+            <w:vAlign w:val="center"/>
+          </w:tcPr>
+          <w:p>
+            <w:r>
+              <w:t>Verify product authenticity via QR / serial lookup</w:t>
+            </w:r>
+          </w:p>
+        </w:tc>
+        <w:tc>
+          <w:tcPr>
+            <w:tcW w:type="dxa" w:w="2436"/>
+            <w:vAlign w:val="center"/>
+          </w:tcPr>
+          <w:p>
+            <w:r>
+              <w:t>Customer</w:t>
+            </w:r>
+          </w:p>
+        </w:tc>
+        <w:tc>
+          <w:tcPr>
+            <w:tcW w:type="dxa" w:w="2436"/>
+            <w:vAlign w:val="center"/>
+          </w:tcPr>
+          <w:p>
+            <w:r>
+              <w:t>High</w:t>
+            </w:r>
+          </w:p>
+        </w:tc>
+      </w:tr>
+      <w:tr>
+        <w:tc>
+          <w:tcPr>
+            <w:tcW w:type="dxa" w:w="2436"/>
+            <w:vAlign w:val="center"/>
+            <w:shd w:val="clear" w:color="auto" w:fill="F7FAFD"/>
+          </w:tcPr>
+          <w:p>
+            <w:r>
+              <w:t>FR-08</w:t>
+            </w:r>
+          </w:p>
+        </w:tc>
+        <w:tc>
+          <w:tcPr>
+            <w:tcW w:type="dxa" w:w="2436"/>
+            <w:vAlign w:val="center"/>
+            <w:shd w:val="clear" w:color="auto" w:fill="F7FAFD"/>
+          </w:tcPr>
+          <w:p>
+            <w:r>
+              <w:t>View immutable audit trail (read-only)</w:t>
+            </w:r>
+          </w:p>
+        </w:tc>
+        <w:tc>
+          <w:tcPr>
+            <w:tcW w:type="dxa" w:w="2436"/>
+            <w:vAlign w:val="center"/>
+            <w:shd w:val="clear" w:color="auto" w:fill="F7FAFD"/>
+          </w:tcPr>
+          <w:p>
+            <w:r>
+              <w:t>Auditor</w:t>
+            </w:r>
+          </w:p>
+        </w:tc>
+        <w:tc>
+          <w:tcPr>
+            <w:tcW w:type="dxa" w:w="2436"/>
+            <w:vAlign w:val="center"/>
+            <w:shd w:val="clear" w:color="auto" w:fill="F7FAFD"/>
+          </w:tcPr>
+          <w:p>
+            <w:r>
+              <w:t>High</w:t>
+            </w:r>
+          </w:p>
+        </w:tc>
+      </w:tr>
+      <w:tr>
+        <w:tc>
+          <w:tcPr>
+            <w:tcW w:type="dxa" w:w="2436"/>
+            <w:vAlign w:val="center"/>
+          </w:tcPr>
+          <w:p>
+            <w:r>
+              <w:t>FR-09</w:t>
+            </w:r>
+          </w:p>
+        </w:tc>
+        <w:tc>
+          <w:tcPr>
+            <w:tcW w:type="dxa" w:w="2436"/>
+            <w:vAlign w:val="center"/>
+          </w:tcPr>
+          <w:p>
+            <w:r>
+              <w:t>Onboard / offboard an organization with PKI certificate</w:t>
+            </w:r>
+          </w:p>
+        </w:tc>
+        <w:tc>
+          <w:tcPr>
+            <w:tcW w:type="dxa" w:w="2436"/>
+            <w:vAlign w:val="center"/>
+          </w:tcPr>
+          <w:p>
+            <w:r>
+              <w:t>Admin</w:t>
+            </w:r>
+          </w:p>
+        </w:tc>
+        <w:tc>
+          <w:tcPr>
+            <w:tcW w:type="dxa" w:w="2436"/>
+            <w:vAlign w:val="center"/>
+          </w:tcPr>
+          <w:p>
+            <w:r>
+              <w:t>High</w:t>
+            </w:r>
+          </w:p>
+        </w:tc>
+      </w:tr>
+      <w:tr>
+        <w:tc>
+          <w:tcPr>
+            <w:tcW w:type="dxa" w:w="2436"/>
+            <w:vAlign w:val="center"/>
+            <w:shd w:val="clear" w:color="auto" w:fill="F7FAFD"/>
+          </w:tcPr>
+          <w:p>
+            <w:r>
+              <w:t>FR-10</w:t>
+            </w:r>
+          </w:p>
+        </w:tc>
+        <w:tc>
+          <w:tcPr>
+            <w:tcW w:type="dxa" w:w="2436"/>
+            <w:vAlign w:val="center"/>
+            <w:shd w:val="clear" w:color="auto" w:fill="F7FAFD"/>
+          </w:tcPr>
+          <w:p>
+            <w:r>
+              <w:t>Rotate or revoke signing keys</w:t>
+            </w:r>
+          </w:p>
+        </w:tc>
+        <w:tc>
+          <w:tcPr>
+            <w:tcW w:type="dxa" w:w="2436"/>
+            <w:vAlign w:val="center"/>
+            <w:shd w:val="clear" w:color="auto" w:fill="F7FAFD"/>
+          </w:tcPr>
+          <w:p>
+            <w:r>
+              <w:t>Admin</w:t>
+            </w:r>
+          </w:p>
+        </w:tc>
+        <w:tc>
+          <w:tcPr>
+            <w:tcW w:type="dxa" w:w="2436"/>
+            <w:vAlign w:val="center"/>
+            <w:shd w:val="clear" w:color="auto" w:fill="F7FAFD"/>
+          </w:tcPr>
+          <w:p>
+            <w:r>
+              <w:t>Medium</w:t>
+            </w:r>
+          </w:p>
+        </w:tc>
+      </w:tr>
+      <w:tr>
+        <w:tc>
+          <w:tcPr>
+            <w:tcW w:type="dxa" w:w="2436"/>
+            <w:vAlign w:val="center"/>
+          </w:tcPr>
+          <w:p>
+            <w:r>
+              <w:t>FR-11</w:t>
+            </w:r>
+          </w:p>
+        </w:tc>
+        <w:tc>
+          <w:tcPr>
+            <w:tcW w:type="dxa" w:w="2436"/>
+            <w:vAlign w:val="center"/>
+          </w:tcPr>
+          <w:p>
+            <w:r>
+              <w:t>Raise and resolve a dispute between organizations</w:t>
+            </w:r>
+          </w:p>
+        </w:tc>
+        <w:tc>
+          <w:tcPr>
+            <w:tcW w:type="dxa" w:w="2436"/>
+            <w:vAlign w:val="center"/>
+          </w:tcPr>
+          <w:p>
+            <w:r>
+              <w:t>Distributor / Retailer</w:t>
+            </w:r>
+          </w:p>
+        </w:tc>
+        <w:tc>
+          <w:tcPr>
+            <w:tcW w:type="dxa" w:w="2436"/>
+            <w:vAlign w:val="center"/>
+          </w:tcPr>
+          <w:p>
+            <w:r>
+              <w:t>Medium</w:t>
+            </w:r>
+          </w:p>
+        </w:tc>
+      </w:tr>
+      <w:tr>
+        <w:tc>
+          <w:tcPr>
+            <w:tcW w:type="dxa" w:w="2436"/>
+            <w:vAlign w:val="center"/>
+            <w:shd w:val="clear" w:color="auto" w:fill="F7FAFD"/>
+          </w:tcPr>
+          <w:p>
+            <w:r>
+              <w:t>FR-12</w:t>
+            </w:r>
+          </w:p>
+        </w:tc>
+        <w:tc>
+          <w:tcPr>
+            <w:tcW w:type="dxa" w:w="2436"/>
+            <w:vAlign w:val="center"/>
+            <w:shd w:val="clear" w:color="auto" w:fill="F7FAFD"/>
+          </w:tcPr>
+          <w:p>
+            <w:r>
+              <w:t>Trigger product recall (trace backward to source)</w:t>
+            </w:r>
+          </w:p>
+        </w:tc>
+        <w:tc>
+          <w:tcPr>
+            <w:tcW w:type="dxa" w:w="2436"/>
+            <w:vAlign w:val="center"/>
+            <w:shd w:val="clear" w:color="auto" w:fill="F7FAFD"/>
+          </w:tcPr>
+          <w:p>
+            <w:r>
+              <w:t>Manufacturer / Auditor</w:t>
+            </w:r>
+          </w:p>
+        </w:tc>
+        <w:tc>
+          <w:tcPr>
+            <w:tcW w:type="dxa" w:w="2436"/>
+            <w:vAlign w:val="center"/>
+            <w:shd w:val="clear" w:color="auto" w:fill="F7FAFD"/>
+          </w:tcPr>
+          <w:p>
+            <w:r>
+              <w:t>Medium</w:t>
+            </w:r>
+          </w:p>
+        </w:tc>
+      </w:tr>
+      <w:tr>
+        <w:tc>
+          <w:tcPr>
+            <w:tcW w:type="dxa" w:w="2436"/>
+            <w:vAlign w:val="center"/>
+          </w:tcPr>
+          <w:p>
+            <w:r>
+              <w:t>FR-13</w:t>
+            </w:r>
+          </w:p>
+        </w:tc>
+        <w:tc>
+          <w:tcPr>
+            <w:tcW w:type="dxa" w:w="2436"/>
+            <w:vAlign w:val="center"/>
+          </w:tcPr>
+          <w:p>
+            <w:r>
+              <w:t>Receive real-time shipment status notifications</w:t>
+            </w:r>
+          </w:p>
+        </w:tc>
+        <w:tc>
+          <w:tcPr>
+            <w:tcW w:type="dxa" w:w="2436"/>
+            <w:vAlign w:val="center"/>
+          </w:tcPr>
+          <w:p>
+            <w:r>
+              <w:t>All logistics actors</w:t>
+            </w:r>
+          </w:p>
+        </w:tc>
+        <w:tc>
+          <w:tcPr>
+            <w:tcW w:type="dxa" w:w="2436"/>
+            <w:vAlign w:val="center"/>
+          </w:tcPr>
+          <w:p>
+            <w:r>
+              <w:t>Medium</w:t>
+            </w:r>
+          </w:p>
+        </w:tc>
+      </w:tr>
+      <w:tr>
+        <w:tc>
+          <w:tcPr>
+            <w:tcW w:type="dxa" w:w="2436"/>
+            <w:vAlign w:val="center"/>
+            <w:shd w:val="clear" w:color="auto" w:fill="F7FAFD"/>
+          </w:tcPr>
+          <w:p>
+            <w:r>
+              <w:t>FR-14</w:t>
+            </w:r>
+          </w:p>
+        </w:tc>
+        <w:tc>
+          <w:tcPr>
+            <w:tcW w:type="dxa" w:w="2436"/>
+            <w:vAlign w:val="center"/>
+            <w:shd w:val="clear" w:color="auto" w:fill="F7FAFD"/>
+          </w:tcPr>
+          <w:p>
+            <w:r>
+              <w:t>Detect anomalous ownership transfers (rule/ML based)</w:t>
+            </w:r>
+          </w:p>
+        </w:tc>
+        <w:tc>
+          <w:tcPr>
+            <w:tcW w:type="dxa" w:w="2436"/>
+            <w:vAlign w:val="center"/>
+            <w:shd w:val="clear" w:color="auto" w:fill="F7FAFD"/>
+          </w:tcPr>
+          <w:p>
+            <w:r>
+              <w:t>Security Officer</w:t>
+            </w:r>
+          </w:p>
+        </w:tc>
+        <w:tc>
+          <w:tcPr>
+            <w:tcW w:type="dxa" w:w="2436"/>
+            <w:vAlign w:val="center"/>
+            <w:shd w:val="clear" w:color="auto" w:fill="F7FAFD"/>
+          </w:tcPr>
+          <w:p>
+            <w:r>
+              <w:t>Medium</w:t>
+            </w:r>
+          </w:p>
+        </w:tc>
+      </w:tr>
+    </w:tbl>
+    <w:p>
+      <w:pPr>
+        <w:pStyle w:val="Heading2"/>
+        <w:spacing w:before="240" w:after="120"/>
+      </w:pPr>
+      <w:r>
+        <w:rPr>
+          <w:rFonts w:ascii="Calibri" w:hAnsi="Calibri"/>
+          <w:b/>
+          <w:color w:val="2E74B5"/>
+          <w:sz w:val="30"/>
+        </w:rPr>
+        <w:t>2.3 Non-Functional Requirements (NFR)</w:t>
+      </w:r>
+    </w:p>
+    <w:tbl>
+      <w:tblPr>
+        <w:tblStyle w:val="TableGrid"/>
+        <w:tblW w:type="auto" w:w="0"/>
+        <w:jc w:val="center"/>
+        <w:tblLayout w:type="autofit"/>
+        <w:tblLook w:firstColumn="1" w:firstRow="1" w:lastColumn="0" w:lastRow="0" w:noHBand="0" w:noVBand="1" w:val="04A0"/>
+      </w:tblPr>
+      <w:tblGrid>
+        <w:gridCol w:w="2436"/>
+        <w:gridCol w:w="2436"/>
+        <w:gridCol w:w="2436"/>
+        <w:gridCol w:w="2436"/>
+      </w:tblGrid>
+      <w:tr>
+        <w:tc>
+          <w:tcPr>
+            <w:tcW w:type="dxa" w:w="2436"/>
+            <w:vAlign w:val="center"/>
+            <w:shd w:val="clear" w:color="auto" w:fill="1F3A5F"/>
+          </w:tcPr>
+          <w:p>
+            <w:r>
+              <w:rPr>
+                <w:b/>
+                <w:color w:val="FFFFFF"/>
+                <w:sz w:val="21"/>
+              </w:rPr>
+              <w:t>ID</w:t>
+            </w:r>
+          </w:p>
+        </w:tc>
+        <w:tc>
+          <w:tcPr>
+            <w:tcW w:type="dxa" w:w="2436"/>
+            <w:vAlign w:val="center"/>
+            <w:shd w:val="clear" w:color="auto" w:fill="1F3A5F"/>
+          </w:tcPr>
+          <w:p>
+            <w:r>
+              <w:rPr>
+                <w:b/>
+                <w:color w:val="FFFFFF"/>
+                <w:sz w:val="21"/>
+              </w:rPr>
+              <w:t>Category</w:t>
+            </w:r>
+          </w:p>
+        </w:tc>
+        <w:tc>
+          <w:tcPr>
+            <w:tcW w:type="dxa" w:w="2436"/>
+            <w:vAlign w:val="center"/>
+            <w:shd w:val="clear" w:color="auto" w:fill="1F3A5F"/>
+          </w:tcPr>
+          <w:p>
+            <w:r>
+              <w:rPr>
+                <w:b/>
+                <w:color w:val="FFFFFF"/>
+                <w:sz w:val="21"/>
+              </w:rPr>
+              <w:t>Requirement</w:t>
+            </w:r>
+          </w:p>
+        </w:tc>
+        <w:tc>
+          <w:tcPr>
+            <w:tcW w:type="dxa" w:w="2436"/>
+            <w:vAlign w:val="center"/>
+            <w:shd w:val="clear" w:color="auto" w:fill="1F3A5F"/>
+          </w:tcPr>
+          <w:p>
+            <w:r>
+              <w:rPr>
+                <w:b/>
+                <w:color w:val="FFFFFF"/>
+                <w:sz w:val="21"/>
+              </w:rPr>
+              <w:t>Target</w:t>
+            </w:r>
+          </w:p>
+        </w:tc>
+      </w:tr>
+      <w:tr>
+        <w:tc>
+          <w:tcPr>
+            <w:tcW w:type="dxa" w:w="2436"/>
+            <w:vAlign w:val="center"/>
+          </w:tcPr>
+          <w:p>
+            <w:r>
+              <w:t>NFR-01</w:t>
+            </w:r>
+          </w:p>
+        </w:tc>
+        <w:tc>
+          <w:tcPr>
+            <w:tcW w:type="dxa" w:w="2436"/>
+            <w:vAlign w:val="center"/>
+          </w:tcPr>
+          <w:p>
+            <w:r>
+              <w:t>Availability</w:t>
+            </w:r>
+          </w:p>
+        </w:tc>
+        <w:tc>
+          <w:tcPr>
+            <w:tcW w:type="dxa" w:w="2436"/>
+            <w:vAlign w:val="center"/>
+          </w:tcPr>
+          <w:p>
+            <w:r>
+              <w:t>System uptime</w:t>
+            </w:r>
+          </w:p>
+        </w:tc>
+        <w:tc>
+          <w:tcPr>
+            <w:tcW w:type="dxa" w:w="2436"/>
+            <w:vAlign w:val="center"/>
+          </w:tcPr>
+          <w:p>
+            <w:r>
+              <w:t>99.9% (monthly)</w:t>
+            </w:r>
+          </w:p>
+        </w:tc>
+      </w:tr>
+      <w:tr>
+        <w:tc>
+          <w:tcPr>
+            <w:tcW w:type="dxa" w:w="2436"/>
+            <w:vAlign w:val="center"/>
+            <w:shd w:val="clear" w:color="auto" w:fill="F7FAFD"/>
+          </w:tcPr>
+          <w:p>
+            <w:r>
+              <w:t>NFR-02</w:t>
+            </w:r>
+          </w:p>
+        </w:tc>
+        <w:tc>
+          <w:tcPr>
+            <w:tcW w:type="dxa" w:w="2436"/>
+            <w:vAlign w:val="center"/>
+            <w:shd w:val="clear" w:color="auto" w:fill="F7FAFD"/>
+          </w:tcPr>
+          <w:p>
+            <w:r>
+              <w:t>Performance</w:t>
+            </w:r>
+          </w:p>
+        </w:tc>
+        <w:tc>
+          <w:tcPr>
+            <w:tcW w:type="dxa" w:w="2436"/>
+            <w:vAlign w:val="center"/>
+            <w:shd w:val="clear" w:color="auto" w:fill="F7FAFD"/>
+          </w:tcPr>
+          <w:p>
+            <w:r>
+              <w:t>Product history lookup latency</w:t>
+            </w:r>
+          </w:p>
+        </w:tc>
+        <w:tc>
+          <w:tcPr>
+            <w:tcW w:type="dxa" w:w="2436"/>
+            <w:vAlign w:val="center"/>
+            <w:shd w:val="clear" w:color="auto" w:fill="F7FAFD"/>
+          </w:tcPr>
+          <w:p>
+            <w:r>
+              <w:t>p95 &lt; 1s</w:t>
+            </w:r>
+          </w:p>
+        </w:tc>
+      </w:tr>
+      <w:tr>
+        <w:tc>
+          <w:tcPr>
+            <w:tcW w:type="dxa" w:w="2436"/>
+            <w:vAlign w:val="center"/>
+          </w:tcPr>
+          <w:p>
+            <w:r>
+              <w:t>NFR-03</w:t>
+            </w:r>
+          </w:p>
+        </w:tc>
+        <w:tc>
+          <w:tcPr>
+            <w:tcW w:type="dxa" w:w="2436"/>
+            <w:vAlign w:val="center"/>
+          </w:tcPr>
+          <w:p>
+            <w:r>
+              <w:t>Scalability</w:t>
+            </w:r>
+          </w:p>
+        </w:tc>
+        <w:tc>
+          <w:tcPr>
+            <w:tcW w:type="dxa" w:w="2436"/>
+            <w:vAlign w:val="center"/>
+          </w:tcPr>
+          <w:p>
+            <w:r>
+              <w:t>Concurrent shipments per day</w:t>
+            </w:r>
+          </w:p>
+        </w:tc>
+        <w:tc>
+          <w:tcPr>
+            <w:tcW w:type="dxa" w:w="2436"/>
+            <w:vAlign w:val="center"/>
+          </w:tcPr>
+          <w:p>
+            <w:r>
+              <w:t>10,000+</w:t>
+            </w:r>
+          </w:p>
+        </w:tc>
+      </w:tr>
+      <w:tr>
+        <w:tc>
+          <w:tcPr>
+            <w:tcW w:type="dxa" w:w="2436"/>
+            <w:vAlign w:val="center"/>
+            <w:shd w:val="clear" w:color="auto" w:fill="F7FAFD"/>
+          </w:tcPr>
+          <w:p>
+            <w:r>
+              <w:t>NFR-04</w:t>
+            </w:r>
+          </w:p>
+        </w:tc>
+        <w:tc>
+          <w:tcPr>
+            <w:tcW w:type="dxa" w:w="2436"/>
+            <w:vAlign w:val="center"/>
+            <w:shd w:val="clear" w:color="auto" w:fill="F7FAFD"/>
+          </w:tcPr>
+          <w:p>
+            <w:r>
+              <w:t>Scalability</w:t>
+            </w:r>
+          </w:p>
+        </w:tc>
+        <w:tc>
+          <w:tcPr>
+            <w:tcW w:type="dxa" w:w="2436"/>
+            <w:vAlign w:val="center"/>
+            <w:shd w:val="clear" w:color="auto" w:fill="F7FAFD"/>
+          </w:tcPr>
+          <w:p>
+            <w:r>
+              <w:t>Organizations onboarded</w:t>
+            </w:r>
+          </w:p>
+        </w:tc>
+        <w:tc>
+          <w:tcPr>
+            <w:tcW w:type="dxa" w:w="2436"/>
+            <w:vAlign w:val="center"/>
+            <w:shd w:val="clear" w:color="auto" w:fill="F7FAFD"/>
+          </w:tcPr>
+          <w:p>
+            <w:r>
+              <w:t>100+</w:t>
+            </w:r>
+          </w:p>
+        </w:tc>
+      </w:tr>
+      <w:tr>
+        <w:tc>
+          <w:tcPr>
+            <w:tcW w:type="dxa" w:w="2436"/>
+            <w:vAlign w:val="center"/>
+          </w:tcPr>
+          <w:p>
+            <w:r>
+              <w:t>NFR-05</w:t>
+            </w:r>
+          </w:p>
+        </w:tc>
+        <w:tc>
+          <w:tcPr>
+            <w:tcW w:type="dxa" w:w="2436"/>
+            <w:vAlign w:val="center"/>
+          </w:tcPr>
+          <w:p>
+            <w:r>
+              <w:t>Interoperability</w:t>
+            </w:r>
+          </w:p>
+        </w:tc>
+        <w:tc>
+          <w:tcPr>
+            <w:tcW w:type="dxa" w:w="2436"/>
+            <w:vAlign w:val="center"/>
+          </w:tcPr>
+          <w:p>
+            <w:r>
+              <w:t>Standards compliance</w:t>
+            </w:r>
+          </w:p>
+        </w:tc>
+        <w:tc>
+          <w:tcPr>
+            <w:tcW w:type="dxa" w:w="2436"/>
+            <w:vAlign w:val="center"/>
+          </w:tcPr>
+          <w:p>
+            <w:r>
+              <w:t>GS1 EPCIS 2.0, FDA DSCSA</w:t>
+            </w:r>
+          </w:p>
+        </w:tc>
+      </w:tr>
+      <w:tr>
+        <w:tc>
+          <w:tcPr>
+            <w:tcW w:type="dxa" w:w="2436"/>
+            <w:vAlign w:val="center"/>
+            <w:shd w:val="clear" w:color="auto" w:fill="F7FAFD"/>
+          </w:tcPr>
+          <w:p>
+            <w:r>
+              <w:t>NFR-06</w:t>
+            </w:r>
+          </w:p>
+        </w:tc>
+        <w:tc>
+          <w:tcPr>
+            <w:tcW w:type="dxa" w:w="2436"/>
+            <w:vAlign w:val="center"/>
+            <w:shd w:val="clear" w:color="auto" w:fill="F7FAFD"/>
+          </w:tcPr>
+          <w:p>
+            <w:r>
+              <w:t>Privacy</w:t>
+            </w:r>
+          </w:p>
+        </w:tc>
+        <w:tc>
+          <w:tcPr>
+            <w:tcW w:type="dxa" w:w="2436"/>
+            <w:vAlign w:val="center"/>
+            <w:shd w:val="clear" w:color="auto" w:fill="F7FAFD"/>
+          </w:tcPr>
+          <w:p>
+            <w:r>
+              <w:t>Customer PII handling</w:t>
+            </w:r>
+          </w:p>
+        </w:tc>
+        <w:tc>
+          <w:tcPr>
+            <w:tcW w:type="dxa" w:w="2436"/>
+            <w:vAlign w:val="center"/>
+            <w:shd w:val="clear" w:color="auto" w:fill="F7FAFD"/>
+          </w:tcPr>
+          <w:p>
+            <w:r>
+              <w:t>GDPR + HIPAA-aligned</w:t>
+            </w:r>
+          </w:p>
+        </w:tc>
+      </w:tr>
+      <w:tr>
+        <w:tc>
+          <w:tcPr>
+            <w:tcW w:type="dxa" w:w="2436"/>
+            <w:vAlign w:val="center"/>
+          </w:tcPr>
+          <w:p>
+            <w:r>
+              <w:t>NFR-07</w:t>
+            </w:r>
+          </w:p>
+        </w:tc>
+        <w:tc>
+          <w:tcPr>
+            <w:tcW w:type="dxa" w:w="2436"/>
+            <w:vAlign w:val="center"/>
+          </w:tcPr>
+          <w:p>
+            <w:r>
+              <w:t>Maintainability</w:t>
+            </w:r>
+          </w:p>
+        </w:tc>
+        <w:tc>
+          <w:tcPr>
+            <w:tcW w:type="dxa" w:w="2436"/>
+            <w:vAlign w:val="center"/>
+          </w:tcPr>
+          <w:p>
+            <w:r>
+              <w:t>Test coverage on critical modules</w:t>
+            </w:r>
+          </w:p>
+        </w:tc>
+        <w:tc>
+          <w:tcPr>
+            <w:tcW w:type="dxa" w:w="2436"/>
+            <w:vAlign w:val="center"/>
+          </w:tcPr>
+          <w:p>
+            <w:r>
+              <w:t>&gt;= 80%</w:t>
+            </w:r>
+          </w:p>
+        </w:tc>
+      </w:tr>
+      <w:tr>
+        <w:tc>
+          <w:tcPr>
+            <w:tcW w:type="dxa" w:w="2436"/>
+            <w:vAlign w:val="center"/>
+            <w:shd w:val="clear" w:color="auto" w:fill="F7FAFD"/>
+          </w:tcPr>
+          <w:p>
+            <w:r>
+              <w:t>NFR-08</w:t>
+            </w:r>
+          </w:p>
+        </w:tc>
+        <w:tc>
+          <w:tcPr>
+            <w:tcW w:type="dxa" w:w="2436"/>
+            <w:vAlign w:val="center"/>
+            <w:shd w:val="clear" w:color="auto" w:fill="F7FAFD"/>
+          </w:tcPr>
+          <w:p>
+            <w:r>
+              <w:t>Disaster Recovery</w:t>
+            </w:r>
+          </w:p>
+        </w:tc>
+        <w:tc>
+          <w:tcPr>
+            <w:tcW w:type="dxa" w:w="2436"/>
+            <w:vAlign w:val="center"/>
+            <w:shd w:val="clear" w:color="auto" w:fill="F7FAFD"/>
+          </w:tcPr>
+          <w:p>
+            <w:r>
+              <w:t>RPO / RTO</w:t>
+            </w:r>
+          </w:p>
+        </w:tc>
+        <w:tc>
+          <w:tcPr>
+            <w:tcW w:type="dxa" w:w="2436"/>
+            <w:vAlign w:val="center"/>
+            <w:shd w:val="clear" w:color="auto" w:fill="F7FAFD"/>
+          </w:tcPr>
+          <w:p>
+            <w:r>
+              <w:t>RPO &lt;= 5 min, RTO &lt;= 1 hour</w:t>
+            </w:r>
+          </w:p>
+        </w:tc>
+      </w:tr>
+      <w:tr>
+        <w:tc>
+          <w:tcPr>
+            <w:tcW w:type="dxa" w:w="2436"/>
+            <w:vAlign w:val="center"/>
+          </w:tcPr>
+          <w:p>
+            <w:r>
+              <w:t>NFR-09</w:t>
+            </w:r>
+          </w:p>
+        </w:tc>
+        <w:tc>
+          <w:tcPr>
+            <w:tcW w:type="dxa" w:w="2436"/>
+            <w:vAlign w:val="center"/>
+          </w:tcPr>
+          <w:p>
+            <w:r>
+              <w:t>Auditability</w:t>
+            </w:r>
+          </w:p>
+        </w:tc>
+        <w:tc>
+          <w:tcPr>
+            <w:tcW w:type="dxa" w:w="2436"/>
+            <w:vAlign w:val="center"/>
+          </w:tcPr>
+          <w:p>
+            <w:r>
+              <w:t>Log retention</w:t>
+            </w:r>
+          </w:p>
+        </w:tc>
+        <w:tc>
+          <w:tcPr>
+            <w:tcW w:type="dxa" w:w="2436"/>
+            <w:vAlign w:val="center"/>
+          </w:tcPr>
+          <w:p>
+            <w:r>
+              <w:t>7 years (pharma regulation)</w:t>
+            </w:r>
+          </w:p>
+        </w:tc>
+      </w:tr>
+      <w:tr>
+        <w:tc>
+          <w:tcPr>
+            <w:tcW w:type="dxa" w:w="2436"/>
+            <w:vAlign w:val="center"/>
+            <w:shd w:val="clear" w:color="auto" w:fill="F7FAFD"/>
+          </w:tcPr>
+          <w:p>
+            <w:r>
+              <w:t>NFR-10</w:t>
+            </w:r>
+          </w:p>
+        </w:tc>
+        <w:tc>
+          <w:tcPr>
+            <w:tcW w:type="dxa" w:w="2436"/>
+            <w:vAlign w:val="center"/>
+            <w:shd w:val="clear" w:color="auto" w:fill="F7FAFD"/>
+          </w:tcPr>
+          <w:p>
+            <w:r>
+              <w:t>Usability</w:t>
+            </w:r>
+          </w:p>
+        </w:tc>
+        <w:tc>
+          <w:tcPr>
+            <w:tcW w:type="dxa" w:w="2436"/>
+            <w:vAlign w:val="center"/>
+            <w:shd w:val="clear" w:color="auto" w:fill="F7FAFD"/>
+          </w:tcPr>
+          <w:p>
+            <w:r>
+              <w:t>Common operation time</w:t>
+            </w:r>
+          </w:p>
+        </w:tc>
+        <w:tc>
+          <w:tcPr>
+            <w:tcW w:type="dxa" w:w="2436"/>
+            <w:vAlign w:val="center"/>
+            <w:shd w:val="clear" w:color="auto" w:fill="F7FAFD"/>
+          </w:tcPr>
+          <w:p>
+            <w:r>
+              <w:t>&lt;= 3 clicks for status check</w:t>
+            </w:r>
+          </w:p>
+        </w:tc>
+      </w:tr>
+    </w:tbl>
+    <w:p>
+      <w:pPr>
+        <w:pStyle w:val="Heading2"/>
+        <w:spacing w:before="240" w:after="120"/>
+      </w:pPr>
+      <w:r>
+        <w:rPr>
+          <w:rFonts w:ascii="Calibri" w:hAnsi="Calibri"/>
+          <w:b/>
+          <w:color w:val="2E74B5"/>
+          <w:sz w:val="30"/>
+        </w:rPr>
+        <w:t>2.4 Security Requirements (SR)</w:t>
+      </w:r>
+    </w:p>
+    <w:tbl>
+      <w:tblPr>
+        <w:tblStyle w:val="TableGrid"/>
+        <w:tblW w:type="auto" w:w="0"/>
+        <w:jc w:val="center"/>
+        <w:tblLayout w:type="autofit"/>
+        <w:tblLook w:firstColumn="1" w:firstRow="1" w:lastColumn="0" w:lastRow="0" w:noHBand="0" w:noVBand="1" w:val="04A0"/>
+      </w:tblPr>
+      <w:tblGrid>
+        <w:gridCol w:w="2436"/>
+        <w:gridCol w:w="2436"/>
+        <w:gridCol w:w="2436"/>
+        <w:gridCol w:w="2436"/>
+      </w:tblGrid>
+      <w:tr>
+        <w:tc>
+          <w:tcPr>
+            <w:tcW w:type="dxa" w:w="2436"/>
+            <w:vAlign w:val="center"/>
+            <w:shd w:val="clear" w:color="auto" w:fill="1F3A5F"/>
+          </w:tcPr>
+          <w:p>
+            <w:r>
+              <w:rPr>
+                <w:b/>
+                <w:color w:val="FFFFFF"/>
+                <w:sz w:val="21"/>
+              </w:rPr>
+              <w:t>ID</w:t>
+            </w:r>
+          </w:p>
+        </w:tc>
+        <w:tc>
+          <w:tcPr>
+            <w:tcW w:type="dxa" w:w="2436"/>
+            <w:vAlign w:val="center"/>
+            <w:shd w:val="clear" w:color="auto" w:fill="1F3A5F"/>
+          </w:tcPr>
+          <w:p>
+            <w:r>
+              <w:rPr>
+                <w:b/>
+                <w:color w:val="FFFFFF"/>
+                <w:sz w:val="21"/>
+              </w:rPr>
+              <w:t>Category</w:t>
+            </w:r>
+          </w:p>
+        </w:tc>
+        <w:tc>
+          <w:tcPr>
+            <w:tcW w:type="dxa" w:w="2436"/>
+            <w:vAlign w:val="center"/>
+            <w:shd w:val="clear" w:color="auto" w:fill="1F3A5F"/>
+          </w:tcPr>
+          <w:p>
+            <w:r>
+              <w:rPr>
+                <w:b/>
+                <w:color w:val="FFFFFF"/>
+                <w:sz w:val="21"/>
+              </w:rPr>
+              <w:t>Requirement</w:t>
+            </w:r>
+          </w:p>
+        </w:tc>
+        <w:tc>
+          <w:tcPr>
+            <w:tcW w:type="dxa" w:w="2436"/>
+            <w:vAlign w:val="center"/>
+            <w:shd w:val="clear" w:color="auto" w:fill="1F3A5F"/>
+          </w:tcPr>
+          <w:p>
+            <w:r>
+              <w:rPr>
+                <w:b/>
+                <w:color w:val="FFFFFF"/>
+                <w:sz w:val="21"/>
+              </w:rPr>
+              <w:t>CIA/Auth</w:t>
+            </w:r>
+          </w:p>
+        </w:tc>
+      </w:tr>
+      <w:tr>
+        <w:tc>
+          <w:tcPr>
+            <w:tcW w:type="dxa" w:w="2436"/>
+            <w:vAlign w:val="center"/>
+          </w:tcPr>
+          <w:p>
+            <w:r>
+              <w:t>SR-01</w:t>
+            </w:r>
+          </w:p>
+        </w:tc>
+        <w:tc>
+          <w:tcPr>
+            <w:tcW w:type="dxa" w:w="2436"/>
+            <w:vAlign w:val="center"/>
+          </w:tcPr>
+          <w:p>
+            <w:r>
+              <w:t>Authentication</w:t>
+            </w:r>
+          </w:p>
+        </w:tc>
+        <w:tc>
+          <w:tcPr>
+            <w:tcW w:type="dxa" w:w="2436"/>
+            <w:vAlign w:val="center"/>
+          </w:tcPr>
+          <w:p>
+            <w:r>
+              <w:t>Multi-factor authentication per user</w:t>
+            </w:r>
+          </w:p>
+        </w:tc>
+        <w:tc>
+          <w:tcPr>
+            <w:tcW w:type="dxa" w:w="2436"/>
+            <w:vAlign w:val="center"/>
+          </w:tcPr>
+          <w:p>
+            <w:r>
+              <w:t>Auth</w:t>
+            </w:r>
+          </w:p>
+        </w:tc>
+      </w:tr>
+      <w:tr>
+        <w:tc>
+          <w:tcPr>
+            <w:tcW w:type="dxa" w:w="2436"/>
+            <w:vAlign w:val="center"/>
+            <w:shd w:val="clear" w:color="auto" w:fill="F7FAFD"/>
+          </w:tcPr>
+          <w:p>
+            <w:r>
+              <w:t>SR-02</w:t>
+            </w:r>
+          </w:p>
+        </w:tc>
+        <w:tc>
+          <w:tcPr>
+            <w:tcW w:type="dxa" w:w="2436"/>
+            <w:vAlign w:val="center"/>
+            <w:shd w:val="clear" w:color="auto" w:fill="F7FAFD"/>
+          </w:tcPr>
+          <w:p>
+            <w:r>
+              <w:t>Authentication</w:t>
+            </w:r>
+          </w:p>
+        </w:tc>
+        <w:tc>
+          <w:tcPr>
+            <w:tcW w:type="dxa" w:w="2436"/>
+            <w:vAlign w:val="center"/>
+            <w:shd w:val="clear" w:color="auto" w:fill="F7FAFD"/>
+          </w:tcPr>
+          <w:p>
+            <w:r>
+              <w:t>mTLS between organizations (PKI)</w:t>
+            </w:r>
+          </w:p>
+        </w:tc>
+        <w:tc>
+          <w:tcPr>
+            <w:tcW w:type="dxa" w:w="2436"/>
+            <w:vAlign w:val="center"/>
+            <w:shd w:val="clear" w:color="auto" w:fill="F7FAFD"/>
+          </w:tcPr>
+          <w:p>
+            <w:r>
+              <w:t>Auth</w:t>
+            </w:r>
+          </w:p>
+        </w:tc>
+      </w:tr>
+      <w:tr>
+        <w:tc>
+          <w:tcPr>
+            <w:tcW w:type="dxa" w:w="2436"/>
+            <w:vAlign w:val="center"/>
+          </w:tcPr>
+          <w:p>
+            <w:r>
+              <w:t>SR-03</w:t>
+            </w:r>
+          </w:p>
+        </w:tc>
+        <w:tc>
+          <w:tcPr>
+            <w:tcW w:type="dxa" w:w="2436"/>
+            <w:vAlign w:val="center"/>
+          </w:tcPr>
+          <w:p>
+            <w:r>
+              <w:t>Integrity</w:t>
+            </w:r>
+          </w:p>
+        </w:tc>
+        <w:tc>
+          <w:tcPr>
+            <w:tcW w:type="dxa" w:w="2436"/>
+            <w:vAlign w:val="center"/>
+          </w:tcPr>
+          <w:p>
+            <w:r>
+              <w:t>Every ownership transfer must be digitally signed, hash-chained, and audit-logged</w:t>
+            </w:r>
+          </w:p>
+        </w:tc>
+        <w:tc>
+          <w:tcPr>
+            <w:tcW w:type="dxa" w:w="2436"/>
+            <w:vAlign w:val="center"/>
+          </w:tcPr>
+          <w:p>
+            <w:r>
+              <w:t>I, NR</w:t>
+            </w:r>
+          </w:p>
+        </w:tc>
+      </w:tr>
+      <w:tr>
+        <w:tc>
+          <w:tcPr>
+            <w:tcW w:type="dxa" w:w="2436"/>
+            <w:vAlign w:val="center"/>
+            <w:shd w:val="clear" w:color="auto" w:fill="F7FAFD"/>
+          </w:tcPr>
+          <w:p>
+            <w:r>
+              <w:t>SR-04</w:t>
+            </w:r>
+          </w:p>
+        </w:tc>
+        <w:tc>
+          <w:tcPr>
+            <w:tcW w:type="dxa" w:w="2436"/>
+            <w:vAlign w:val="center"/>
+            <w:shd w:val="clear" w:color="auto" w:fill="F7FAFD"/>
+          </w:tcPr>
+          <w:p>
+            <w:r>
+              <w:t>Integrity</w:t>
+            </w:r>
+          </w:p>
+        </w:tc>
+        <w:tc>
+          <w:tcPr>
+            <w:tcW w:type="dxa" w:w="2436"/>
+            <w:vAlign w:val="center"/>
+            <w:shd w:val="clear" w:color="auto" w:fill="F7FAFD"/>
+          </w:tcPr>
+          <w:p>
+            <w:r>
+              <w:t>Product records SHA-256 hashed on every change</w:t>
+            </w:r>
+          </w:p>
+        </w:tc>
+        <w:tc>
+          <w:tcPr>
+            <w:tcW w:type="dxa" w:w="2436"/>
+            <w:vAlign w:val="center"/>
+            <w:shd w:val="clear" w:color="auto" w:fill="F7FAFD"/>
+          </w:tcPr>
+          <w:p>
+            <w:r>
+              <w:t>I</w:t>
+            </w:r>
+          </w:p>
+        </w:tc>
+      </w:tr>
+      <w:tr>
+        <w:tc>
+          <w:tcPr>
+            <w:tcW w:type="dxa" w:w="2436"/>
+            <w:vAlign w:val="center"/>
+          </w:tcPr>
+          <w:p>
+            <w:r>
+              <w:t>SR-05</w:t>
+            </w:r>
+          </w:p>
+        </w:tc>
+        <w:tc>
+          <w:tcPr>
+            <w:tcW w:type="dxa" w:w="2436"/>
+            <w:vAlign w:val="center"/>
+          </w:tcPr>
+          <w:p>
+            <w:r>
+              <w:t>Integrity</w:t>
+            </w:r>
+          </w:p>
+        </w:tc>
+        <w:tc>
+          <w:tcPr>
+            <w:tcW w:type="dxa" w:w="2436"/>
+            <w:vAlign w:val="center"/>
+          </w:tcPr>
+          <w:p>
+            <w:r>
+              <w:t>Anti-replay via nonce + timestamp on every signed write</w:t>
+            </w:r>
+          </w:p>
+        </w:tc>
+        <w:tc>
+          <w:tcPr>
+            <w:tcW w:type="dxa" w:w="2436"/>
+            <w:vAlign w:val="center"/>
+          </w:tcPr>
+          <w:p>
+            <w:r>
+              <w:t>I</w:t>
+            </w:r>
+          </w:p>
+        </w:tc>
+      </w:tr>
+      <w:tr>
+        <w:tc>
+          <w:tcPr>
+            <w:tcW w:type="dxa" w:w="2436"/>
+            <w:vAlign w:val="center"/>
+            <w:shd w:val="clear" w:color="auto" w:fill="F7FAFD"/>
+          </w:tcPr>
+          <w:p>
+            <w:r>
+              <w:t>SR-06</w:t>
+            </w:r>
+          </w:p>
+        </w:tc>
+        <w:tc>
+          <w:tcPr>
+            <w:tcW w:type="dxa" w:w="2436"/>
+            <w:vAlign w:val="center"/>
+            <w:shd w:val="clear" w:color="auto" w:fill="F7FAFD"/>
+          </w:tcPr>
+          <w:p>
+            <w:r>
+              <w:t>Authorization</w:t>
+            </w:r>
+          </w:p>
+        </w:tc>
+        <w:tc>
+          <w:tcPr>
+            <w:tcW w:type="dxa" w:w="2436"/>
+            <w:vAlign w:val="center"/>
+            <w:shd w:val="clear" w:color="auto" w:fill="F7FAFD"/>
+          </w:tcPr>
+          <w:p>
+            <w:r>
+              <w:t>Role-Based Access Control (RBAC) per role</w:t>
+            </w:r>
+          </w:p>
+        </w:tc>
+        <w:tc>
+          <w:tcPr>
+            <w:tcW w:type="dxa" w:w="2436"/>
+            <w:vAlign w:val="center"/>
+            <w:shd w:val="clear" w:color="auto" w:fill="F7FAFD"/>
+          </w:tcPr>
+          <w:p>
+            <w:r>
+              <w:t>Authz</w:t>
+            </w:r>
+          </w:p>
+        </w:tc>
+      </w:tr>
+      <w:tr>
+        <w:tc>
+          <w:tcPr>
+            <w:tcW w:type="dxa" w:w="2436"/>
+            <w:vAlign w:val="center"/>
+          </w:tcPr>
+          <w:p>
+            <w:r>
+              <w:t>SR-07</w:t>
+            </w:r>
+          </w:p>
+        </w:tc>
+        <w:tc>
+          <w:tcPr>
+            <w:tcW w:type="dxa" w:w="2436"/>
+            <w:vAlign w:val="center"/>
+          </w:tcPr>
+          <w:p>
+            <w:r>
+              <w:t>Authorization</w:t>
+            </w:r>
+          </w:p>
+        </w:tc>
+        <w:tc>
+          <w:tcPr>
+            <w:tcW w:type="dxa" w:w="2436"/>
+            <w:vAlign w:val="center"/>
+          </w:tcPr>
+          <w:p>
+            <w:r>
+              <w:t>Attribute-Based Access Control (ABAC) per organization</w:t>
+            </w:r>
+          </w:p>
+        </w:tc>
+        <w:tc>
+          <w:tcPr>
+            <w:tcW w:type="dxa" w:w="2436"/>
+            <w:vAlign w:val="center"/>
+          </w:tcPr>
+          <w:p>
+            <w:r>
+              <w:t>Authz</w:t>
+            </w:r>
+          </w:p>
+        </w:tc>
+      </w:tr>
+      <w:tr>
+        <w:tc>
+          <w:tcPr>
+            <w:tcW w:type="dxa" w:w="2436"/>
+            <w:vAlign w:val="center"/>
+            <w:shd w:val="clear" w:color="auto" w:fill="F7FAFD"/>
+          </w:tcPr>
+          <w:p>
+            <w:r>
+              <w:t>SR-08</w:t>
+            </w:r>
+          </w:p>
+        </w:tc>
+        <w:tc>
+          <w:tcPr>
+            <w:tcW w:type="dxa" w:w="2436"/>
+            <w:vAlign w:val="center"/>
+            <w:shd w:val="clear" w:color="auto" w:fill="F7FAFD"/>
+          </w:tcPr>
+          <w:p>
+            <w:r>
+              <w:t>Confidentiality</w:t>
+            </w:r>
+          </w:p>
+        </w:tc>
+        <w:tc>
+          <w:tcPr>
+            <w:tcW w:type="dxa" w:w="2436"/>
+            <w:vAlign w:val="center"/>
+            <w:shd w:val="clear" w:color="auto" w:fill="F7FAFD"/>
+          </w:tcPr>
+          <w:p>
+            <w:r>
+              <w:t>TLS 1.3 in transit, AES-256 at rest</w:t>
+            </w:r>
+          </w:p>
+        </w:tc>
+        <w:tc>
+          <w:tcPr>
+            <w:tcW w:type="dxa" w:w="2436"/>
+            <w:vAlign w:val="center"/>
+            <w:shd w:val="clear" w:color="auto" w:fill="F7FAFD"/>
+          </w:tcPr>
+          <w:p>
+            <w:r>
+              <w:t>C</w:t>
+            </w:r>
+          </w:p>
+        </w:tc>
+      </w:tr>
+      <w:tr>
+        <w:tc>
+          <w:tcPr>
+            <w:tcW w:type="dxa" w:w="2436"/>
+            <w:vAlign w:val="center"/>
+          </w:tcPr>
+          <w:p>
+            <w:r>
+              <w:t>SR-09</w:t>
+            </w:r>
+          </w:p>
+        </w:tc>
+        <w:tc>
+          <w:tcPr>
+            <w:tcW w:type="dxa" w:w="2436"/>
+            <w:vAlign w:val="center"/>
+          </w:tcPr>
+          <w:p>
+            <w:r>
+              <w:t>Confidentiality</w:t>
+            </w:r>
+          </w:p>
+        </w:tc>
+        <w:tc>
+          <w:tcPr>
+            <w:tcW w:type="dxa" w:w="2436"/>
+            <w:vAlign w:val="center"/>
+          </w:tcPr>
+          <w:p>
+            <w:r>
+              <w:t>Field-level encryption for customer PII</w:t>
+            </w:r>
+          </w:p>
+        </w:tc>
+        <w:tc>
+          <w:tcPr>
+            <w:tcW w:type="dxa" w:w="2436"/>
+            <w:vAlign w:val="center"/>
+          </w:tcPr>
+          <w:p>
+            <w:r>
+              <w:t>C</w:t>
+            </w:r>
+          </w:p>
+        </w:tc>
+      </w:tr>
+      <w:tr>
+        <w:tc>
+          <w:tcPr>
+            <w:tcW w:type="dxa" w:w="2436"/>
+            <w:vAlign w:val="center"/>
+            <w:shd w:val="clear" w:color="auto" w:fill="F7FAFD"/>
+          </w:tcPr>
+          <w:p>
+            <w:r>
+              <w:t>SR-10</w:t>
+            </w:r>
+          </w:p>
+        </w:tc>
+        <w:tc>
+          <w:tcPr>
+            <w:tcW w:type="dxa" w:w="2436"/>
+            <w:vAlign w:val="center"/>
+            <w:shd w:val="clear" w:color="auto" w:fill="F7FAFD"/>
+          </w:tcPr>
+          <w:p>
+            <w:r>
+              <w:t>Audit</w:t>
+            </w:r>
+          </w:p>
+        </w:tc>
+        <w:tc>
+          <w:tcPr>
+            <w:tcW w:type="dxa" w:w="2436"/>
+            <w:vAlign w:val="center"/>
+            <w:shd w:val="clear" w:color="auto" w:fill="F7FAFD"/>
+          </w:tcPr>
+          <w:p>
+            <w:r>
+              <w:t>Append-only immutable audit log of every state change</w:t>
+            </w:r>
+          </w:p>
+        </w:tc>
+        <w:tc>
+          <w:tcPr>
+            <w:tcW w:type="dxa" w:w="2436"/>
+            <w:vAlign w:val="center"/>
+            <w:shd w:val="clear" w:color="auto" w:fill="F7FAFD"/>
+          </w:tcPr>
+          <w:p>
+            <w:r>
+              <w:t>I, NR</w:t>
+            </w:r>
+          </w:p>
+        </w:tc>
+      </w:tr>
+      <w:tr>
+        <w:tc>
+          <w:tcPr>
+            <w:tcW w:type="dxa" w:w="2436"/>
+            <w:vAlign w:val="center"/>
+          </w:tcPr>
+          <w:p>
+            <w:r>
+              <w:t>SR-11</w:t>
+            </w:r>
+          </w:p>
+        </w:tc>
+        <w:tc>
+          <w:tcPr>
+            <w:tcW w:type="dxa" w:w="2436"/>
+            <w:vAlign w:val="center"/>
+          </w:tcPr>
+          <w:p>
+            <w:r>
+              <w:t>Audit</w:t>
+            </w:r>
+          </w:p>
+        </w:tc>
+        <w:tc>
+          <w:tcPr>
+            <w:tcW w:type="dxa" w:w="2436"/>
+            <w:vAlign w:val="center"/>
+          </w:tcPr>
+          <w:p>
+            <w:r>
+              <w:t>Logs forwarded to SIEM with tamper-evident hashing</w:t>
+            </w:r>
+          </w:p>
+        </w:tc>
+        <w:tc>
+          <w:tcPr>
+            <w:tcW w:type="dxa" w:w="2436"/>
+            <w:vAlign w:val="center"/>
+          </w:tcPr>
+          <w:p>
+            <w:r>
+              <w:t>I</w:t>
+            </w:r>
+          </w:p>
+        </w:tc>
+      </w:tr>
+      <w:tr>
+        <w:tc>
+          <w:tcPr>
+            <w:tcW w:type="dxa" w:w="2436"/>
+            <w:vAlign w:val="center"/>
+            <w:shd w:val="clear" w:color="auto" w:fill="F7FAFD"/>
+          </w:tcPr>
+          <w:p>
+            <w:r>
+              <w:t>SR-12</w:t>
+            </w:r>
+          </w:p>
+        </w:tc>
+        <w:tc>
+          <w:tcPr>
+            <w:tcW w:type="dxa" w:w="2436"/>
+            <w:vAlign w:val="center"/>
+            <w:shd w:val="clear" w:color="auto" w:fill="F7FAFD"/>
+          </w:tcPr>
+          <w:p>
+            <w:r>
+              <w:t>Non-Repudiation</w:t>
+            </w:r>
+          </w:p>
+        </w:tc>
+        <w:tc>
+          <w:tcPr>
+            <w:tcW w:type="dxa" w:w="2436"/>
+            <w:vAlign w:val="center"/>
+            <w:shd w:val="clear" w:color="auto" w:fill="F7FAFD"/>
+          </w:tcPr>
+          <w:p>
+            <w:r>
+              <w:t>Digital signatures on all state-changing actions</w:t>
+            </w:r>
+          </w:p>
+        </w:tc>
+        <w:tc>
+          <w:tcPr>
+            <w:tcW w:type="dxa" w:w="2436"/>
+            <w:vAlign w:val="center"/>
+            <w:shd w:val="clear" w:color="auto" w:fill="F7FAFD"/>
+          </w:tcPr>
+          <w:p>
+            <w:r>
+              <w:t>NR</w:t>
+            </w:r>
+          </w:p>
+        </w:tc>
+      </w:tr>
+      <w:tr>
+        <w:tc>
+          <w:tcPr>
+            <w:tcW w:type="dxa" w:w="2436"/>
+            <w:vAlign w:val="center"/>
+          </w:tcPr>
+          <w:p>
+            <w:r>
+              <w:t>SR-13</w:t>
+            </w:r>
+          </w:p>
+        </w:tc>
+        <w:tc>
+          <w:tcPr>
+            <w:tcW w:type="dxa" w:w="2436"/>
+            <w:vAlign w:val="center"/>
+          </w:tcPr>
+          <w:p>
+            <w:r>
+              <w:t>Key Management</w:t>
+            </w:r>
+          </w:p>
+        </w:tc>
+        <w:tc>
+          <w:tcPr>
+            <w:tcW w:type="dxa" w:w="2436"/>
+            <w:vAlign w:val="center"/>
+          </w:tcPr>
+          <w:p>
+            <w:r>
+              <w:t>HSM-backed keys, 90-day rotation</w:t>
+            </w:r>
+          </w:p>
+        </w:tc>
+        <w:tc>
+          <w:tcPr>
+            <w:tcW w:type="dxa" w:w="2436"/>
+            <w:vAlign w:val="center"/>
+          </w:tcPr>
+          <w:p>
+            <w:r>
+              <w:t>C, I</w:t>
+            </w:r>
+          </w:p>
+        </w:tc>
+      </w:tr>
+      <w:tr>
+        <w:tc>
+          <w:tcPr>
+            <w:tcW w:type="dxa" w:w="2436"/>
+            <w:vAlign w:val="center"/>
+            <w:shd w:val="clear" w:color="auto" w:fill="F7FAFD"/>
+          </w:tcPr>
+          <w:p>
+            <w:r>
+              <w:t>SR-14</w:t>
+            </w:r>
+          </w:p>
+        </w:tc>
+        <w:tc>
+          <w:tcPr>
+            <w:tcW w:type="dxa" w:w="2436"/>
+            <w:vAlign w:val="center"/>
+            <w:shd w:val="clear" w:color="auto" w:fill="F7FAFD"/>
+          </w:tcPr>
+          <w:p>
+            <w:r>
+              <w:t>Anomaly Detection</w:t>
+            </w:r>
+          </w:p>
+        </w:tc>
+        <w:tc>
+          <w:tcPr>
+            <w:tcW w:type="dxa" w:w="2436"/>
+            <w:vAlign w:val="center"/>
+            <w:shd w:val="clear" w:color="auto" w:fill="F7FAFD"/>
+          </w:tcPr>
+          <w:p>
+            <w:r>
+              <w:t>Alert on duplicate serial, odd-hour transfer, or unusual pattern</w:t>
+            </w:r>
+          </w:p>
+        </w:tc>
+        <w:tc>
+          <w:tcPr>
+            <w:tcW w:type="dxa" w:w="2436"/>
+            <w:vAlign w:val="center"/>
+            <w:shd w:val="clear" w:color="auto" w:fill="F7FAFD"/>
+          </w:tcPr>
+          <w:p>
+            <w:r>
+              <w:t>I</w:t>
+            </w:r>
+          </w:p>
+        </w:tc>
+      </w:tr>
+      <w:tr>
+        <w:tc>
+          <w:tcPr>
+            <w:tcW w:type="dxa" w:w="2436"/>
+            <w:vAlign w:val="center"/>
+          </w:tcPr>
+          <w:p>
+            <w:r>
+              <w:t>SR-15</w:t>
+            </w:r>
+          </w:p>
+        </w:tc>
+        <w:tc>
+          <w:tcPr>
+            <w:tcW w:type="dxa" w:w="2436"/>
+            <w:vAlign w:val="center"/>
+          </w:tcPr>
+          <w:p>
+            <w:r>
+              <w:t>Availability</w:t>
+            </w:r>
+          </w:p>
+        </w:tc>
+        <w:tc>
+          <w:tcPr>
+            <w:tcW w:type="dxa" w:w="2436"/>
+            <w:vAlign w:val="center"/>
+          </w:tcPr>
+          <w:p>
+            <w:r>
+              <w:t>DDoS protection at API Gateway</w:t>
+            </w:r>
+          </w:p>
+        </w:tc>
+        <w:tc>
+          <w:tcPr>
+            <w:tcW w:type="dxa" w:w="2436"/>
+            <w:vAlign w:val="center"/>
+          </w:tcPr>
+          <w:p>
+            <w:r>
+              <w:t>A</w:t>
+            </w:r>
+          </w:p>
+        </w:tc>
+      </w:tr>
+      <w:tr>
+        <w:tc>
+          <w:tcPr>
+            <w:tcW w:type="dxa" w:w="2436"/>
+            <w:vAlign w:val="center"/>
+            <w:shd w:val="clear" w:color="auto" w:fill="F7FAFD"/>
+          </w:tcPr>
+          <w:p>
+            <w:r>
+              <w:t>SR-16</w:t>
+            </w:r>
+          </w:p>
+        </w:tc>
+        <w:tc>
+          <w:tcPr>
+            <w:tcW w:type="dxa" w:w="2436"/>
+            <w:vAlign w:val="center"/>
+            <w:shd w:val="clear" w:color="auto" w:fill="F7FAFD"/>
+          </w:tcPr>
+          <w:p>
+            <w:r>
+              <w:t>Trust Boundaries</w:t>
+            </w:r>
+          </w:p>
+        </w:tc>
+        <w:tc>
+          <w:tcPr>
+            <w:tcW w:type="dxa" w:w="2436"/>
+            <w:vAlign w:val="center"/>
+            <w:shd w:val="clear" w:color="auto" w:fill="F7FAFD"/>
+          </w:tcPr>
+          <w:p>
+            <w:r>
+              <w:t>Cross-org calls only via authenticated, signed APIs</w:t>
+            </w:r>
+          </w:p>
+        </w:tc>
+        <w:tc>
+          <w:tcPr>
+            <w:tcW w:type="dxa" w:w="2436"/>
+            <w:vAlign w:val="center"/>
+            <w:shd w:val="clear" w:color="auto" w:fill="F7FAFD"/>
+          </w:tcPr>
+          <w:p>
+            <w:r>
+              <w:t>Auth, I</w:t>
+            </w:r>
+          </w:p>
+        </w:tc>
+      </w:tr>
+    </w:tbl>
+    <w:p>
+      <w:pPr>
+        <w:pStyle w:val="Heading2"/>
+        <w:spacing w:before="240" w:after="120"/>
+      </w:pPr>
+      <w:r>
+        <w:rPr>
+          <w:rFonts w:ascii="Calibri" w:hAnsi="Calibri"/>
+          <w:b/>
+          <w:color w:val="2E74B5"/>
+          <w:sz w:val="30"/>
+        </w:rPr>
+        <w:t>2.5 Prioritization (MoSCoW)</w:t>
+      </w:r>
+    </w:p>
+    <w:tbl>
+      <w:tblPr>
+        <w:tblStyle w:val="TableGrid"/>
+        <w:tblW w:type="auto" w:w="0"/>
+        <w:jc w:val="center"/>
+        <w:tblLayout w:type="autofit"/>
+        <w:tblLook w:firstColumn="1" w:firstRow="1" w:lastColumn="0" w:lastRow="0" w:noHBand="0" w:noVBand="1" w:val="04A0"/>
+      </w:tblPr>
+      <w:tblGrid>
+        <w:gridCol w:w="4873"/>
+        <w:gridCol w:w="4873"/>
+      </w:tblGrid>
+      <w:tr>
+        <w:tc>
+          <w:tcPr>
+            <w:tcW w:type="dxa" w:w="4873"/>
+            <w:vAlign w:val="center"/>
+            <w:shd w:val="clear" w:color="auto" w:fill="1F3A5F"/>
+          </w:tcPr>
+          <w:p>
+            <w:r>
+              <w:rPr>
+                <w:b/>
+                <w:color w:val="FFFFFF"/>
+                <w:sz w:val="21"/>
+              </w:rPr>
+              <w:t>Priority</w:t>
+            </w:r>
+          </w:p>
+        </w:tc>
+        <w:tc>
+          <w:tcPr>
+            <w:tcW w:type="dxa" w:w="4873"/>
+            <w:vAlign w:val="center"/>
+            <w:shd w:val="clear" w:color="auto" w:fill="1F3A5F"/>
+          </w:tcPr>
+          <w:p>
+            <w:r>
+              <w:rPr>
+                <w:b/>
+                <w:color w:val="FFFFFF"/>
+                <w:sz w:val="21"/>
+              </w:rPr>
+              <w:t>Requirements</w:t>
+            </w:r>
+          </w:p>
+        </w:tc>
+      </w:tr>
+      <w:tr>
+        <w:tc>
+          <w:tcPr>
+            <w:tcW w:type="dxa" w:w="4873"/>
+            <w:vAlign w:val="center"/>
+          </w:tcPr>
+          <w:p>
+            <w:r>
+              <w:t>Must Have</w:t>
+            </w:r>
+          </w:p>
+        </w:tc>
+        <w:tc>
+          <w:tcPr>
+            <w:tcW w:type="dxa" w:w="4873"/>
+            <w:vAlign w:val="center"/>
+          </w:tcPr>
+          <w:p>
+            <w:r>
+              <w:t>FR-01..FR-05, FR-08, FR-09, SR-01..SR-12, NFR-01, NFR-06, NFR-09</w:t>
+            </w:r>
+          </w:p>
+        </w:tc>
+      </w:tr>
+      <w:tr>
+        <w:tc>
+          <w:tcPr>
+            <w:tcW w:type="dxa" w:w="4873"/>
+            <w:vAlign w:val="center"/>
+            <w:shd w:val="clear" w:color="auto" w:fill="F7FAFD"/>
+          </w:tcPr>
+          <w:p>
+            <w:r>
+              <w:t>Should Have</w:t>
+            </w:r>
+          </w:p>
+        </w:tc>
+        <w:tc>
+          <w:tcPr>
+            <w:tcW w:type="dxa" w:w="4873"/>
+            <w:vAlign w:val="center"/>
+            <w:shd w:val="clear" w:color="auto" w:fill="F7FAFD"/>
+          </w:tcPr>
+          <w:p>
+            <w:r>
+              <w:t>FR-06, FR-07, FR-10..FR-12, SR-13..SR-16, NFR-02..NFR-05, NFR-07</w:t>
+            </w:r>
+          </w:p>
+        </w:tc>
+      </w:tr>
+      <w:tr>
+        <w:tc>
+          <w:tcPr>
+            <w:tcW w:type="dxa" w:w="4873"/>
+            <w:vAlign w:val="center"/>
+          </w:tcPr>
+          <w:p>
+            <w:r>
+              <w:t>Could Have</w:t>
+            </w:r>
+          </w:p>
+        </w:tc>
+        <w:tc>
+          <w:tcPr>
+            <w:tcW w:type="dxa" w:w="4873"/>
+            <w:vAlign w:val="center"/>
+          </w:tcPr>
+          <w:p>
+            <w:r>
+              <w:t>FR-13, FR-14, NFR-08, NFR-10</w:t>
+            </w:r>
+          </w:p>
+        </w:tc>
+      </w:tr>
+      <w:tr>
+        <w:tc>
+          <w:tcPr>
+            <w:tcW w:type="dxa" w:w="4873"/>
+            <w:vAlign w:val="center"/>
+            <w:shd w:val="clear" w:color="auto" w:fill="F7FAFD"/>
+          </w:tcPr>
+          <w:p>
+            <w:r>
+              <w:t>Won't Have (this release)</w:t>
+            </w:r>
+          </w:p>
+        </w:tc>
+        <w:tc>
+          <w:tcPr>
+            <w:tcW w:type="dxa" w:w="4873"/>
+            <w:vAlign w:val="center"/>
+            <w:shd w:val="clear" w:color="auto" w:fill="F7FAFD"/>
+          </w:tcPr>
+          <w:p>
+            <w:r>
+              <w:t>Public blockchain anchoring, cross-chain interop</w:t>
+            </w:r>
+          </w:p>
+        </w:tc>
+      </w:tr>
+    </w:tbl>
+    <w:p>
+      <w:pPr>
+        <w:pStyle w:val="Heading2"/>
+        <w:spacing w:before="240" w:after="120"/>
+      </w:pPr>
+      <w:r>
+        <w:rPr>
+          <w:rFonts w:ascii="Calibri" w:hAnsi="Calibri"/>
+          <w:b/>
+          <w:color w:val="2E74B5"/>
+          <w:sz w:val="30"/>
+        </w:rPr>
+        <w:t>2.6 CIA / Auth / Authz / Audit Mapping</w:t>
+      </w:r>
+    </w:p>
+    <w:tbl>
+      <w:tblPr>
+        <w:tblStyle w:val="TableGrid"/>
+        <w:tblW w:type="auto" w:w="0"/>
+        <w:jc w:val="center"/>
+        <w:tblLayout w:type="autofit"/>
+        <w:tblLook w:firstColumn="1" w:firstRow="1" w:lastColumn="0" w:lastRow="0" w:noHBand="0" w:noVBand="1" w:val="04A0"/>
+      </w:tblPr>
+      <w:tblGrid>
+        <w:gridCol w:w="4873"/>
+        <w:gridCol w:w="4873"/>
+      </w:tblGrid>
+      <w:tr>
+        <w:tc>
+          <w:tcPr>
+            <w:tcW w:type="dxa" w:w="4873"/>
+            <w:vAlign w:val="center"/>
+            <w:shd w:val="clear" w:color="auto" w:fill="1F3A5F"/>
+          </w:tcPr>
+          <w:p>
+            <w:r>
+              <w:rPr>
+                <w:b/>
+                <w:color w:val="FFFFFF"/>
+                <w:sz w:val="21"/>
+              </w:rPr>
+              <w:t>Category</w:t>
+            </w:r>
+          </w:p>
+        </w:tc>
+        <w:tc>
+          <w:tcPr>
+            <w:tcW w:type="dxa" w:w="4873"/>
+            <w:vAlign w:val="center"/>
+            <w:shd w:val="clear" w:color="auto" w:fill="1F3A5F"/>
+          </w:tcPr>
+          <w:p>
+            <w:r>
+              <w:rPr>
+                <w:b/>
+                <w:color w:val="FFFFFF"/>
+                <w:sz w:val="21"/>
+              </w:rPr>
+              <w:t>Requirements</w:t>
+            </w:r>
+          </w:p>
+        </w:tc>
+      </w:tr>
+      <w:tr>
+        <w:tc>
+          <w:tcPr>
+            <w:tcW w:type="dxa" w:w="4873"/>
+            <w:vAlign w:val="center"/>
+          </w:tcPr>
+          <w:p>
+            <w:r>
+              <w:t>Confidentiality (C)</w:t>
+            </w:r>
+          </w:p>
+        </w:tc>
+        <w:tc>
+          <w:tcPr>
+            <w:tcW w:type="dxa" w:w="4873"/>
+            <w:vAlign w:val="center"/>
+          </w:tcPr>
+          <w:p>
+            <w:r>
+              <w:t>SR-08, SR-09, SR-13 (keys), NFR-06</w:t>
+            </w:r>
+          </w:p>
+        </w:tc>
+      </w:tr>
+      <w:tr>
+        <w:tc>
+          <w:tcPr>
+            <w:tcW w:type="dxa" w:w="4873"/>
+            <w:vAlign w:val="center"/>
+            <w:shd w:val="clear" w:color="auto" w:fill="F7FAFD"/>
+          </w:tcPr>
+          <w:p>
+            <w:r>
+              <w:t>Integrity (I)</w:t>
+            </w:r>
+          </w:p>
+        </w:tc>
+        <w:tc>
+          <w:tcPr>
+            <w:tcW w:type="dxa" w:w="4873"/>
+            <w:vAlign w:val="center"/>
+            <w:shd w:val="clear" w:color="auto" w:fill="F7FAFD"/>
+          </w:tcPr>
+          <w:p>
+            <w:r>
+              <w:t>SR-03, SR-04, SR-05, SR-10, SR-11, SR-14</w:t>
+            </w:r>
+          </w:p>
+        </w:tc>
+      </w:tr>
+      <w:tr>
+        <w:tc>
+          <w:tcPr>
+            <w:tcW w:type="dxa" w:w="4873"/>
+            <w:vAlign w:val="center"/>
+          </w:tcPr>
+          <w:p>
+            <w:r>
+              <w:t>Availability (A)</w:t>
+            </w:r>
+          </w:p>
+        </w:tc>
+        <w:tc>
+          <w:tcPr>
+            <w:tcW w:type="dxa" w:w="4873"/>
+            <w:vAlign w:val="center"/>
+          </w:tcPr>
+          <w:p>
+            <w:r>
+              <w:t>NFR-01, SR-15</w:t>
+            </w:r>
+          </w:p>
+        </w:tc>
+      </w:tr>
+      <w:tr>
+        <w:tc>
+          <w:tcPr>
+            <w:tcW w:type="dxa" w:w="4873"/>
+            <w:vAlign w:val="center"/>
+            <w:shd w:val="clear" w:color="auto" w:fill="F7FAFD"/>
+          </w:tcPr>
+          <w:p>
+            <w:r>
+              <w:t>Authentication (Auth)</w:t>
+            </w:r>
+          </w:p>
+        </w:tc>
+        <w:tc>
+          <w:tcPr>
+            <w:tcW w:type="dxa" w:w="4873"/>
+            <w:vAlign w:val="center"/>
+            <w:shd w:val="clear" w:color="auto" w:fill="F7FAFD"/>
+          </w:tcPr>
+          <w:p>
+            <w:r>
+              <w:t>SR-01, SR-02, SR-16</w:t>
+            </w:r>
+          </w:p>
+        </w:tc>
+      </w:tr>
+      <w:tr>
+        <w:tc>
+          <w:tcPr>
+            <w:tcW w:type="dxa" w:w="4873"/>
+            <w:vAlign w:val="center"/>
+          </w:tcPr>
+          <w:p>
+            <w:r>
+              <w:t>Authorization (Authz)</w:t>
+            </w:r>
+          </w:p>
+        </w:tc>
+        <w:tc>
+          <w:tcPr>
+            <w:tcW w:type="dxa" w:w="4873"/>
+            <w:vAlign w:val="center"/>
+          </w:tcPr>
+          <w:p>
+            <w:r>
+              <w:t>SR-06, SR-07</w:t>
+            </w:r>
+          </w:p>
+        </w:tc>
+      </w:tr>
+      <w:tr>
+        <w:tc>
+          <w:tcPr>
+            <w:tcW w:type="dxa" w:w="4873"/>
+            <w:vAlign w:val="center"/>
+            <w:shd w:val="clear" w:color="auto" w:fill="F7FAFD"/>
+          </w:tcPr>
+          <w:p>
+            <w:r>
+              <w:t>Audit (Aud)</w:t>
+            </w:r>
+          </w:p>
+        </w:tc>
+        <w:tc>
+          <w:tcPr>
+            <w:tcW w:type="dxa" w:w="4873"/>
+            <w:vAlign w:val="center"/>
+            <w:shd w:val="clear" w:color="auto" w:fill="F7FAFD"/>
+          </w:tcPr>
+          <w:p>
+            <w:r>
+              <w:t>SR-10, SR-11, NFR-09</w:t>
+            </w:r>
+          </w:p>
+        </w:tc>
+      </w:tr>
+      <w:tr>
+        <w:tc>
+          <w:tcPr>
+            <w:tcW w:type="dxa" w:w="4873"/>
+            <w:vAlign w:val="center"/>
+          </w:tcPr>
+          <w:p>
+            <w:r>
+              <w:t>Non-Repudiation (NR)</w:t>
+            </w:r>
+          </w:p>
+        </w:tc>
+        <w:tc>
+          <w:tcPr>
+            <w:tcW w:type="dxa" w:w="4873"/>
+            <w:vAlign w:val="center"/>
+          </w:tcPr>
+          <w:p>
+            <w:r>
+              <w:t>SR-03, SR-12</w:t>
+            </w:r>
+          </w:p>
+        </w:tc>
+      </w:tr>
+    </w:tbl>
+    <w:p>
+      <w:pPr>
+        <w:pStyle w:val="Heading2"/>
+        <w:spacing w:before="240" w:after="120"/>
+      </w:pPr>
+      <w:r>
+        <w:rPr>
+          <w:rFonts w:ascii="Calibri" w:hAnsi="Calibri"/>
+          <w:b/>
+          <w:color w:val="2E74B5"/>
+          <w:sz w:val="30"/>
+        </w:rPr>
+        <w:t>2.7 Traceability Thread (Carried Forward)</w:t>
+      </w:r>
+    </w:p>
+    <w:p>
+      <w:r>
+        <w:rPr>
+          <w:b/>
+          <w:color w:val="2E74B5"/>
+        </w:rPr>
+        <w:t>SR-03</w:t>
+      </w:r>
+      <w:r>
+        <w:t xml:space="preserve"> = Every ownership transfer must be digitally signed, hash-chained, and audit-logged.</w:t>
+      </w:r>
+    </w:p>
+    <w:p>
+      <w:r>
+        <w:t>Mapped to FR-04 (transfer ownership), NFR-09 (log retention), SR-12 (non-repudiation). Will thread through Use Case, DFD, Threat Model, Attack Tree, User Story, Code, Test, and Deployment phases.</w:t>
+      </w:r>
+    </w:p>
+    <w:p>
+      <w:pPr>
+        <w:pStyle w:val="Heading2"/>
+        <w:spacing w:before="240" w:after="120"/>
+      </w:pPr>
+      <w:r>
+        <w:rPr>
+          <w:rFonts w:ascii="Calibri" w:hAnsi="Calibri"/>
+          <w:b/>
+          <w:color w:val="2E74B5"/>
+          <w:sz w:val="30"/>
+        </w:rPr>
+        <w:t>2.8 Assumptions and Constraints</w:t>
+      </w:r>
+    </w:p>
+    <w:p>
+      <w:pPr>
+        <w:pStyle w:val="Heading3"/>
+        <w:spacing w:before="160" w:after="80"/>
+      </w:pPr>
+      <w:r>
+        <w:rPr>
+          <w:rFonts w:ascii="Calibri" w:hAnsi="Calibri"/>
+          <w:b/>
+          <w:color w:val="1F3A5F"/>
+          <w:sz w:val="25"/>
+        </w:rPr>
+        <w:t>Assumptions</w:t>
+      </w:r>
+    </w:p>
+    <w:p>
+      <w:pPr>
+        <w:pStyle w:val="ListBullet"/>
+      </w:pPr>
+      <w:r>
+        <w:t>Each organization has PKI-issued certificates from a shared CA.</w:t>
+      </w:r>
+    </w:p>
+    <w:p>
+      <w:pPr>
+        <w:pStyle w:val="ListBullet"/>
+      </w:pPr>
+      <w:r>
+        <w:t>Organizations are known/trusted (permissioned network, not public).</w:t>
+      </w:r>
+    </w:p>
+    <w:p>
+      <w:pPr>
+        <w:pStyle w:val="ListBullet"/>
+      </w:pPr>
+      <w:r>
+        <w:t>Customers have smartphones with QR scanning capability.</w:t>
+      </w:r>
+    </w:p>
+    <w:p>
+      <w:pPr>
+        <w:pStyle w:val="Heading3"/>
+        <w:spacing w:before="160" w:after="80"/>
+      </w:pPr>
+      <w:r>
+        <w:rPr>
+          <w:rFonts w:ascii="Calibri" w:hAnsi="Calibri"/>
+          <w:b/>
+          <w:color w:val="1F3A5F"/>
+          <w:sz w:val="25"/>
+        </w:rPr>
+        <w:t>Constraints</w:t>
+      </w:r>
+    </w:p>
+    <w:p>
+      <w:pPr>
+        <w:pStyle w:val="ListBullet"/>
+      </w:pPr>
+      <w:r>
+        <w:t>Must comply with FDA DSCSA and GS1 EPCIS 2.0.</w:t>
+      </w:r>
+    </w:p>
+    <w:p>
+      <w:pPr>
+        <w:pStyle w:val="ListBullet"/>
+      </w:pPr>
+      <w:r>
+        <w:t>Must use HSM for signing key storage (no soft keys in production).</w:t>
+      </w:r>
+    </w:p>
+    <w:p>
+      <w:pPr>
+        <w:pStyle w:val="ListBullet"/>
+      </w:pPr>
+      <w:r>
+        <w:t>Regulatory log retention: 7 years minimum.</w:t>
+      </w:r>
+    </w:p>
+    <w:p>
+      <w:r>
+        <w:br w:type="page"/>
+      </w:r>
+    </w:p>
     <w:sectPr>
+      <w:footerReference w:type="default" r:id="rId9"/>
       <w:pgSz w:w="12240" w:h="15840"/>
-      <w:pgMar w:top="1440" w:right="1800" w:bottom="1440" w:left="1800" w:header="720" w:footer="720" w:gutter="0"/>
+      <w:pgMar w:top="1134" w:right="1247" w:bottom="1134" w:left="1247" w:header="720" w:footer="720" w:gutter="0"/>
       <w:cols w:space="720"/>
       <w:docGrid w:linePitch="360"/>
     </w:sectPr>
   </w:body>
 </w:document>
+</file>
+
+<file path=word/footer1.xml><?xml version="1.0" encoding="utf-8"?>
+<w:ftr xmlns:m="http://schemas.openxmlformats.org/officeDocument/2006/math" xmlns:mc="http://schemas.openxmlformats.org/markup-compatibility/2006" xmlns:mo="http://schemas.microsoft.com/office/mac/office/2008/main" xmlns:mv="urn:schemas-microsoft-com:mac:vml" xmlns:o="urn:schemas-microsoft-com:office:office" xmlns:r="http://schemas.openxmlformats.org/officeDocument/2006/relationships" xmlns:v="urn:schemas-microsoft-com:vml" xmlns:w10="urn:schemas-microsoft-com:office:word" xmlns:w14="http://schemas.microsoft.com/office/word/2010/wordml" xmlns:w="http://schemas.openxmlformats.org/wordprocessingml/2006/main" xmlns:wne="http://schemas.microsoft.com/office/word/2006/wordml" xmlns:wp14="http://schemas.microsoft.com/office/word/2010/wordprocessingDrawing" xmlns:wp="http://schemas.openxmlformats.org/drawingml/2006/wordprocessingDrawing" xmlns:wpc="http://schemas.microsoft.com/office/word/2010/wordprocessingCanvas" xmlns:wpg="http://schemas.microsoft.com/office/word/2010/wordprocessingGroup" xmlns:wpi="http://schemas.microsoft.com/office/word/2010/wordprocessingInk" xmlns:wps="http://schemas.microsoft.com/office/word/2010/wordprocessingShape" mc:Ignorable="w14 wp14">
+  <w:p>
+    <w:pPr>
+      <w:pStyle w:val="Footer"/>
+      <w:jc w:val="center"/>
+    </w:pPr>
+    <w:r>
+      <w:t xml:space="preserve">Page </w:t>
+    </w:r>
+    <w:fldSimple w:instr="PAGE"/>
+    <w:r>
+      <w:t xml:space="preserve"> of </w:t>
+    </w:r>
+    <w:fldSimple w:instr="NUMPAGES"/>
+  </w:p>
+</w:ftr>
 </file>
 
 <file path=word/numbering.xml><?xml version="1.0" encoding="utf-8"?>
@@ -1059,6 +4912,13 @@
     <w:name w:val="Normal"/>
     <w:qFormat/>
     <w:rsid w:val="00FC693F"/>
+    <w:pPr>
+      <w:spacing w:after="120"/>
+    </w:pPr>
+    <w:rPr>
+      <w:rFonts w:ascii="Calibri" w:hAnsi="Calibri"/>
+      <w:sz w:val="22"/>
+    </w:rPr>
   </w:style>
   <w:style w:type="paragraph" w:styleId="Header">
     <w:name w:val="header"/>

</xml_diff>

<commit_message>
diagrams: add 7 professional PlantUML diagrams (PNG + PUML sources)
</commit_message>
<xml_diff>
--- a/PharmaChain_SSE_Report.docx
+++ b/PharmaChain_SSE_Report.docx
@@ -4519,6 +4519,3067 @@
         <w:br w:type="page"/>
       </w:r>
     </w:p>
+    <w:p>
+      <w:pPr>
+        <w:pStyle w:val="Heading1"/>
+        <w:spacing w:before="360" w:after="160"/>
+      </w:pPr>
+      <w:r>
+        <w:rPr>
+          <w:rFonts w:ascii="Calibri" w:hAnsi="Calibri"/>
+          <w:b/>
+          <w:color w:val="1F3A5F"/>
+          <w:sz w:val="40"/>
+        </w:rPr>
+        <w:t>Phase 3 - Requirements Analysis and UML</w:t>
+      </w:r>
+    </w:p>
+    <w:p>
+      <w:pPr>
+        <w:pStyle w:val="Heading2"/>
+        <w:spacing w:before="240" w:after="120"/>
+      </w:pPr>
+      <w:r>
+        <w:rPr>
+          <w:rFonts w:ascii="Calibri" w:hAnsi="Calibri"/>
+          <w:b/>
+          <w:color w:val="2E74B5"/>
+          <w:sz w:val="30"/>
+        </w:rPr>
+        <w:t>3.1 Use Case Diagram</w:t>
+      </w:r>
+    </w:p>
+    <w:p>
+      <w:r>
+        <w:t>The diagram shows 8 actors (5 primary supply-chain roles + 3 supporting roles) and 10 major use cases with include/extend relationships that enforce security invariants.</w:t>
+      </w:r>
+    </w:p>
+    <w:p>
+      <w:pPr>
+        <w:spacing w:before="0" w:after="0" w:line="240" w:lineRule="auto"/>
+        <w:ind w:left="288"/>
+      </w:pPr>
+      <w:r>
+        <w:rPr>
+          <w:rFonts w:ascii="Consolas" w:hAnsi="Consolas"/>
+          <w:color w:val="202020"/>
+          <w:sz w:val="17"/>
+        </w:rPr>
+        <w:t xml:space="preserve"> </w:t>
+      </w:r>
+    </w:p>
+    <w:p>
+      <w:pPr>
+        <w:spacing w:before="0" w:after="0" w:line="240" w:lineRule="auto"/>
+        <w:ind w:left="288"/>
+      </w:pPr>
+      <w:r>
+        <w:rPr>
+          <w:rFonts w:ascii="Consolas" w:hAnsi="Consolas"/>
+          <w:color w:val="202020"/>
+          <w:sz w:val="17"/>
+        </w:rPr>
+        <w:t>+----------------------------------------------------------------------------------+</w:t>
+      </w:r>
+    </w:p>
+    <w:p>
+      <w:pPr>
+        <w:spacing w:before="0" w:after="0" w:line="240" w:lineRule="auto"/>
+        <w:ind w:left="288"/>
+      </w:pPr>
+      <w:r>
+        <w:rPr>
+          <w:rFonts w:ascii="Consolas" w:hAnsi="Consolas"/>
+          <w:color w:val="202020"/>
+          <w:sz w:val="17"/>
+        </w:rPr>
+        <w:t>|                            PHARMACHAIN SYSTEM BOUNDARY                           |</w:t>
+      </w:r>
+    </w:p>
+    <w:p>
+      <w:pPr>
+        <w:spacing w:before="0" w:after="0" w:line="240" w:lineRule="auto"/>
+        <w:ind w:left="288"/>
+      </w:pPr>
+      <w:r>
+        <w:rPr>
+          <w:rFonts w:ascii="Consolas" w:hAnsi="Consolas"/>
+          <w:color w:val="202020"/>
+          <w:sz w:val="17"/>
+        </w:rPr>
+        <w:t>|                                                                                  |</w:t>
+      </w:r>
+    </w:p>
+    <w:p>
+      <w:pPr>
+        <w:spacing w:before="0" w:after="0" w:line="240" w:lineRule="auto"/>
+        <w:ind w:left="288"/>
+      </w:pPr>
+      <w:r>
+        <w:rPr>
+          <w:rFonts w:ascii="Consolas" w:hAnsi="Consolas"/>
+          <w:color w:val="202020"/>
+          <w:sz w:val="17"/>
+        </w:rPr>
+        <w:t>|   (Register Product)          (Create Shipment)          (Confirm Warehouse      |</w:t>
+      </w:r>
+    </w:p>
+    <w:p>
+      <w:pPr>
+        <w:spacing w:before="0" w:after="0" w:line="240" w:lineRule="auto"/>
+        <w:ind w:left="288"/>
+      </w:pPr>
+      <w:r>
+        <w:rPr>
+          <w:rFonts w:ascii="Consolas" w:hAnsi="Consolas"/>
+          <w:color w:val="202020"/>
+          <w:sz w:val="17"/>
+        </w:rPr>
+        <w:t>|         |                          |                          Receipt)           |</w:t>
+      </w:r>
+    </w:p>
+    <w:p>
+      <w:pPr>
+        <w:spacing w:before="0" w:after="0" w:line="240" w:lineRule="auto"/>
+        <w:ind w:left="288"/>
+      </w:pPr>
+      <w:r>
+        <w:rPr>
+          <w:rFonts w:ascii="Consolas" w:hAnsi="Consolas"/>
+          <w:color w:val="202020"/>
+          <w:sz w:val="17"/>
+        </w:rPr>
+        <w:t>|         |                          |                            |                |</w:t>
+      </w:r>
+    </w:p>
+    <w:p>
+      <w:pPr>
+        <w:spacing w:before="0" w:after="0" w:line="240" w:lineRule="auto"/>
+        <w:ind w:left="288"/>
+      </w:pPr>
+      <w:r>
+        <w:rPr>
+          <w:rFonts w:ascii="Consolas" w:hAnsi="Consolas"/>
+          <w:color w:val="202020"/>
+          <w:sz w:val="17"/>
+        </w:rPr>
+        <w:t>|         |  &lt;&lt;include&gt;&gt;             |  &lt;&lt;include&gt;&gt;               |                |</w:t>
+      </w:r>
+    </w:p>
+    <w:p>
+      <w:pPr>
+        <w:spacing w:before="0" w:after="0" w:line="240" w:lineRule="auto"/>
+        <w:ind w:left="288"/>
+      </w:pPr>
+      <w:r>
+        <w:rPr>
+          <w:rFonts w:ascii="Consolas" w:hAnsi="Consolas"/>
+          <w:color w:val="202020"/>
+          <w:sz w:val="17"/>
+        </w:rPr>
+        <w:t>|         +--&gt; (Sign Transaction)    +--&gt; (Write Audit Log) &lt;------+                |</w:t>
+      </w:r>
+    </w:p>
+    <w:p>
+      <w:pPr>
+        <w:spacing w:before="0" w:after="0" w:line="240" w:lineRule="auto"/>
+        <w:ind w:left="288"/>
+      </w:pPr>
+      <w:r>
+        <w:rPr>
+          <w:rFonts w:ascii="Consolas" w:hAnsi="Consolas"/>
+          <w:color w:val="202020"/>
+          <w:sz w:val="17"/>
+        </w:rPr>
+        <w:t>|                                                                                  |</w:t>
+      </w:r>
+    </w:p>
+    <w:p>
+      <w:pPr>
+        <w:spacing w:before="0" w:after="0" w:line="240" w:lineRule="auto"/>
+        <w:ind w:left="288"/>
+      </w:pPr>
+      <w:r>
+        <w:rPr>
+          <w:rFonts w:ascii="Consolas" w:hAnsi="Consolas"/>
+          <w:color w:val="202020"/>
+          <w:sz w:val="17"/>
+        </w:rPr>
+        <w:t>|   (Transfer Ownership) ---&lt;&lt;include&gt;&gt;---&gt; (Sign Transaction)                     |</w:t>
+      </w:r>
+    </w:p>
+    <w:p>
+      <w:pPr>
+        <w:spacing w:before="0" w:after="0" w:line="240" w:lineRule="auto"/>
+        <w:ind w:left="288"/>
+      </w:pPr>
+      <w:r>
+        <w:rPr>
+          <w:rFonts w:ascii="Consolas" w:hAnsi="Consolas"/>
+          <w:color w:val="202020"/>
+          <w:sz w:val="17"/>
+        </w:rPr>
+        <w:t>|         |                                                                        |</w:t>
+      </w:r>
+    </w:p>
+    <w:p>
+      <w:pPr>
+        <w:spacing w:before="0" w:after="0" w:line="240" w:lineRule="auto"/>
+        <w:ind w:left="288"/>
+      </w:pPr>
+      <w:r>
+        <w:rPr>
+          <w:rFonts w:ascii="Consolas" w:hAnsi="Consolas"/>
+          <w:color w:val="202020"/>
+          <w:sz w:val="17"/>
+        </w:rPr>
+        <w:t>|         |                                                                        |</w:t>
+      </w:r>
+    </w:p>
+    <w:p>
+      <w:pPr>
+        <w:spacing w:before="0" w:after="0" w:line="240" w:lineRule="auto"/>
+        <w:ind w:left="288"/>
+      </w:pPr>
+      <w:r>
+        <w:rPr>
+          <w:rFonts w:ascii="Consolas" w:hAnsi="Consolas"/>
+          <w:color w:val="202020"/>
+          <w:sz w:val="17"/>
+        </w:rPr>
+        <w:t>|         +---&lt;&lt;extend&gt;&gt;---&gt; (Raise Dispute)                                       |</w:t>
+      </w:r>
+    </w:p>
+    <w:p>
+      <w:pPr>
+        <w:spacing w:before="0" w:after="0" w:line="240" w:lineRule="auto"/>
+        <w:ind w:left="288"/>
+      </w:pPr>
+      <w:r>
+        <w:rPr>
+          <w:rFonts w:ascii="Consolas" w:hAnsi="Consolas"/>
+          <w:color w:val="202020"/>
+          <w:sz w:val="17"/>
+        </w:rPr>
+        <w:t>|         |                                                                        |</w:t>
+      </w:r>
+    </w:p>
+    <w:p>
+      <w:pPr>
+        <w:spacing w:before="0" w:after="0" w:line="240" w:lineRule="auto"/>
+        <w:ind w:left="288"/>
+      </w:pPr>
+      <w:r>
+        <w:rPr>
+          <w:rFonts w:ascii="Consolas" w:hAnsi="Consolas"/>
+          <w:color w:val="202020"/>
+          <w:sz w:val="17"/>
+        </w:rPr>
+        <w:t>|         +---&lt;&lt;include&gt;&gt;---&gt; (Write Audit Log)                                    |</w:t>
+      </w:r>
+    </w:p>
+    <w:p>
+      <w:pPr>
+        <w:spacing w:before="0" w:after="0" w:line="240" w:lineRule="auto"/>
+        <w:ind w:left="288"/>
+      </w:pPr>
+      <w:r>
+        <w:rPr>
+          <w:rFonts w:ascii="Consolas" w:hAnsi="Consolas"/>
+          <w:color w:val="202020"/>
+          <w:sz w:val="17"/>
+        </w:rPr>
+        <w:t>|                                                                                  |</w:t>
+      </w:r>
+    </w:p>
+    <w:p>
+      <w:pPr>
+        <w:spacing w:before="0" w:after="0" w:line="240" w:lineRule="auto"/>
+        <w:ind w:left="288"/>
+      </w:pPr>
+      <w:r>
+        <w:rPr>
+          <w:rFonts w:ascii="Consolas" w:hAnsi="Consolas"/>
+          <w:color w:val="202020"/>
+          <w:sz w:val="17"/>
+        </w:rPr>
+        <w:t>|   (Confirm Delivery)          (Verify Authenticity)      (View Audit Trail)      |</w:t>
+      </w:r>
+    </w:p>
+    <w:p>
+      <w:pPr>
+        <w:spacing w:before="0" w:after="0" w:line="240" w:lineRule="auto"/>
+        <w:ind w:left="288"/>
+      </w:pPr>
+      <w:r>
+        <w:rPr>
+          <w:rFonts w:ascii="Consolas" w:hAnsi="Consolas"/>
+          <w:color w:val="202020"/>
+          <w:sz w:val="17"/>
+        </w:rPr>
+        <w:t>|         |                          |                            |                |</w:t>
+      </w:r>
+    </w:p>
+    <w:p>
+      <w:pPr>
+        <w:spacing w:before="0" w:after="0" w:line="240" w:lineRule="auto"/>
+        <w:ind w:left="288"/>
+      </w:pPr>
+      <w:r>
+        <w:rPr>
+          <w:rFonts w:ascii="Consolas" w:hAnsi="Consolas"/>
+          <w:color w:val="202020"/>
+          <w:sz w:val="17"/>
+        </w:rPr>
+        <w:t>|         +--&gt; (Write Audit Log)     +--&gt; (Query Ledger)          +--&gt; (Query      |</w:t>
+      </w:r>
+    </w:p>
+    <w:p>
+      <w:pPr>
+        <w:spacing w:before="0" w:after="0" w:line="240" w:lineRule="auto"/>
+        <w:ind w:left="288"/>
+      </w:pPr>
+      <w:r>
+        <w:rPr>
+          <w:rFonts w:ascii="Consolas" w:hAnsi="Consolas"/>
+          <w:color w:val="202020"/>
+          <w:sz w:val="17"/>
+        </w:rPr>
+        <w:t>|                                                                        Ledger)   |</w:t>
+      </w:r>
+    </w:p>
+    <w:p>
+      <w:pPr>
+        <w:spacing w:before="0" w:after="0" w:line="240" w:lineRule="auto"/>
+        <w:ind w:left="288"/>
+      </w:pPr>
+      <w:r>
+        <w:rPr>
+          <w:rFonts w:ascii="Consolas" w:hAnsi="Consolas"/>
+          <w:color w:val="202020"/>
+          <w:sz w:val="17"/>
+        </w:rPr>
+        <w:t>|                                                                                  |</w:t>
+      </w:r>
+    </w:p>
+    <w:p>
+      <w:pPr>
+        <w:spacing w:before="0" w:after="0" w:line="240" w:lineRule="auto"/>
+        <w:ind w:left="288"/>
+      </w:pPr>
+      <w:r>
+        <w:rPr>
+          <w:rFonts w:ascii="Consolas" w:hAnsi="Consolas"/>
+          <w:color w:val="202020"/>
+          <w:sz w:val="17"/>
+        </w:rPr>
+        <w:t>|   (Onboard Organization)      (Manage Keys)              (Trigger Recall)        |</w:t>
+      </w:r>
+    </w:p>
+    <w:p>
+      <w:pPr>
+        <w:spacing w:before="0" w:after="0" w:line="240" w:lineRule="auto"/>
+        <w:ind w:left="288"/>
+      </w:pPr>
+      <w:r>
+        <w:rPr>
+          <w:rFonts w:ascii="Consolas" w:hAnsi="Consolas"/>
+          <w:color w:val="202020"/>
+          <w:sz w:val="17"/>
+        </w:rPr>
+        <w:t>|         |                          |                            |                |</w:t>
+      </w:r>
+    </w:p>
+    <w:p>
+      <w:pPr>
+        <w:spacing w:before="0" w:after="0" w:line="240" w:lineRule="auto"/>
+        <w:ind w:left="288"/>
+      </w:pPr>
+      <w:r>
+        <w:rPr>
+          <w:rFonts w:ascii="Consolas" w:hAnsi="Consolas"/>
+          <w:color w:val="202020"/>
+          <w:sz w:val="17"/>
+        </w:rPr>
+        <w:t>|         +--&gt; (Issue Cert)          +--&gt; (Rotate/Revoke)         +--&gt; (Trace      |</w:t>
+      </w:r>
+    </w:p>
+    <w:p>
+      <w:pPr>
+        <w:spacing w:before="0" w:after="0" w:line="240" w:lineRule="auto"/>
+        <w:ind w:left="288"/>
+      </w:pPr>
+      <w:r>
+        <w:rPr>
+          <w:rFonts w:ascii="Consolas" w:hAnsi="Consolas"/>
+          <w:color w:val="202020"/>
+          <w:sz w:val="17"/>
+        </w:rPr>
+        <w:t>|                                                                        Backward) |</w:t>
+      </w:r>
+    </w:p>
+    <w:p>
+      <w:pPr>
+        <w:spacing w:before="0" w:after="0" w:line="240" w:lineRule="auto"/>
+        <w:ind w:left="288"/>
+      </w:pPr>
+      <w:r>
+        <w:rPr>
+          <w:rFonts w:ascii="Consolas" w:hAnsi="Consolas"/>
+          <w:color w:val="202020"/>
+          <w:sz w:val="17"/>
+        </w:rPr>
+        <w:t>+----------------------------------------------------------------------------------+</w:t>
+      </w:r>
+    </w:p>
+    <w:p>
+      <w:pPr>
+        <w:spacing w:before="0" w:after="0" w:line="240" w:lineRule="auto"/>
+        <w:ind w:left="288"/>
+      </w:pPr>
+      <w:r>
+        <w:rPr>
+          <w:rFonts w:ascii="Consolas" w:hAnsi="Consolas"/>
+          <w:color w:val="202020"/>
+          <w:sz w:val="17"/>
+        </w:rPr>
+        <w:t xml:space="preserve"> </w:t>
+      </w:r>
+    </w:p>
+    <w:p>
+      <w:pPr>
+        <w:spacing w:before="0" w:after="0" w:line="240" w:lineRule="auto"/>
+        <w:ind w:left="288"/>
+      </w:pPr>
+      <w:r>
+        <w:rPr>
+          <w:rFonts w:ascii="Consolas" w:hAnsi="Consolas"/>
+          <w:color w:val="202020"/>
+          <w:sz w:val="17"/>
+        </w:rPr>
+        <w:t xml:space="preserve">   ACTORS (Left side)                          ACTORS (Right side)</w:t>
+      </w:r>
+    </w:p>
+    <w:p>
+      <w:pPr>
+        <w:spacing w:before="0" w:after="0" w:line="240" w:lineRule="auto"/>
+        <w:ind w:left="288"/>
+      </w:pPr>
+      <w:r>
+        <w:rPr>
+          <w:rFonts w:ascii="Consolas" w:hAnsi="Consolas"/>
+          <w:color w:val="202020"/>
+          <w:sz w:val="17"/>
+        </w:rPr>
+        <w:t xml:space="preserve">   ------------------                          -------------------</w:t>
+      </w:r>
+    </w:p>
+    <w:p>
+      <w:pPr>
+        <w:spacing w:before="0" w:after="0" w:line="240" w:lineRule="auto"/>
+        <w:ind w:left="288"/>
+      </w:pPr>
+      <w:r>
+        <w:rPr>
+          <w:rFonts w:ascii="Consolas" w:hAnsi="Consolas"/>
+          <w:color w:val="202020"/>
+          <w:sz w:val="17"/>
+        </w:rPr>
+        <w:t xml:space="preserve">      (Manufacturer) ----------------------------&gt; Register Product</w:t>
+      </w:r>
+    </w:p>
+    <w:p>
+      <w:pPr>
+        <w:spacing w:before="0" w:after="0" w:line="240" w:lineRule="auto"/>
+        <w:ind w:left="288"/>
+      </w:pPr>
+      <w:r>
+        <w:rPr>
+          <w:rFonts w:ascii="Consolas" w:hAnsi="Consolas"/>
+          <w:color w:val="202020"/>
+          <w:sz w:val="17"/>
+        </w:rPr>
+        <w:t xml:space="preserve">                                                -&gt; Create Shipment</w:t>
+      </w:r>
+    </w:p>
+    <w:p>
+      <w:pPr>
+        <w:spacing w:before="0" w:after="0" w:line="240" w:lineRule="auto"/>
+        <w:ind w:left="288"/>
+      </w:pPr>
+      <w:r>
+        <w:rPr>
+          <w:rFonts w:ascii="Consolas" w:hAnsi="Consolas"/>
+          <w:color w:val="202020"/>
+          <w:sz w:val="17"/>
+        </w:rPr>
+        <w:t xml:space="preserve">                                                -&gt; Trigger Recall</w:t>
+      </w:r>
+    </w:p>
+    <w:p>
+      <w:pPr>
+        <w:spacing w:before="0" w:after="0" w:line="240" w:lineRule="auto"/>
+        <w:ind w:left="288"/>
+      </w:pPr>
+      <w:r>
+        <w:rPr>
+          <w:rFonts w:ascii="Consolas" w:hAnsi="Consolas"/>
+          <w:color w:val="202020"/>
+          <w:sz w:val="17"/>
+        </w:rPr>
+        <w:t xml:space="preserve"> </w:t>
+      </w:r>
+    </w:p>
+    <w:p>
+      <w:pPr>
+        <w:spacing w:before="0" w:after="0" w:line="240" w:lineRule="auto"/>
+        <w:ind w:left="288"/>
+      </w:pPr>
+      <w:r>
+        <w:rPr>
+          <w:rFonts w:ascii="Consolas" w:hAnsi="Consolas"/>
+          <w:color w:val="202020"/>
+          <w:sz w:val="17"/>
+        </w:rPr>
+        <w:t xml:space="preserve">      (Distributor) -----------------------------&gt; Create Shipment</w:t>
+      </w:r>
+    </w:p>
+    <w:p>
+      <w:pPr>
+        <w:spacing w:before="0" w:after="0" w:line="240" w:lineRule="auto"/>
+        <w:ind w:left="288"/>
+      </w:pPr>
+      <w:r>
+        <w:rPr>
+          <w:rFonts w:ascii="Consolas" w:hAnsi="Consolas"/>
+          <w:color w:val="202020"/>
+          <w:sz w:val="17"/>
+        </w:rPr>
+        <w:t xml:space="preserve">                                                -&gt; Transfer Ownership</w:t>
+      </w:r>
+    </w:p>
+    <w:p>
+      <w:pPr>
+        <w:spacing w:before="0" w:after="0" w:line="240" w:lineRule="auto"/>
+        <w:ind w:left="288"/>
+      </w:pPr>
+      <w:r>
+        <w:rPr>
+          <w:rFonts w:ascii="Consolas" w:hAnsi="Consolas"/>
+          <w:color w:val="202020"/>
+          <w:sz w:val="17"/>
+        </w:rPr>
+        <w:t xml:space="preserve">                                                -&gt; Raise Dispute</w:t>
+      </w:r>
+    </w:p>
+    <w:p>
+      <w:pPr>
+        <w:spacing w:before="0" w:after="0" w:line="240" w:lineRule="auto"/>
+        <w:ind w:left="288"/>
+      </w:pPr>
+      <w:r>
+        <w:rPr>
+          <w:rFonts w:ascii="Consolas" w:hAnsi="Consolas"/>
+          <w:color w:val="202020"/>
+          <w:sz w:val="17"/>
+        </w:rPr>
+        <w:t xml:space="preserve"> </w:t>
+      </w:r>
+    </w:p>
+    <w:p>
+      <w:pPr>
+        <w:spacing w:before="0" w:after="0" w:line="240" w:lineRule="auto"/>
+        <w:ind w:left="288"/>
+      </w:pPr>
+      <w:r>
+        <w:rPr>
+          <w:rFonts w:ascii="Consolas" w:hAnsi="Consolas"/>
+          <w:color w:val="202020"/>
+          <w:sz w:val="17"/>
+        </w:rPr>
+        <w:t xml:space="preserve">      (Warehouse) -------------------------------&gt; Confirm Warehouse Receipt</w:t>
+      </w:r>
+    </w:p>
+    <w:p>
+      <w:pPr>
+        <w:spacing w:before="0" w:after="0" w:line="240" w:lineRule="auto"/>
+        <w:ind w:left="288"/>
+      </w:pPr>
+      <w:r>
+        <w:rPr>
+          <w:rFonts w:ascii="Consolas" w:hAnsi="Consolas"/>
+          <w:color w:val="202020"/>
+          <w:sz w:val="17"/>
+        </w:rPr>
+        <w:t xml:space="preserve"> </w:t>
+      </w:r>
+    </w:p>
+    <w:p>
+      <w:pPr>
+        <w:spacing w:before="0" w:after="0" w:line="240" w:lineRule="auto"/>
+        <w:ind w:left="288"/>
+      </w:pPr>
+      <w:r>
+        <w:rPr>
+          <w:rFonts w:ascii="Consolas" w:hAnsi="Consolas"/>
+          <w:color w:val="202020"/>
+          <w:sz w:val="17"/>
+        </w:rPr>
+        <w:t xml:space="preserve">      (Retailer) --------------------------------&gt; Confirm Delivery</w:t>
+      </w:r>
+    </w:p>
+    <w:p>
+      <w:pPr>
+        <w:spacing w:before="0" w:after="0" w:line="240" w:lineRule="auto"/>
+        <w:ind w:left="288"/>
+      </w:pPr>
+      <w:r>
+        <w:rPr>
+          <w:rFonts w:ascii="Consolas" w:hAnsi="Consolas"/>
+          <w:color w:val="202020"/>
+          <w:sz w:val="17"/>
+        </w:rPr>
+        <w:t xml:space="preserve">                                                -&gt; Transfer Ownership</w:t>
+      </w:r>
+    </w:p>
+    <w:p>
+      <w:pPr>
+        <w:spacing w:before="0" w:after="0" w:line="240" w:lineRule="auto"/>
+        <w:ind w:left="288"/>
+      </w:pPr>
+      <w:r>
+        <w:rPr>
+          <w:rFonts w:ascii="Consolas" w:hAnsi="Consolas"/>
+          <w:color w:val="202020"/>
+          <w:sz w:val="17"/>
+        </w:rPr>
+        <w:t xml:space="preserve"> </w:t>
+      </w:r>
+    </w:p>
+    <w:p>
+      <w:pPr>
+        <w:spacing w:before="0" w:after="0" w:line="240" w:lineRule="auto"/>
+        <w:ind w:left="288"/>
+      </w:pPr>
+      <w:r>
+        <w:rPr>
+          <w:rFonts w:ascii="Consolas" w:hAnsi="Consolas"/>
+          <w:color w:val="202020"/>
+          <w:sz w:val="17"/>
+        </w:rPr>
+        <w:t xml:space="preserve">      (Customer) --------------------------------&gt; Verify Product Authenticity</w:t>
+      </w:r>
+    </w:p>
+    <w:p>
+      <w:pPr>
+        <w:spacing w:before="0" w:after="0" w:line="240" w:lineRule="auto"/>
+        <w:ind w:left="288"/>
+      </w:pPr>
+      <w:r>
+        <w:rPr>
+          <w:rFonts w:ascii="Consolas" w:hAnsi="Consolas"/>
+          <w:color w:val="202020"/>
+          <w:sz w:val="17"/>
+        </w:rPr>
+        <w:t xml:space="preserve">                                                ---------------------------------</w:t>
+      </w:r>
+    </w:p>
+    <w:p>
+      <w:pPr>
+        <w:spacing w:before="0" w:after="0" w:line="240" w:lineRule="auto"/>
+        <w:ind w:left="288"/>
+      </w:pPr>
+      <w:r>
+        <w:rPr>
+          <w:rFonts w:ascii="Consolas" w:hAnsi="Consolas"/>
+          <w:color w:val="202020"/>
+          <w:sz w:val="17"/>
+        </w:rPr>
+        <w:t xml:space="preserve">                                                                                 |</w:t>
+      </w:r>
+    </w:p>
+    <w:p>
+      <w:pPr>
+        <w:spacing w:before="0" w:after="0" w:line="240" w:lineRule="auto"/>
+        <w:ind w:left="288"/>
+      </w:pPr>
+      <w:r>
+        <w:rPr>
+          <w:rFonts w:ascii="Consolas" w:hAnsi="Consolas"/>
+          <w:color w:val="202020"/>
+          <w:sz w:val="17"/>
+        </w:rPr>
+        <w:t xml:space="preserve">      (Auditor) ------------------------------------ View Audit Trail &lt;----------+</w:t>
+      </w:r>
+    </w:p>
+    <w:p>
+      <w:pPr>
+        <w:spacing w:before="0" w:after="0" w:line="240" w:lineRule="auto"/>
+        <w:ind w:left="288"/>
+      </w:pPr>
+      <w:r>
+        <w:rPr>
+          <w:rFonts w:ascii="Consolas" w:hAnsi="Consolas"/>
+          <w:color w:val="202020"/>
+          <w:sz w:val="17"/>
+        </w:rPr>
+        <w:t xml:space="preserve">                                                -&gt; Trigger Recall</w:t>
+      </w:r>
+    </w:p>
+    <w:p>
+      <w:pPr>
+        <w:spacing w:before="0" w:after="0" w:line="240" w:lineRule="auto"/>
+        <w:ind w:left="288"/>
+      </w:pPr>
+      <w:r>
+        <w:rPr>
+          <w:rFonts w:ascii="Consolas" w:hAnsi="Consolas"/>
+          <w:color w:val="202020"/>
+          <w:sz w:val="17"/>
+        </w:rPr>
+        <w:t xml:space="preserve"> </w:t>
+      </w:r>
+    </w:p>
+    <w:p>
+      <w:pPr>
+        <w:spacing w:before="0" w:after="0" w:line="240" w:lineRule="auto"/>
+        <w:ind w:left="288"/>
+      </w:pPr>
+      <w:r>
+        <w:rPr>
+          <w:rFonts w:ascii="Consolas" w:hAnsi="Consolas"/>
+          <w:color w:val="202020"/>
+          <w:sz w:val="17"/>
+        </w:rPr>
+        <w:t xml:space="preserve">      (Admin) -------------------------------------&gt; Onboard Organization</w:t>
+      </w:r>
+    </w:p>
+    <w:p>
+      <w:pPr>
+        <w:spacing w:before="0" w:after="0" w:line="240" w:lineRule="auto"/>
+        <w:ind w:left="288"/>
+      </w:pPr>
+      <w:r>
+        <w:rPr>
+          <w:rFonts w:ascii="Consolas" w:hAnsi="Consolas"/>
+          <w:color w:val="202020"/>
+          <w:sz w:val="17"/>
+        </w:rPr>
+        <w:t xml:space="preserve">                                                -&gt; Manage Keys</w:t>
+      </w:r>
+    </w:p>
+    <w:p>
+      <w:pPr>
+        <w:spacing w:before="0" w:after="0" w:line="240" w:lineRule="auto"/>
+        <w:ind w:left="288"/>
+      </w:pPr>
+      <w:r>
+        <w:rPr>
+          <w:rFonts w:ascii="Consolas" w:hAnsi="Consolas"/>
+          <w:color w:val="202020"/>
+          <w:sz w:val="17"/>
+        </w:rPr>
+        <w:t xml:space="preserve"> </w:t>
+      </w:r>
+    </w:p>
+    <w:p>
+      <w:pPr>
+        <w:spacing w:before="0" w:after="0" w:line="240" w:lineRule="auto"/>
+        <w:ind w:left="288"/>
+      </w:pPr>
+      <w:r>
+        <w:rPr>
+          <w:rFonts w:ascii="Consolas" w:hAnsi="Consolas"/>
+          <w:color w:val="202020"/>
+          <w:sz w:val="17"/>
+        </w:rPr>
+        <w:t xml:space="preserve">      (Security Officer) --------------------------&gt; Monitor Anomalies (ledger +</w:t>
+      </w:r>
+    </w:p>
+    <w:p>
+      <w:pPr>
+        <w:spacing w:before="0" w:after="0" w:line="240" w:lineRule="auto"/>
+        <w:ind w:left="288"/>
+      </w:pPr>
+      <w:r>
+        <w:rPr>
+          <w:rFonts w:ascii="Consolas" w:hAnsi="Consolas"/>
+          <w:color w:val="202020"/>
+          <w:sz w:val="17"/>
+        </w:rPr>
+        <w:t xml:space="preserve">                                                     audit alerts)</w:t>
+      </w:r>
+    </w:p>
+    <w:p>
+      <w:pPr>
+        <w:spacing w:before="0" w:after="0" w:line="240" w:lineRule="auto"/>
+        <w:ind w:left="288"/>
+      </w:pPr>
+      <w:r>
+        <w:rPr>
+          <w:rFonts w:ascii="Consolas" w:hAnsi="Consolas"/>
+          <w:color w:val="202020"/>
+          <w:sz w:val="17"/>
+        </w:rPr>
+        <w:t xml:space="preserve"> </w:t>
+      </w:r>
+    </w:p>
+    <w:p>
+      <w:pPr>
+        <w:spacing w:before="0" w:after="0" w:line="240" w:lineRule="auto"/>
+        <w:ind w:left="288"/>
+      </w:pPr>
+      <w:r>
+        <w:rPr>
+          <w:rFonts w:ascii="Consolas" w:hAnsi="Consolas"/>
+          <w:color w:val="202020"/>
+          <w:sz w:val="17"/>
+        </w:rPr>
+        <w:t xml:space="preserve">   LEGEND</w:t>
+      </w:r>
+    </w:p>
+    <w:p>
+      <w:pPr>
+        <w:spacing w:before="0" w:after="0" w:line="240" w:lineRule="auto"/>
+        <w:ind w:left="288"/>
+      </w:pPr>
+      <w:r>
+        <w:rPr>
+          <w:rFonts w:ascii="Consolas" w:hAnsi="Consolas"/>
+          <w:color w:val="202020"/>
+          <w:sz w:val="17"/>
+        </w:rPr>
+        <w:t xml:space="preserve">   ------</w:t>
+      </w:r>
+    </w:p>
+    <w:p>
+      <w:pPr>
+        <w:spacing w:before="0" w:after="0" w:line="240" w:lineRule="auto"/>
+        <w:ind w:left="288"/>
+      </w:pPr>
+      <w:r>
+        <w:rPr>
+          <w:rFonts w:ascii="Consolas" w:hAnsi="Consolas"/>
+          <w:color w:val="202020"/>
+          <w:sz w:val="17"/>
+        </w:rPr>
+        <w:t xml:space="preserve">   ( ... )        = Use Case (oval in formal UML)</w:t>
+      </w:r>
+    </w:p>
+    <w:p>
+      <w:pPr>
+        <w:spacing w:before="0" w:after="0" w:line="240" w:lineRule="auto"/>
+        <w:ind w:left="288"/>
+      </w:pPr>
+      <w:r>
+        <w:rPr>
+          <w:rFonts w:ascii="Consolas" w:hAnsi="Consolas"/>
+          <w:color w:val="202020"/>
+          <w:sz w:val="17"/>
+        </w:rPr>
+        <w:t xml:space="preserve">   &lt;&lt;include&gt;&gt;    = mandatory sub-use case</w:t>
+      </w:r>
+    </w:p>
+    <w:p>
+      <w:pPr>
+        <w:spacing w:before="0" w:after="0" w:line="240" w:lineRule="auto"/>
+        <w:ind w:left="288"/>
+      </w:pPr>
+      <w:r>
+        <w:rPr>
+          <w:rFonts w:ascii="Consolas" w:hAnsi="Consolas"/>
+          <w:color w:val="202020"/>
+          <w:sz w:val="17"/>
+        </w:rPr>
+        <w:t xml:space="preserve">   &lt;&lt;extend&gt;&gt;     = optional/conditional sub-use case</w:t>
+      </w:r>
+    </w:p>
+    <w:p>
+      <w:pPr>
+        <w:spacing w:before="0" w:after="0" w:line="240" w:lineRule="auto"/>
+        <w:ind w:left="288"/>
+      </w:pPr>
+      <w:r>
+        <w:rPr>
+          <w:rFonts w:ascii="Consolas" w:hAnsi="Consolas"/>
+          <w:color w:val="202020"/>
+          <w:sz w:val="17"/>
+        </w:rPr>
+        <w:t xml:space="preserve">   -----&gt;         = association / flow</w:t>
+      </w:r>
+    </w:p>
+    <w:p>
+      <w:pPr>
+        <w:spacing w:before="0" w:after="0" w:line="240" w:lineRule="auto"/>
+        <w:ind w:left="288"/>
+      </w:pPr>
+      <w:r>
+        <w:rPr>
+          <w:rFonts w:ascii="Consolas" w:hAnsi="Consolas"/>
+          <w:color w:val="202020"/>
+          <w:sz w:val="17"/>
+        </w:rPr>
+        <w:t xml:space="preserve"> </w:t>
+      </w:r>
+    </w:p>
+    <w:p>
+      <w:pPr>
+        <w:spacing w:after="80"/>
+      </w:pPr>
+    </w:p>
+    <w:p>
+      <w:pPr>
+        <w:pStyle w:val="Heading3"/>
+        <w:spacing w:before="160" w:after="80"/>
+      </w:pPr>
+      <w:r>
+        <w:rPr>
+          <w:rFonts w:ascii="Calibri" w:hAnsi="Calibri"/>
+          <w:b/>
+          <w:color w:val="1F3A5F"/>
+          <w:sz w:val="25"/>
+        </w:rPr>
+        <w:t>3.1.1 Actors and Their Use Cases</w:t>
+      </w:r>
+    </w:p>
+    <w:tbl>
+      <w:tblPr>
+        <w:tblStyle w:val="TableGrid"/>
+        <w:tblW w:type="auto" w:w="0"/>
+        <w:jc w:val="center"/>
+        <w:tblLayout w:type="autofit"/>
+        <w:tblLook w:firstColumn="1" w:firstRow="1" w:lastColumn="0" w:lastRow="0" w:noHBand="0" w:noVBand="1" w:val="04A0"/>
+      </w:tblPr>
+      <w:tblGrid>
+        <w:gridCol w:w="4873"/>
+        <w:gridCol w:w="4873"/>
+      </w:tblGrid>
+      <w:tr>
+        <w:tc>
+          <w:tcPr>
+            <w:tcW w:type="dxa" w:w="4873"/>
+            <w:vAlign w:val="center"/>
+            <w:shd w:val="clear" w:color="auto" w:fill="1F3A5F"/>
+          </w:tcPr>
+          <w:p>
+            <w:r>
+              <w:rPr>
+                <w:b/>
+                <w:color w:val="FFFFFF"/>
+                <w:sz w:val="21"/>
+              </w:rPr>
+              <w:t>Actor</w:t>
+            </w:r>
+          </w:p>
+        </w:tc>
+        <w:tc>
+          <w:tcPr>
+            <w:tcW w:type="dxa" w:w="4873"/>
+            <w:vAlign w:val="center"/>
+            <w:shd w:val="clear" w:color="auto" w:fill="1F3A5F"/>
+          </w:tcPr>
+          <w:p>
+            <w:r>
+              <w:rPr>
+                <w:b/>
+                <w:color w:val="FFFFFF"/>
+                <w:sz w:val="21"/>
+              </w:rPr>
+              <w:t>Use Cases</w:t>
+            </w:r>
+          </w:p>
+        </w:tc>
+      </w:tr>
+      <w:tr>
+        <w:tc>
+          <w:tcPr>
+            <w:tcW w:type="dxa" w:w="4873"/>
+            <w:vAlign w:val="center"/>
+          </w:tcPr>
+          <w:p>
+            <w:r>
+              <w:t>Manufacturer</w:t>
+            </w:r>
+          </w:p>
+        </w:tc>
+        <w:tc>
+          <w:tcPr>
+            <w:tcW w:type="dxa" w:w="4873"/>
+            <w:vAlign w:val="center"/>
+          </w:tcPr>
+          <w:p>
+            <w:r>
+              <w:t>Register Product, Create Shipment, Trigger Recall</w:t>
+            </w:r>
+          </w:p>
+        </w:tc>
+      </w:tr>
+      <w:tr>
+        <w:tc>
+          <w:tcPr>
+            <w:tcW w:type="dxa" w:w="4873"/>
+            <w:vAlign w:val="center"/>
+            <w:shd w:val="clear" w:color="auto" w:fill="F7FAFD"/>
+          </w:tcPr>
+          <w:p>
+            <w:r>
+              <w:t>Distributor</w:t>
+            </w:r>
+          </w:p>
+        </w:tc>
+        <w:tc>
+          <w:tcPr>
+            <w:tcW w:type="dxa" w:w="4873"/>
+            <w:vAlign w:val="center"/>
+            <w:shd w:val="clear" w:color="auto" w:fill="F7FAFD"/>
+          </w:tcPr>
+          <w:p>
+            <w:r>
+              <w:t>Create Shipment, Transfer Ownership, Raise Dispute</w:t>
+            </w:r>
+          </w:p>
+        </w:tc>
+      </w:tr>
+      <w:tr>
+        <w:tc>
+          <w:tcPr>
+            <w:tcW w:type="dxa" w:w="4873"/>
+            <w:vAlign w:val="center"/>
+          </w:tcPr>
+          <w:p>
+            <w:r>
+              <w:t>Warehouse</w:t>
+            </w:r>
+          </w:p>
+        </w:tc>
+        <w:tc>
+          <w:tcPr>
+            <w:tcW w:type="dxa" w:w="4873"/>
+            <w:vAlign w:val="center"/>
+          </w:tcPr>
+          <w:p>
+            <w:r>
+              <w:t>Confirm Warehouse Receipt</w:t>
+            </w:r>
+          </w:p>
+        </w:tc>
+      </w:tr>
+      <w:tr>
+        <w:tc>
+          <w:tcPr>
+            <w:tcW w:type="dxa" w:w="4873"/>
+            <w:vAlign w:val="center"/>
+            <w:shd w:val="clear" w:color="auto" w:fill="F7FAFD"/>
+          </w:tcPr>
+          <w:p>
+            <w:r>
+              <w:t>Retailer</w:t>
+            </w:r>
+          </w:p>
+        </w:tc>
+        <w:tc>
+          <w:tcPr>
+            <w:tcW w:type="dxa" w:w="4873"/>
+            <w:vAlign w:val="center"/>
+            <w:shd w:val="clear" w:color="auto" w:fill="F7FAFD"/>
+          </w:tcPr>
+          <w:p>
+            <w:r>
+              <w:t>Confirm Delivery, Transfer Ownership</w:t>
+            </w:r>
+          </w:p>
+        </w:tc>
+      </w:tr>
+      <w:tr>
+        <w:tc>
+          <w:tcPr>
+            <w:tcW w:type="dxa" w:w="4873"/>
+            <w:vAlign w:val="center"/>
+          </w:tcPr>
+          <w:p>
+            <w:r>
+              <w:t>Customer</w:t>
+            </w:r>
+          </w:p>
+        </w:tc>
+        <w:tc>
+          <w:tcPr>
+            <w:tcW w:type="dxa" w:w="4873"/>
+            <w:vAlign w:val="center"/>
+          </w:tcPr>
+          <w:p>
+            <w:r>
+              <w:t>Verify Product Authenticity</w:t>
+            </w:r>
+          </w:p>
+        </w:tc>
+      </w:tr>
+      <w:tr>
+        <w:tc>
+          <w:tcPr>
+            <w:tcW w:type="dxa" w:w="4873"/>
+            <w:vAlign w:val="center"/>
+            <w:shd w:val="clear" w:color="auto" w:fill="F7FAFD"/>
+          </w:tcPr>
+          <w:p>
+            <w:r>
+              <w:t>Auditor</w:t>
+            </w:r>
+          </w:p>
+        </w:tc>
+        <w:tc>
+          <w:tcPr>
+            <w:tcW w:type="dxa" w:w="4873"/>
+            <w:vAlign w:val="center"/>
+            <w:shd w:val="clear" w:color="auto" w:fill="F7FAFD"/>
+          </w:tcPr>
+          <w:p>
+            <w:r>
+              <w:t>View Audit Trail, Trigger Recall</w:t>
+            </w:r>
+          </w:p>
+        </w:tc>
+      </w:tr>
+      <w:tr>
+        <w:tc>
+          <w:tcPr>
+            <w:tcW w:type="dxa" w:w="4873"/>
+            <w:vAlign w:val="center"/>
+          </w:tcPr>
+          <w:p>
+            <w:r>
+              <w:t>Admin</w:t>
+            </w:r>
+          </w:p>
+        </w:tc>
+        <w:tc>
+          <w:tcPr>
+            <w:tcW w:type="dxa" w:w="4873"/>
+            <w:vAlign w:val="center"/>
+          </w:tcPr>
+          <w:p>
+            <w:r>
+              <w:t>Onboard Organization, Manage Keys</w:t>
+            </w:r>
+          </w:p>
+        </w:tc>
+      </w:tr>
+      <w:tr>
+        <w:tc>
+          <w:tcPr>
+            <w:tcW w:type="dxa" w:w="4873"/>
+            <w:vAlign w:val="center"/>
+            <w:shd w:val="clear" w:color="auto" w:fill="F7FAFD"/>
+          </w:tcPr>
+          <w:p>
+            <w:r>
+              <w:t>Security Officer</w:t>
+            </w:r>
+          </w:p>
+        </w:tc>
+        <w:tc>
+          <w:tcPr>
+            <w:tcW w:type="dxa" w:w="4873"/>
+            <w:vAlign w:val="center"/>
+            <w:shd w:val="clear" w:color="auto" w:fill="F7FAFD"/>
+          </w:tcPr>
+          <w:p>
+            <w:r>
+              <w:t>Monitor Anomalies</w:t>
+            </w:r>
+          </w:p>
+        </w:tc>
+      </w:tr>
+    </w:tbl>
+    <w:p>
+      <w:pPr>
+        <w:pStyle w:val="Heading3"/>
+        <w:spacing w:before="160" w:after="80"/>
+      </w:pPr>
+      <w:r>
+        <w:rPr>
+          <w:rFonts w:ascii="Calibri" w:hAnsi="Calibri"/>
+          <w:b/>
+          <w:color w:val="1F3A5F"/>
+          <w:sz w:val="25"/>
+        </w:rPr>
+        <w:t>3.1.2 Include / Extend Relationships</w:t>
+      </w:r>
+    </w:p>
+    <w:tbl>
+      <w:tblPr>
+        <w:tblStyle w:val="TableGrid"/>
+        <w:tblW w:type="auto" w:w="0"/>
+        <w:jc w:val="center"/>
+        <w:tblLayout w:type="autofit"/>
+        <w:tblLook w:firstColumn="1" w:firstRow="1" w:lastColumn="0" w:lastRow="0" w:noHBand="0" w:noVBand="1" w:val="04A0"/>
+      </w:tblPr>
+      <w:tblGrid>
+        <w:gridCol w:w="3249"/>
+        <w:gridCol w:w="3249"/>
+        <w:gridCol w:w="3249"/>
+      </w:tblGrid>
+      <w:tr>
+        <w:tc>
+          <w:tcPr>
+            <w:tcW w:type="dxa" w:w="3249"/>
+            <w:vAlign w:val="center"/>
+            <w:shd w:val="clear" w:color="auto" w:fill="1F3A5F"/>
+          </w:tcPr>
+          <w:p>
+            <w:r>
+              <w:rPr>
+                <w:b/>
+                <w:color w:val="FFFFFF"/>
+                <w:sz w:val="21"/>
+              </w:rPr>
+              <w:t>Source Use Case</w:t>
+            </w:r>
+          </w:p>
+        </w:tc>
+        <w:tc>
+          <w:tcPr>
+            <w:tcW w:type="dxa" w:w="3249"/>
+            <w:vAlign w:val="center"/>
+            <w:shd w:val="clear" w:color="auto" w:fill="1F3A5F"/>
+          </w:tcPr>
+          <w:p>
+            <w:r>
+              <w:rPr>
+                <w:b/>
+                <w:color w:val="FFFFFF"/>
+                <w:sz w:val="21"/>
+              </w:rPr>
+              <w:t>Relationship</w:t>
+            </w:r>
+          </w:p>
+        </w:tc>
+        <w:tc>
+          <w:tcPr>
+            <w:tcW w:type="dxa" w:w="3249"/>
+            <w:vAlign w:val="center"/>
+            <w:shd w:val="clear" w:color="auto" w:fill="1F3A5F"/>
+          </w:tcPr>
+          <w:p>
+            <w:r>
+              <w:rPr>
+                <w:b/>
+                <w:color w:val="FFFFFF"/>
+                <w:sz w:val="21"/>
+              </w:rPr>
+              <w:t>Target Use Case</w:t>
+            </w:r>
+          </w:p>
+        </w:tc>
+      </w:tr>
+      <w:tr>
+        <w:tc>
+          <w:tcPr>
+            <w:tcW w:type="dxa" w:w="3249"/>
+            <w:vAlign w:val="center"/>
+          </w:tcPr>
+          <w:p>
+            <w:r>
+              <w:t>Create Shipment</w:t>
+            </w:r>
+          </w:p>
+        </w:tc>
+        <w:tc>
+          <w:tcPr>
+            <w:tcW w:type="dxa" w:w="3249"/>
+            <w:vAlign w:val="center"/>
+          </w:tcPr>
+          <w:p>
+            <w:r>
+              <w:t>&lt;&lt;include&gt;&gt;</w:t>
+            </w:r>
+          </w:p>
+        </w:tc>
+        <w:tc>
+          <w:tcPr>
+            <w:tcW w:type="dxa" w:w="3249"/>
+            <w:vAlign w:val="center"/>
+          </w:tcPr>
+          <w:p>
+            <w:r>
+              <w:t>Sign Transaction</w:t>
+            </w:r>
+          </w:p>
+        </w:tc>
+      </w:tr>
+      <w:tr>
+        <w:tc>
+          <w:tcPr>
+            <w:tcW w:type="dxa" w:w="3249"/>
+            <w:vAlign w:val="center"/>
+            <w:shd w:val="clear" w:color="auto" w:fill="F7FAFD"/>
+          </w:tcPr>
+          <w:p>
+            <w:r>
+              <w:t>Transfer Ownership</w:t>
+            </w:r>
+          </w:p>
+        </w:tc>
+        <w:tc>
+          <w:tcPr>
+            <w:tcW w:type="dxa" w:w="3249"/>
+            <w:vAlign w:val="center"/>
+            <w:shd w:val="clear" w:color="auto" w:fill="F7FAFD"/>
+          </w:tcPr>
+          <w:p>
+            <w:r>
+              <w:t>&lt;&lt;include&gt;&gt;</w:t>
+            </w:r>
+          </w:p>
+        </w:tc>
+        <w:tc>
+          <w:tcPr>
+            <w:tcW w:type="dxa" w:w="3249"/>
+            <w:vAlign w:val="center"/>
+            <w:shd w:val="clear" w:color="auto" w:fill="F7FAFD"/>
+          </w:tcPr>
+          <w:p>
+            <w:r>
+              <w:t>Sign Transaction</w:t>
+            </w:r>
+          </w:p>
+        </w:tc>
+      </w:tr>
+      <w:tr>
+        <w:tc>
+          <w:tcPr>
+            <w:tcW w:type="dxa" w:w="3249"/>
+            <w:vAlign w:val="center"/>
+          </w:tcPr>
+          <w:p>
+            <w:r>
+              <w:t>Any state change</w:t>
+            </w:r>
+          </w:p>
+        </w:tc>
+        <w:tc>
+          <w:tcPr>
+            <w:tcW w:type="dxa" w:w="3249"/>
+            <w:vAlign w:val="center"/>
+          </w:tcPr>
+          <w:p>
+            <w:r>
+              <w:t>&lt;&lt;include&gt;&gt;</w:t>
+            </w:r>
+          </w:p>
+        </w:tc>
+        <w:tc>
+          <w:tcPr>
+            <w:tcW w:type="dxa" w:w="3249"/>
+            <w:vAlign w:val="center"/>
+          </w:tcPr>
+          <w:p>
+            <w:r>
+              <w:t>Write Audit Log</w:t>
+            </w:r>
+          </w:p>
+        </w:tc>
+      </w:tr>
+      <w:tr>
+        <w:tc>
+          <w:tcPr>
+            <w:tcW w:type="dxa" w:w="3249"/>
+            <w:vAlign w:val="center"/>
+            <w:shd w:val="clear" w:color="auto" w:fill="F7FAFD"/>
+          </w:tcPr>
+          <w:p>
+            <w:r>
+              <w:t>Verify Authenticity</w:t>
+            </w:r>
+          </w:p>
+        </w:tc>
+        <w:tc>
+          <w:tcPr>
+            <w:tcW w:type="dxa" w:w="3249"/>
+            <w:vAlign w:val="center"/>
+            <w:shd w:val="clear" w:color="auto" w:fill="F7FAFD"/>
+          </w:tcPr>
+          <w:p>
+            <w:r>
+              <w:t>&lt;&lt;include&gt;&gt;</w:t>
+            </w:r>
+          </w:p>
+        </w:tc>
+        <w:tc>
+          <w:tcPr>
+            <w:tcW w:type="dxa" w:w="3249"/>
+            <w:vAlign w:val="center"/>
+            <w:shd w:val="clear" w:color="auto" w:fill="F7FAFD"/>
+          </w:tcPr>
+          <w:p>
+            <w:r>
+              <w:t>Query Ledger</w:t>
+            </w:r>
+          </w:p>
+        </w:tc>
+      </w:tr>
+      <w:tr>
+        <w:tc>
+          <w:tcPr>
+            <w:tcW w:type="dxa" w:w="3249"/>
+            <w:vAlign w:val="center"/>
+          </w:tcPr>
+          <w:p>
+            <w:r>
+              <w:t>View Audit Trail</w:t>
+            </w:r>
+          </w:p>
+        </w:tc>
+        <w:tc>
+          <w:tcPr>
+            <w:tcW w:type="dxa" w:w="3249"/>
+            <w:vAlign w:val="center"/>
+          </w:tcPr>
+          <w:p>
+            <w:r>
+              <w:t>&lt;&lt;include&gt;&gt;</w:t>
+            </w:r>
+          </w:p>
+        </w:tc>
+        <w:tc>
+          <w:tcPr>
+            <w:tcW w:type="dxa" w:w="3249"/>
+            <w:vAlign w:val="center"/>
+          </w:tcPr>
+          <w:p>
+            <w:r>
+              <w:t>Query Ledger</w:t>
+            </w:r>
+          </w:p>
+        </w:tc>
+      </w:tr>
+      <w:tr>
+        <w:tc>
+          <w:tcPr>
+            <w:tcW w:type="dxa" w:w="3249"/>
+            <w:vAlign w:val="center"/>
+            <w:shd w:val="clear" w:color="auto" w:fill="F7FAFD"/>
+          </w:tcPr>
+          <w:p>
+            <w:r>
+              <w:t>Transfer Ownership</w:t>
+            </w:r>
+          </w:p>
+        </w:tc>
+        <w:tc>
+          <w:tcPr>
+            <w:tcW w:type="dxa" w:w="3249"/>
+            <w:vAlign w:val="center"/>
+            <w:shd w:val="clear" w:color="auto" w:fill="F7FAFD"/>
+          </w:tcPr>
+          <w:p>
+            <w:r>
+              <w:t>&lt;&lt;extend&gt;&gt;</w:t>
+            </w:r>
+          </w:p>
+        </w:tc>
+        <w:tc>
+          <w:tcPr>
+            <w:tcW w:type="dxa" w:w="3249"/>
+            <w:vAlign w:val="center"/>
+            <w:shd w:val="clear" w:color="auto" w:fill="F7FAFD"/>
+          </w:tcPr>
+          <w:p>
+            <w:r>
+              <w:t>Raise Dispute (optional)</w:t>
+            </w:r>
+          </w:p>
+        </w:tc>
+      </w:tr>
+    </w:tbl>
+    <w:p>
+      <w:pPr>
+        <w:pStyle w:val="Heading2"/>
+        <w:spacing w:before="240" w:after="120"/>
+      </w:pPr>
+      <w:r>
+        <w:rPr>
+          <w:rFonts w:ascii="Calibri" w:hAnsi="Calibri"/>
+          <w:b/>
+          <w:color w:val="2E74B5"/>
+          <w:sz w:val="30"/>
+        </w:rPr>
+        <w:t>3.2 Use Case Specification 1 - Transfer Ownership</w:t>
+      </w:r>
+    </w:p>
+    <w:tbl>
+      <w:tblPr>
+        <w:tblStyle w:val="TableGrid"/>
+        <w:tblW w:type="auto" w:w="0"/>
+        <w:jc w:val="center"/>
+        <w:tblLayout w:type="autofit"/>
+        <w:tblLook w:firstColumn="1" w:firstRow="1" w:lastColumn="0" w:lastRow="0" w:noHBand="0" w:noVBand="1" w:val="04A0"/>
+      </w:tblPr>
+      <w:tblGrid>
+        <w:gridCol w:w="4873"/>
+        <w:gridCol w:w="4873"/>
+      </w:tblGrid>
+      <w:tr>
+        <w:tc>
+          <w:tcPr>
+            <w:tcW w:type="dxa" w:w="4873"/>
+            <w:vAlign w:val="center"/>
+            <w:shd w:val="clear" w:color="auto" w:fill="F7FAFD"/>
+          </w:tcPr>
+          <w:p>
+            <w:r>
+              <w:rPr>
+                <w:b/>
+              </w:rPr>
+              <w:t>Use Case ID</w:t>
+            </w:r>
+          </w:p>
+        </w:tc>
+        <w:tc>
+          <w:tcPr>
+            <w:tcW w:type="dxa" w:w="4873"/>
+            <w:vAlign w:val="center"/>
+            <w:shd w:val="clear" w:color="auto" w:fill="F7FAFD"/>
+          </w:tcPr>
+          <w:p>
+            <w:r>
+              <w:t>UC-04</w:t>
+            </w:r>
+          </w:p>
+        </w:tc>
+      </w:tr>
+      <w:tr>
+        <w:tc>
+          <w:tcPr>
+            <w:tcW w:type="dxa" w:w="4873"/>
+            <w:vAlign w:val="center"/>
+          </w:tcPr>
+          <w:p>
+            <w:r>
+              <w:rPr>
+                <w:b/>
+              </w:rPr>
+              <w:t>Name</w:t>
+            </w:r>
+          </w:p>
+        </w:tc>
+        <w:tc>
+          <w:tcPr>
+            <w:tcW w:type="dxa" w:w="4873"/>
+            <w:vAlign w:val="center"/>
+          </w:tcPr>
+          <w:p>
+            <w:r>
+              <w:t>Transfer Ownership</w:t>
+            </w:r>
+          </w:p>
+        </w:tc>
+      </w:tr>
+      <w:tr>
+        <w:tc>
+          <w:tcPr>
+            <w:tcW w:type="dxa" w:w="4873"/>
+            <w:vAlign w:val="center"/>
+            <w:shd w:val="clear" w:color="auto" w:fill="F7FAFD"/>
+          </w:tcPr>
+          <w:p>
+            <w:r>
+              <w:rPr>
+                <w:b/>
+              </w:rPr>
+              <w:t>Actor</w:t>
+            </w:r>
+          </w:p>
+        </w:tc>
+        <w:tc>
+          <w:tcPr>
+            <w:tcW w:type="dxa" w:w="4873"/>
+            <w:vAlign w:val="center"/>
+            <w:shd w:val="clear" w:color="auto" w:fill="F7FAFD"/>
+          </w:tcPr>
+          <w:p>
+            <w:r>
+              <w:t>Distributor (current owner)</w:t>
+            </w:r>
+          </w:p>
+        </w:tc>
+      </w:tr>
+      <w:tr>
+        <w:tc>
+          <w:tcPr>
+            <w:tcW w:type="dxa" w:w="4873"/>
+            <w:vAlign w:val="center"/>
+          </w:tcPr>
+          <w:p>
+            <w:r>
+              <w:rPr>
+                <w:b/>
+              </w:rPr>
+              <w:t>Precondition</w:t>
+            </w:r>
+          </w:p>
+        </w:tc>
+        <w:tc>
+          <w:tcPr>
+            <w:tcW w:type="dxa" w:w="4873"/>
+            <w:vAlign w:val="center"/>
+          </w:tcPr>
+          <w:p>
+            <w:r>
+              <w:t>Product exists; actor authenticated via mTLS + MFA; actor holds current ownership; HSM-backed private key available.</w:t>
+            </w:r>
+          </w:p>
+        </w:tc>
+      </w:tr>
+      <w:tr>
+        <w:tc>
+          <w:tcPr>
+            <w:tcW w:type="dxa" w:w="4873"/>
+            <w:vAlign w:val="center"/>
+            <w:shd w:val="clear" w:color="auto" w:fill="F7FAFD"/>
+          </w:tcPr>
+          <w:p>
+            <w:r>
+              <w:rPr>
+                <w:b/>
+              </w:rPr>
+              <w:t>Main Flow</w:t>
+            </w:r>
+          </w:p>
+        </w:tc>
+        <w:tc>
+          <w:tcPr>
+            <w:tcW w:type="dxa" w:w="4873"/>
+            <w:vAlign w:val="center"/>
+            <w:shd w:val="clear" w:color="auto" w:fill="F7FAFD"/>
+          </w:tcPr>
+          <w:p>
+            <w:r>
+              <w:t>1. Actor selects product.</w:t>
+              <w:br/>
+              <w:t>2. Actor enters target organization.</w:t>
+              <w:br/>
+              <w:t>3. System verifies RBAC (role) + ABAC (organization).</w:t>
+              <w:br/>
+              <w:t>4. Actor signs transfer payload with private key.</w:t>
+              <w:br/>
+              <w:t>5. System verifies signature + nonce + timestamp.</w:t>
+              <w:br/>
+              <w:t>6. System writes append-only audit log entry.</w:t>
+              <w:br/>
+              <w:t>7. System updates ownership on ledger (hash-chained).</w:t>
+              <w:br/>
+              <w:t>8. System returns confirmation with tx_hash.</w:t>
+            </w:r>
+          </w:p>
+        </w:tc>
+      </w:tr>
+      <w:tr>
+        <w:tc>
+          <w:tcPr>
+            <w:tcW w:type="dxa" w:w="4873"/>
+            <w:vAlign w:val="center"/>
+          </w:tcPr>
+          <w:p>
+            <w:r>
+              <w:rPr>
+                <w:b/>
+              </w:rPr>
+              <w:t>Alternative Flow 3a</w:t>
+            </w:r>
+          </w:p>
+        </w:tc>
+        <w:tc>
+          <w:tcPr>
+            <w:tcW w:type="dxa" w:w="4873"/>
+            <w:vAlign w:val="center"/>
+          </w:tcPr>
+          <w:p>
+            <w:r>
+              <w:t>Actor not authorized -&gt; reject 403, log attempt, alert Security Officer.</w:t>
+            </w:r>
+          </w:p>
+        </w:tc>
+      </w:tr>
+      <w:tr>
+        <w:tc>
+          <w:tcPr>
+            <w:tcW w:type="dxa" w:w="4873"/>
+            <w:vAlign w:val="center"/>
+            <w:shd w:val="clear" w:color="auto" w:fill="F7FAFD"/>
+          </w:tcPr>
+          <w:p>
+            <w:r>
+              <w:rPr>
+                <w:b/>
+              </w:rPr>
+              <w:t>Alternative Flow 5a</w:t>
+            </w:r>
+          </w:p>
+        </w:tc>
+        <w:tc>
+          <w:tcPr>
+            <w:tcW w:type="dxa" w:w="4873"/>
+            <w:vAlign w:val="center"/>
+            <w:shd w:val="clear" w:color="auto" w:fill="F7FAFD"/>
+          </w:tcPr>
+          <w:p>
+            <w:r>
+              <w:t>Signature invalid OR nonce reused -&gt; abort transfer, alert, log.</w:t>
+            </w:r>
+          </w:p>
+        </w:tc>
+      </w:tr>
+      <w:tr>
+        <w:tc>
+          <w:tcPr>
+            <w:tcW w:type="dxa" w:w="4873"/>
+            <w:vAlign w:val="center"/>
+          </w:tcPr>
+          <w:p>
+            <w:r>
+              <w:rPr>
+                <w:b/>
+              </w:rPr>
+              <w:t>Exception Flow 7a</w:t>
+            </w:r>
+          </w:p>
+        </w:tc>
+        <w:tc>
+          <w:tcPr>
+            <w:tcW w:type="dxa" w:w="4873"/>
+            <w:vAlign w:val="center"/>
+          </w:tcPr>
+          <w:p>
+            <w:r>
+              <w:t>Ledger write fails -&gt; rollback DB transaction, retry with backoff.</w:t>
+            </w:r>
+          </w:p>
+        </w:tc>
+      </w:tr>
+      <w:tr>
+        <w:tc>
+          <w:tcPr>
+            <w:tcW w:type="dxa" w:w="4873"/>
+            <w:vAlign w:val="center"/>
+            <w:shd w:val="clear" w:color="auto" w:fill="F7FAFD"/>
+          </w:tcPr>
+          <w:p>
+            <w:r>
+              <w:rPr>
+                <w:b/>
+              </w:rPr>
+              <w:t>Postcondition</w:t>
+            </w:r>
+          </w:p>
+        </w:tc>
+        <w:tc>
+          <w:tcPr>
+            <w:tcW w:type="dxa" w:w="4873"/>
+            <w:vAlign w:val="center"/>
+            <w:shd w:val="clear" w:color="auto" w:fill="F7FAFD"/>
+          </w:tcPr>
+          <w:p>
+            <w:r>
+              <w:t>Ownership transferred atomically; immutable ledger entry with tx_hash; audit record created; notifications sent.</w:t>
+            </w:r>
+          </w:p>
+        </w:tc>
+      </w:tr>
+      <w:tr>
+        <w:tc>
+          <w:tcPr>
+            <w:tcW w:type="dxa" w:w="4873"/>
+            <w:vAlign w:val="center"/>
+          </w:tcPr>
+          <w:p>
+            <w:r>
+              <w:rPr>
+                <w:b/>
+              </w:rPr>
+              <w:t>Security Requirements</w:t>
+            </w:r>
+          </w:p>
+        </w:tc>
+        <w:tc>
+          <w:tcPr>
+            <w:tcW w:type="dxa" w:w="4873"/>
+            <w:vAlign w:val="center"/>
+          </w:tcPr>
+          <w:p>
+            <w:r>
+              <w:t>SR-03 (signature + hash chain), SR-05 (nonce), SR-06/07 (RBAC+ABAC), SR-10 (audit), SR-12 (non-repudiation).</w:t>
+            </w:r>
+          </w:p>
+        </w:tc>
+      </w:tr>
+    </w:tbl>
+    <w:p>
+      <w:pPr>
+        <w:pStyle w:val="Heading2"/>
+        <w:spacing w:before="240" w:after="120"/>
+      </w:pPr>
+      <w:r>
+        <w:rPr>
+          <w:rFonts w:ascii="Calibri" w:hAnsi="Calibri"/>
+          <w:b/>
+          <w:color w:val="2E74B5"/>
+          <w:sz w:val="30"/>
+        </w:rPr>
+        <w:t>3.3 Use Case Specification 2 - Confirm Warehouse Receipt</w:t>
+      </w:r>
+    </w:p>
+    <w:tbl>
+      <w:tblPr>
+        <w:tblStyle w:val="TableGrid"/>
+        <w:tblW w:type="auto" w:w="0"/>
+        <w:jc w:val="center"/>
+        <w:tblLayout w:type="autofit"/>
+        <w:tblLook w:firstColumn="1" w:firstRow="1" w:lastColumn="0" w:lastRow="0" w:noHBand="0" w:noVBand="1" w:val="04A0"/>
+      </w:tblPr>
+      <w:tblGrid>
+        <w:gridCol w:w="4873"/>
+        <w:gridCol w:w="4873"/>
+      </w:tblGrid>
+      <w:tr>
+        <w:tc>
+          <w:tcPr>
+            <w:tcW w:type="dxa" w:w="4873"/>
+            <w:vAlign w:val="center"/>
+            <w:shd w:val="clear" w:color="auto" w:fill="F7FAFD"/>
+          </w:tcPr>
+          <w:p>
+            <w:r>
+              <w:rPr>
+                <w:b/>
+              </w:rPr>
+              <w:t>Use Case ID</w:t>
+            </w:r>
+          </w:p>
+        </w:tc>
+        <w:tc>
+          <w:tcPr>
+            <w:tcW w:type="dxa" w:w="4873"/>
+            <w:vAlign w:val="center"/>
+            <w:shd w:val="clear" w:color="auto" w:fill="F7FAFD"/>
+          </w:tcPr>
+          <w:p>
+            <w:r>
+              <w:t>UC-03</w:t>
+            </w:r>
+          </w:p>
+        </w:tc>
+      </w:tr>
+      <w:tr>
+        <w:tc>
+          <w:tcPr>
+            <w:tcW w:type="dxa" w:w="4873"/>
+            <w:vAlign w:val="center"/>
+          </w:tcPr>
+          <w:p>
+            <w:r>
+              <w:rPr>
+                <w:b/>
+              </w:rPr>
+              <w:t>Name</w:t>
+            </w:r>
+          </w:p>
+        </w:tc>
+        <w:tc>
+          <w:tcPr>
+            <w:tcW w:type="dxa" w:w="4873"/>
+            <w:vAlign w:val="center"/>
+          </w:tcPr>
+          <w:p>
+            <w:r>
+              <w:t>Confirm Warehouse Receipt</w:t>
+            </w:r>
+          </w:p>
+        </w:tc>
+      </w:tr>
+      <w:tr>
+        <w:tc>
+          <w:tcPr>
+            <w:tcW w:type="dxa" w:w="4873"/>
+            <w:vAlign w:val="center"/>
+            <w:shd w:val="clear" w:color="auto" w:fill="F7FAFD"/>
+          </w:tcPr>
+          <w:p>
+            <w:r>
+              <w:rPr>
+                <w:b/>
+              </w:rPr>
+              <w:t>Actor</w:t>
+            </w:r>
+          </w:p>
+        </w:tc>
+        <w:tc>
+          <w:tcPr>
+            <w:tcW w:type="dxa" w:w="4873"/>
+            <w:vAlign w:val="center"/>
+            <w:shd w:val="clear" w:color="auto" w:fill="F7FAFD"/>
+          </w:tcPr>
+          <w:p>
+            <w:r>
+              <w:t>Warehouse operator</w:t>
+            </w:r>
+          </w:p>
+        </w:tc>
+      </w:tr>
+      <w:tr>
+        <w:tc>
+          <w:tcPr>
+            <w:tcW w:type="dxa" w:w="4873"/>
+            <w:vAlign w:val="center"/>
+          </w:tcPr>
+          <w:p>
+            <w:r>
+              <w:rPr>
+                <w:b/>
+              </w:rPr>
+              <w:t>Precondition</w:t>
+            </w:r>
+          </w:p>
+        </w:tc>
+        <w:tc>
+          <w:tcPr>
+            <w:tcW w:type="dxa" w:w="4873"/>
+            <w:vAlign w:val="center"/>
+          </w:tcPr>
+          <w:p>
+            <w:r>
+              <w:t>Shipment exists in state IN_TRANSIT; shipment ID matches incoming goods; seal/hash available for verification.</w:t>
+            </w:r>
+          </w:p>
+        </w:tc>
+      </w:tr>
+      <w:tr>
+        <w:tc>
+          <w:tcPr>
+            <w:tcW w:type="dxa" w:w="4873"/>
+            <w:vAlign w:val="center"/>
+            <w:shd w:val="clear" w:color="auto" w:fill="F7FAFD"/>
+          </w:tcPr>
+          <w:p>
+            <w:r>
+              <w:rPr>
+                <w:b/>
+              </w:rPr>
+              <w:t>Main Flow</w:t>
+            </w:r>
+          </w:p>
+        </w:tc>
+        <w:tc>
+          <w:tcPr>
+            <w:tcW w:type="dxa" w:w="4873"/>
+            <w:vAlign w:val="center"/>
+            <w:shd w:val="clear" w:color="auto" w:fill="F7FAFD"/>
+          </w:tcPr>
+          <w:p>
+            <w:r>
+              <w:t>1. Operator scans shipment QR code.</w:t>
+              <w:br/>
+              <w:t>2. System validates QR signature (PKI).</w:t>
+              <w:br/>
+              <w:t>3. System retrieves shipment record from ledger.</w:t>
+              <w:br/>
+              <w:t>4. Operator enters/verifies physical seal hash.</w:t>
+              <w:br/>
+              <w:t>5. System compares seal hash to expected value.</w:t>
+              <w:br/>
+              <w:t>6. Operator signs receipt with HSM-backed key.</w:t>
+              <w:br/>
+              <w:t>7. System updates status to RECEIVED, writes audit + ledger.</w:t>
+              <w:br/>
+              <w:t>8. Notifications sent to Manufacturer and Distributor.</w:t>
+            </w:r>
+          </w:p>
+        </w:tc>
+      </w:tr>
+      <w:tr>
+        <w:tc>
+          <w:tcPr>
+            <w:tcW w:type="dxa" w:w="4873"/>
+            <w:vAlign w:val="center"/>
+          </w:tcPr>
+          <w:p>
+            <w:r>
+              <w:rPr>
+                <w:b/>
+              </w:rPr>
+              <w:t>Alternative Flow 5a</w:t>
+            </w:r>
+          </w:p>
+        </w:tc>
+        <w:tc>
+          <w:tcPr>
+            <w:tcW w:type="dxa" w:w="4873"/>
+            <w:vAlign w:val="center"/>
+          </w:tcPr>
+          <w:p>
+            <w:r>
+              <w:t>Seal hash mismatch -&gt; quarantine, alert Security Officer, audit log.</w:t>
+            </w:r>
+          </w:p>
+        </w:tc>
+      </w:tr>
+      <w:tr>
+        <w:tc>
+          <w:tcPr>
+            <w:tcW w:type="dxa" w:w="4873"/>
+            <w:vAlign w:val="center"/>
+            <w:shd w:val="clear" w:color="auto" w:fill="F7FAFD"/>
+          </w:tcPr>
+          <w:p>
+            <w:r>
+              <w:rPr>
+                <w:b/>
+              </w:rPr>
+              <w:t>Alternative Flow 2a</w:t>
+            </w:r>
+          </w:p>
+        </w:tc>
+        <w:tc>
+          <w:tcPr>
+            <w:tcW w:type="dxa" w:w="4873"/>
+            <w:vAlign w:val="center"/>
+            <w:shd w:val="clear" w:color="auto" w:fill="F7FAFD"/>
+          </w:tcPr>
+          <w:p>
+            <w:r>
+              <w:t>QR signature invalid -&gt; reject, do not proceed, log attempt.</w:t>
+            </w:r>
+          </w:p>
+        </w:tc>
+      </w:tr>
+      <w:tr>
+        <w:tc>
+          <w:tcPr>
+            <w:tcW w:type="dxa" w:w="4873"/>
+            <w:vAlign w:val="center"/>
+          </w:tcPr>
+          <w:p>
+            <w:r>
+              <w:rPr>
+                <w:b/>
+              </w:rPr>
+              <w:t>Exception Flow 7a</w:t>
+            </w:r>
+          </w:p>
+        </w:tc>
+        <w:tc>
+          <w:tcPr>
+            <w:tcW w:type="dxa" w:w="4873"/>
+            <w:vAlign w:val="center"/>
+          </w:tcPr>
+          <w:p>
+            <w:r>
+              <w:t>Ledger write fails -&gt; rollback, retry with exponential backoff.</w:t>
+            </w:r>
+          </w:p>
+        </w:tc>
+      </w:tr>
+      <w:tr>
+        <w:tc>
+          <w:tcPr>
+            <w:tcW w:type="dxa" w:w="4873"/>
+            <w:vAlign w:val="center"/>
+            <w:shd w:val="clear" w:color="auto" w:fill="F7FAFD"/>
+          </w:tcPr>
+          <w:p>
+            <w:r>
+              <w:rPr>
+                <w:b/>
+              </w:rPr>
+              <w:t>Postcondition</w:t>
+            </w:r>
+          </w:p>
+        </w:tc>
+        <w:tc>
+          <w:tcPr>
+            <w:tcW w:type="dxa" w:w="4873"/>
+            <w:vAlign w:val="center"/>
+            <w:shd w:val="clear" w:color="auto" w:fill="F7FAFD"/>
+          </w:tcPr>
+          <w:p>
+            <w:r>
+              <w:t>Shipment marked RECEIVED; receipt record created; audit and ledger entries written; origin orgs notified.</w:t>
+            </w:r>
+          </w:p>
+        </w:tc>
+      </w:tr>
+      <w:tr>
+        <w:tc>
+          <w:tcPr>
+            <w:tcW w:type="dxa" w:w="4873"/>
+            <w:vAlign w:val="center"/>
+          </w:tcPr>
+          <w:p>
+            <w:r>
+              <w:rPr>
+                <w:b/>
+              </w:rPr>
+              <w:t>Security Requirements</w:t>
+            </w:r>
+          </w:p>
+        </w:tc>
+        <w:tc>
+          <w:tcPr>
+            <w:tcW w:type="dxa" w:w="4873"/>
+            <w:vAlign w:val="center"/>
+          </w:tcPr>
+          <w:p>
+            <w:r>
+              <w:t>SR-02 (mTLS), SR-04 (SHA-256 hash), SR-10 (audit), SR-14 (anomaly).</w:t>
+            </w:r>
+          </w:p>
+        </w:tc>
+      </w:tr>
+    </w:tbl>
+    <w:p>
+      <w:pPr>
+        <w:pStyle w:val="Heading2"/>
+        <w:spacing w:before="240" w:after="120"/>
+      </w:pPr>
+      <w:r>
+        <w:rPr>
+          <w:rFonts w:ascii="Calibri" w:hAnsi="Calibri"/>
+          <w:b/>
+          <w:color w:val="2E74B5"/>
+          <w:sz w:val="30"/>
+        </w:rPr>
+        <w:t>3.4 Scenario-Based Analysis Model</w:t>
+      </w:r>
+    </w:p>
+    <w:p>
+      <w:r>
+        <w:t>Scenario: Receive Shipment and Confirm Receipt (adapted from the exam template scenario 'Attend Examination and Submit Answers', retargeted to PharmaChain).</w:t>
+      </w:r>
+    </w:p>
+    <w:tbl>
+      <w:tblPr>
+        <w:tblStyle w:val="TableGrid"/>
+        <w:tblW w:type="auto" w:w="0"/>
+        <w:jc w:val="center"/>
+        <w:tblLayout w:type="autofit"/>
+        <w:tblLook w:firstColumn="1" w:firstRow="1" w:lastColumn="0" w:lastRow="0" w:noHBand="0" w:noVBand="1" w:val="04A0"/>
+      </w:tblPr>
+      <w:tblGrid>
+        <w:gridCol w:w="3249"/>
+        <w:gridCol w:w="3249"/>
+        <w:gridCol w:w="3249"/>
+      </w:tblGrid>
+      <w:tr>
+        <w:tc>
+          <w:tcPr>
+            <w:tcW w:type="dxa" w:w="3249"/>
+            <w:vAlign w:val="center"/>
+            <w:shd w:val="clear" w:color="auto" w:fill="1F3A5F"/>
+          </w:tcPr>
+          <w:p>
+            <w:r>
+              <w:rPr>
+                <w:b/>
+                <w:color w:val="FFFFFF"/>
+                <w:sz w:val="21"/>
+              </w:rPr>
+              <w:t>Step</w:t>
+            </w:r>
+          </w:p>
+        </w:tc>
+        <w:tc>
+          <w:tcPr>
+            <w:tcW w:type="dxa" w:w="3249"/>
+            <w:vAlign w:val="center"/>
+            <w:shd w:val="clear" w:color="auto" w:fill="1F3A5F"/>
+          </w:tcPr>
+          <w:p>
+            <w:r>
+              <w:rPr>
+                <w:b/>
+                <w:color w:val="FFFFFF"/>
+                <w:sz w:val="21"/>
+              </w:rPr>
+              <w:t>Actor Action</w:t>
+            </w:r>
+          </w:p>
+        </w:tc>
+        <w:tc>
+          <w:tcPr>
+            <w:tcW w:type="dxa" w:w="3249"/>
+            <w:vAlign w:val="center"/>
+            <w:shd w:val="clear" w:color="auto" w:fill="1F3A5F"/>
+          </w:tcPr>
+          <w:p>
+            <w:r>
+              <w:rPr>
+                <w:b/>
+                <w:color w:val="FFFFFF"/>
+                <w:sz w:val="21"/>
+              </w:rPr>
+              <w:t>System Response</w:t>
+            </w:r>
+          </w:p>
+        </w:tc>
+      </w:tr>
+      <w:tr>
+        <w:tc>
+          <w:tcPr>
+            <w:tcW w:type="dxa" w:w="3249"/>
+            <w:vAlign w:val="center"/>
+          </w:tcPr>
+          <w:p>
+            <w:r>
+              <w:t>1</w:t>
+            </w:r>
+          </w:p>
+        </w:tc>
+        <w:tc>
+          <w:tcPr>
+            <w:tcW w:type="dxa" w:w="3249"/>
+            <w:vAlign w:val="center"/>
+          </w:tcPr>
+          <w:p>
+            <w:r>
+              <w:t>Warehouse scans shipment QR</w:t>
+            </w:r>
+          </w:p>
+        </w:tc>
+        <w:tc>
+          <w:tcPr>
+            <w:tcW w:type="dxa" w:w="3249"/>
+            <w:vAlign w:val="center"/>
+          </w:tcPr>
+          <w:p>
+            <w:r>
+              <w:t>Validates QR signature against PKI</w:t>
+            </w:r>
+          </w:p>
+        </w:tc>
+      </w:tr>
+      <w:tr>
+        <w:tc>
+          <w:tcPr>
+            <w:tcW w:type="dxa" w:w="3249"/>
+            <w:vAlign w:val="center"/>
+            <w:shd w:val="clear" w:color="auto" w:fill="F7FAFD"/>
+          </w:tcPr>
+          <w:p>
+            <w:r>
+              <w:t>2</w:t>
+            </w:r>
+          </w:p>
+        </w:tc>
+        <w:tc>
+          <w:tcPr>
+            <w:tcW w:type="dxa" w:w="3249"/>
+            <w:vAlign w:val="center"/>
+            <w:shd w:val="clear" w:color="auto" w:fill="F7FAFD"/>
+          </w:tcPr>
+          <w:p>
+            <w:r>
+              <w:t>-</w:t>
+            </w:r>
+          </w:p>
+        </w:tc>
+        <w:tc>
+          <w:tcPr>
+            <w:tcW w:type="dxa" w:w="3249"/>
+            <w:vAlign w:val="center"/>
+            <w:shd w:val="clear" w:color="auto" w:fill="F7FAFD"/>
+          </w:tcPr>
+          <w:p>
+            <w:r>
+              <w:t>Retrieves shipment record from ledger</w:t>
+            </w:r>
+          </w:p>
+        </w:tc>
+      </w:tr>
+      <w:tr>
+        <w:tc>
+          <w:tcPr>
+            <w:tcW w:type="dxa" w:w="3249"/>
+            <w:vAlign w:val="center"/>
+          </w:tcPr>
+          <w:p>
+            <w:r>
+              <w:t>3</w:t>
+            </w:r>
+          </w:p>
+        </w:tc>
+        <w:tc>
+          <w:tcPr>
+            <w:tcW w:type="dxa" w:w="3249"/>
+            <w:vAlign w:val="center"/>
+          </w:tcPr>
+          <w:p>
+            <w:r>
+              <w:t>Verifies physical seal hash</w:t>
+            </w:r>
+          </w:p>
+        </w:tc>
+        <w:tc>
+          <w:tcPr>
+            <w:tcW w:type="dxa" w:w="3249"/>
+            <w:vAlign w:val="center"/>
+          </w:tcPr>
+          <w:p>
+            <w:r>
+              <w:t>Compares seal hash to expected value</w:t>
+            </w:r>
+          </w:p>
+        </w:tc>
+      </w:tr>
+      <w:tr>
+        <w:tc>
+          <w:tcPr>
+            <w:tcW w:type="dxa" w:w="3249"/>
+            <w:vAlign w:val="center"/>
+            <w:shd w:val="clear" w:color="auto" w:fill="F7FAFD"/>
+          </w:tcPr>
+          <w:p>
+            <w:r>
+              <w:t>4</w:t>
+            </w:r>
+          </w:p>
+        </w:tc>
+        <w:tc>
+          <w:tcPr>
+            <w:tcW w:type="dxa" w:w="3249"/>
+            <w:vAlign w:val="center"/>
+            <w:shd w:val="clear" w:color="auto" w:fill="F7FAFD"/>
+          </w:tcPr>
+          <w:p>
+            <w:r>
+              <w:t>Clicks 'Confirm Receipt'</w:t>
+            </w:r>
+          </w:p>
+        </w:tc>
+        <w:tc>
+          <w:tcPr>
+            <w:tcW w:type="dxa" w:w="3249"/>
+            <w:vAlign w:val="center"/>
+            <w:shd w:val="clear" w:color="auto" w:fill="F7FAFD"/>
+          </w:tcPr>
+          <w:p>
+            <w:r>
+              <w:t>Prompts for digital signature</w:t>
+            </w:r>
+          </w:p>
+        </w:tc>
+      </w:tr>
+      <w:tr>
+        <w:tc>
+          <w:tcPr>
+            <w:tcW w:type="dxa" w:w="3249"/>
+            <w:vAlign w:val="center"/>
+          </w:tcPr>
+          <w:p>
+            <w:r>
+              <w:t>5</w:t>
+            </w:r>
+          </w:p>
+        </w:tc>
+        <w:tc>
+          <w:tcPr>
+            <w:tcW w:type="dxa" w:w="3249"/>
+            <w:vAlign w:val="center"/>
+          </w:tcPr>
+          <w:p>
+            <w:r>
+              <w:t>Signs with HSM key</w:t>
+            </w:r>
+          </w:p>
+        </w:tc>
+        <w:tc>
+          <w:tcPr>
+            <w:tcW w:type="dxa" w:w="3249"/>
+            <w:vAlign w:val="center"/>
+          </w:tcPr>
+          <w:p>
+            <w:r>
+              <w:t>Verifies signature + RBAC + ABAC</w:t>
+            </w:r>
+          </w:p>
+        </w:tc>
+      </w:tr>
+      <w:tr>
+        <w:tc>
+          <w:tcPr>
+            <w:tcW w:type="dxa" w:w="3249"/>
+            <w:vAlign w:val="center"/>
+            <w:shd w:val="clear" w:color="auto" w:fill="F7FAFD"/>
+          </w:tcPr>
+          <w:p>
+            <w:r>
+              <w:t>6</w:t>
+            </w:r>
+          </w:p>
+        </w:tc>
+        <w:tc>
+          <w:tcPr>
+            <w:tcW w:type="dxa" w:w="3249"/>
+            <w:vAlign w:val="center"/>
+            <w:shd w:val="clear" w:color="auto" w:fill="F7FAFD"/>
+          </w:tcPr>
+          <w:p>
+            <w:r>
+              <w:t>-</w:t>
+            </w:r>
+          </w:p>
+        </w:tc>
+        <w:tc>
+          <w:tcPr>
+            <w:tcW w:type="dxa" w:w="3249"/>
+            <w:vAlign w:val="center"/>
+            <w:shd w:val="clear" w:color="auto" w:fill="F7FAFD"/>
+          </w:tcPr>
+          <w:p>
+            <w:r>
+              <w:t>Writes audit entry (append-only) + ledger hash</w:t>
+            </w:r>
+          </w:p>
+        </w:tc>
+      </w:tr>
+      <w:tr>
+        <w:tc>
+          <w:tcPr>
+            <w:tcW w:type="dxa" w:w="3249"/>
+            <w:vAlign w:val="center"/>
+          </w:tcPr>
+          <w:p>
+            <w:r>
+              <w:t>7</w:t>
+            </w:r>
+          </w:p>
+        </w:tc>
+        <w:tc>
+          <w:tcPr>
+            <w:tcW w:type="dxa" w:w="3249"/>
+            <w:vAlign w:val="center"/>
+          </w:tcPr>
+          <w:p>
+            <w:r>
+              <w:t>-</w:t>
+            </w:r>
+          </w:p>
+        </w:tc>
+        <w:tc>
+          <w:tcPr>
+            <w:tcW w:type="dxa" w:w="3249"/>
+            <w:vAlign w:val="center"/>
+          </w:tcPr>
+          <w:p>
+            <w:r>
+              <w:t>Updates status to RECEIVED</w:t>
+            </w:r>
+          </w:p>
+        </w:tc>
+      </w:tr>
+      <w:tr>
+        <w:tc>
+          <w:tcPr>
+            <w:tcW w:type="dxa" w:w="3249"/>
+            <w:vAlign w:val="center"/>
+            <w:shd w:val="clear" w:color="auto" w:fill="F7FAFD"/>
+          </w:tcPr>
+          <w:p>
+            <w:r>
+              <w:t>8</w:t>
+            </w:r>
+          </w:p>
+        </w:tc>
+        <w:tc>
+          <w:tcPr>
+            <w:tcW w:type="dxa" w:w="3249"/>
+            <w:vAlign w:val="center"/>
+            <w:shd w:val="clear" w:color="auto" w:fill="F7FAFD"/>
+          </w:tcPr>
+          <w:p>
+            <w:r>
+              <w:t>-</w:t>
+            </w:r>
+          </w:p>
+        </w:tc>
+        <w:tc>
+          <w:tcPr>
+            <w:tcW w:type="dxa" w:w="3249"/>
+            <w:vAlign w:val="center"/>
+            <w:shd w:val="clear" w:color="auto" w:fill="F7FAFD"/>
+          </w:tcPr>
+          <w:p>
+            <w:r>
+              <w:t>Sends notification to Manufacturer + Distributor</w:t>
+            </w:r>
+          </w:p>
+        </w:tc>
+      </w:tr>
+      <w:tr>
+        <w:tc>
+          <w:tcPr>
+            <w:tcW w:type="dxa" w:w="3249"/>
+            <w:vAlign w:val="center"/>
+          </w:tcPr>
+          <w:p>
+            <w:r>
+              <w:t>Alt 3a</w:t>
+            </w:r>
+          </w:p>
+        </w:tc>
+        <w:tc>
+          <w:tcPr>
+            <w:tcW w:type="dxa" w:w="3249"/>
+            <w:vAlign w:val="center"/>
+          </w:tcPr>
+          <w:p>
+            <w:r>
+              <w:t>Seal mismatch detected</w:t>
+            </w:r>
+          </w:p>
+        </w:tc>
+        <w:tc>
+          <w:tcPr>
+            <w:tcW w:type="dxa" w:w="3249"/>
+            <w:vAlign w:val="center"/>
+          </w:tcPr>
+          <w:p>
+            <w:r>
+              <w:t>Quarantine + alert + audit log</w:t>
+            </w:r>
+          </w:p>
+        </w:tc>
+      </w:tr>
+      <w:tr>
+        <w:tc>
+          <w:tcPr>
+            <w:tcW w:type="dxa" w:w="3249"/>
+            <w:vAlign w:val="center"/>
+            <w:shd w:val="clear" w:color="auto" w:fill="F7FAFD"/>
+          </w:tcPr>
+          <w:p>
+            <w:r>
+              <w:t>Alt 5a</w:t>
+            </w:r>
+          </w:p>
+        </w:tc>
+        <w:tc>
+          <w:tcPr>
+            <w:tcW w:type="dxa" w:w="3249"/>
+            <w:vAlign w:val="center"/>
+            <w:shd w:val="clear" w:color="auto" w:fill="F7FAFD"/>
+          </w:tcPr>
+          <w:p>
+            <w:r>
+              <w:t>Invalid signature</w:t>
+            </w:r>
+          </w:p>
+        </w:tc>
+        <w:tc>
+          <w:tcPr>
+            <w:tcW w:type="dxa" w:w="3249"/>
+            <w:vAlign w:val="center"/>
+            <w:shd w:val="clear" w:color="auto" w:fill="F7FAFD"/>
+          </w:tcPr>
+          <w:p>
+            <w:r>
+              <w:t>Reject, retry prompt, log attempt</w:t>
+            </w:r>
+          </w:p>
+        </w:tc>
+      </w:tr>
+      <w:tr>
+        <w:tc>
+          <w:tcPr>
+            <w:tcW w:type="dxa" w:w="3249"/>
+            <w:vAlign w:val="center"/>
+          </w:tcPr>
+          <w:p>
+            <w:r>
+              <w:t>Exc 2a</w:t>
+            </w:r>
+          </w:p>
+        </w:tc>
+        <w:tc>
+          <w:tcPr>
+            <w:tcW w:type="dxa" w:w="3249"/>
+            <w:vAlign w:val="center"/>
+          </w:tcPr>
+          <w:p>
+            <w:r>
+              <w:t>Ledger write fails</w:t>
+            </w:r>
+          </w:p>
+        </w:tc>
+        <w:tc>
+          <w:tcPr>
+            <w:tcW w:type="dxa" w:w="3249"/>
+            <w:vAlign w:val="center"/>
+          </w:tcPr>
+          <w:p>
+            <w:r>
+              <w:t>Rollback DB, retry, escalate</w:t>
+            </w:r>
+          </w:p>
+        </w:tc>
+      </w:tr>
+    </w:tbl>
+    <w:p>
+      <w:pPr>
+        <w:pStyle w:val="Heading2"/>
+        <w:spacing w:before="240" w:after="120"/>
+      </w:pPr>
+      <w:r>
+        <w:rPr>
+          <w:rFonts w:ascii="Calibri" w:hAnsi="Calibri"/>
+          <w:b/>
+          <w:color w:val="2E74B5"/>
+          <w:sz w:val="30"/>
+        </w:rPr>
+        <w:t>3.5 Consistency With Phase 2 Requirements</w:t>
+      </w:r>
+    </w:p>
+    <w:p>
+      <w:r>
+        <w:t>Every use case maps to at least one functional requirement (FR) and carries forward the relevant security requirements (SR).</w:t>
+      </w:r>
+    </w:p>
+    <w:tbl>
+      <w:tblPr>
+        <w:tblStyle w:val="TableGrid"/>
+        <w:tblW w:type="auto" w:w="0"/>
+        <w:jc w:val="center"/>
+        <w:tblLayout w:type="autofit"/>
+        <w:tblLook w:firstColumn="1" w:firstRow="1" w:lastColumn="0" w:lastRow="0" w:noHBand="0" w:noVBand="1" w:val="04A0"/>
+      </w:tblPr>
+      <w:tblGrid>
+        <w:gridCol w:w="3249"/>
+        <w:gridCol w:w="3249"/>
+        <w:gridCol w:w="3249"/>
+      </w:tblGrid>
+      <w:tr>
+        <w:tc>
+          <w:tcPr>
+            <w:tcW w:type="dxa" w:w="3249"/>
+            <w:vAlign w:val="center"/>
+            <w:shd w:val="clear" w:color="auto" w:fill="1F3A5F"/>
+          </w:tcPr>
+          <w:p>
+            <w:r>
+              <w:rPr>
+                <w:b/>
+                <w:color w:val="FFFFFF"/>
+                <w:sz w:val="21"/>
+              </w:rPr>
+              <w:t>Use Case</w:t>
+            </w:r>
+          </w:p>
+        </w:tc>
+        <w:tc>
+          <w:tcPr>
+            <w:tcW w:type="dxa" w:w="3249"/>
+            <w:vAlign w:val="center"/>
+            <w:shd w:val="clear" w:color="auto" w:fill="1F3A5F"/>
+          </w:tcPr>
+          <w:p>
+            <w:r>
+              <w:rPr>
+                <w:b/>
+                <w:color w:val="FFFFFF"/>
+                <w:sz w:val="21"/>
+              </w:rPr>
+              <w:t>FR(s)</w:t>
+            </w:r>
+          </w:p>
+        </w:tc>
+        <w:tc>
+          <w:tcPr>
+            <w:tcW w:type="dxa" w:w="3249"/>
+            <w:vAlign w:val="center"/>
+            <w:shd w:val="clear" w:color="auto" w:fill="1F3A5F"/>
+          </w:tcPr>
+          <w:p>
+            <w:r>
+              <w:rPr>
+                <w:b/>
+                <w:color w:val="FFFFFF"/>
+                <w:sz w:val="21"/>
+              </w:rPr>
+              <w:t>SR(s)</w:t>
+            </w:r>
+          </w:p>
+        </w:tc>
+      </w:tr>
+      <w:tr>
+        <w:tc>
+          <w:tcPr>
+            <w:tcW w:type="dxa" w:w="3249"/>
+            <w:vAlign w:val="center"/>
+          </w:tcPr>
+          <w:p>
+            <w:r>
+              <w:t>UC-01 Register Product</w:t>
+            </w:r>
+          </w:p>
+        </w:tc>
+        <w:tc>
+          <w:tcPr>
+            <w:tcW w:type="dxa" w:w="3249"/>
+            <w:vAlign w:val="center"/>
+          </w:tcPr>
+          <w:p>
+            <w:r>
+              <w:t>FR-01</w:t>
+            </w:r>
+          </w:p>
+        </w:tc>
+        <w:tc>
+          <w:tcPr>
+            <w:tcW w:type="dxa" w:w="3249"/>
+            <w:vAlign w:val="center"/>
+          </w:tcPr>
+          <w:p>
+            <w:r>
+              <w:t>SR-04, SR-10</w:t>
+            </w:r>
+          </w:p>
+        </w:tc>
+      </w:tr>
+      <w:tr>
+        <w:tc>
+          <w:tcPr>
+            <w:tcW w:type="dxa" w:w="3249"/>
+            <w:vAlign w:val="center"/>
+            <w:shd w:val="clear" w:color="auto" w:fill="F7FAFD"/>
+          </w:tcPr>
+          <w:p>
+            <w:r>
+              <w:t>UC-02 Create Shipment</w:t>
+            </w:r>
+          </w:p>
+        </w:tc>
+        <w:tc>
+          <w:tcPr>
+            <w:tcW w:type="dxa" w:w="3249"/>
+            <w:vAlign w:val="center"/>
+            <w:shd w:val="clear" w:color="auto" w:fill="F7FAFD"/>
+          </w:tcPr>
+          <w:p>
+            <w:r>
+              <w:t>FR-02</w:t>
+            </w:r>
+          </w:p>
+        </w:tc>
+        <w:tc>
+          <w:tcPr>
+            <w:tcW w:type="dxa" w:w="3249"/>
+            <w:vAlign w:val="center"/>
+            <w:shd w:val="clear" w:color="auto" w:fill="F7FAFD"/>
+          </w:tcPr>
+          <w:p>
+            <w:r>
+              <w:t>SR-03, SR-05, SR-10</w:t>
+            </w:r>
+          </w:p>
+        </w:tc>
+      </w:tr>
+      <w:tr>
+        <w:tc>
+          <w:tcPr>
+            <w:tcW w:type="dxa" w:w="3249"/>
+            <w:vAlign w:val="center"/>
+          </w:tcPr>
+          <w:p>
+            <w:r>
+              <w:t>UC-03 Confirm Receipt</w:t>
+            </w:r>
+          </w:p>
+        </w:tc>
+        <w:tc>
+          <w:tcPr>
+            <w:tcW w:type="dxa" w:w="3249"/>
+            <w:vAlign w:val="center"/>
+          </w:tcPr>
+          <w:p>
+            <w:r>
+              <w:t>FR-03</w:t>
+            </w:r>
+          </w:p>
+        </w:tc>
+        <w:tc>
+          <w:tcPr>
+            <w:tcW w:type="dxa" w:w="3249"/>
+            <w:vAlign w:val="center"/>
+          </w:tcPr>
+          <w:p>
+            <w:r>
+              <w:t>SR-04, SR-10, SR-14</w:t>
+            </w:r>
+          </w:p>
+        </w:tc>
+      </w:tr>
+      <w:tr>
+        <w:tc>
+          <w:tcPr>
+            <w:tcW w:type="dxa" w:w="3249"/>
+            <w:vAlign w:val="center"/>
+            <w:shd w:val="clear" w:color="auto" w:fill="F7FAFD"/>
+          </w:tcPr>
+          <w:p>
+            <w:r>
+              <w:t>UC-04 Transfer Ownership</w:t>
+            </w:r>
+          </w:p>
+        </w:tc>
+        <w:tc>
+          <w:tcPr>
+            <w:tcW w:type="dxa" w:w="3249"/>
+            <w:vAlign w:val="center"/>
+            <w:shd w:val="clear" w:color="auto" w:fill="F7FAFD"/>
+          </w:tcPr>
+          <w:p>
+            <w:r>
+              <w:t>FR-04</w:t>
+            </w:r>
+          </w:p>
+        </w:tc>
+        <w:tc>
+          <w:tcPr>
+            <w:tcW w:type="dxa" w:w="3249"/>
+            <w:vAlign w:val="center"/>
+            <w:shd w:val="clear" w:color="auto" w:fill="F7FAFD"/>
+          </w:tcPr>
+          <w:p>
+            <w:r>
+              <w:t>SR-03, SR-05, SR-06, SR-07, SR-10, SR-12</w:t>
+            </w:r>
+          </w:p>
+        </w:tc>
+      </w:tr>
+      <w:tr>
+        <w:tc>
+          <w:tcPr>
+            <w:tcW w:type="dxa" w:w="3249"/>
+            <w:vAlign w:val="center"/>
+          </w:tcPr>
+          <w:p>
+            <w:r>
+              <w:t>UC-05 Confirm Delivery</w:t>
+            </w:r>
+          </w:p>
+        </w:tc>
+        <w:tc>
+          <w:tcPr>
+            <w:tcW w:type="dxa" w:w="3249"/>
+            <w:vAlign w:val="center"/>
+          </w:tcPr>
+          <w:p>
+            <w:r>
+              <w:t>FR-05</w:t>
+            </w:r>
+          </w:p>
+        </w:tc>
+        <w:tc>
+          <w:tcPr>
+            <w:tcW w:type="dxa" w:w="3249"/>
+            <w:vAlign w:val="center"/>
+          </w:tcPr>
+          <w:p>
+            <w:r>
+              <w:t>SR-10, SR-12</w:t>
+            </w:r>
+          </w:p>
+        </w:tc>
+      </w:tr>
+      <w:tr>
+        <w:tc>
+          <w:tcPr>
+            <w:tcW w:type="dxa" w:w="3249"/>
+            <w:vAlign w:val="center"/>
+            <w:shd w:val="clear" w:color="auto" w:fill="F7FAFD"/>
+          </w:tcPr>
+          <w:p>
+            <w:r>
+              <w:t>UC-06 Verify Authenticity</w:t>
+            </w:r>
+          </w:p>
+        </w:tc>
+        <w:tc>
+          <w:tcPr>
+            <w:tcW w:type="dxa" w:w="3249"/>
+            <w:vAlign w:val="center"/>
+            <w:shd w:val="clear" w:color="auto" w:fill="F7FAFD"/>
+          </w:tcPr>
+          <w:p>
+            <w:r>
+              <w:t>FR-07</w:t>
+            </w:r>
+          </w:p>
+        </w:tc>
+        <w:tc>
+          <w:tcPr>
+            <w:tcW w:type="dxa" w:w="3249"/>
+            <w:vAlign w:val="center"/>
+            <w:shd w:val="clear" w:color="auto" w:fill="F7FAFD"/>
+          </w:tcPr>
+          <w:p>
+            <w:r>
+              <w:t>SR-04</w:t>
+            </w:r>
+          </w:p>
+        </w:tc>
+      </w:tr>
+      <w:tr>
+        <w:tc>
+          <w:tcPr>
+            <w:tcW w:type="dxa" w:w="3249"/>
+            <w:vAlign w:val="center"/>
+          </w:tcPr>
+          <w:p>
+            <w:r>
+              <w:t>UC-07 View Audit Trail</w:t>
+            </w:r>
+          </w:p>
+        </w:tc>
+        <w:tc>
+          <w:tcPr>
+            <w:tcW w:type="dxa" w:w="3249"/>
+            <w:vAlign w:val="center"/>
+          </w:tcPr>
+          <w:p>
+            <w:r>
+              <w:t>FR-08</w:t>
+            </w:r>
+          </w:p>
+        </w:tc>
+        <w:tc>
+          <w:tcPr>
+            <w:tcW w:type="dxa" w:w="3249"/>
+            <w:vAlign w:val="center"/>
+          </w:tcPr>
+          <w:p>
+            <w:r>
+              <w:t>SR-10, SR-11</w:t>
+            </w:r>
+          </w:p>
+        </w:tc>
+      </w:tr>
+      <w:tr>
+        <w:tc>
+          <w:tcPr>
+            <w:tcW w:type="dxa" w:w="3249"/>
+            <w:vAlign w:val="center"/>
+            <w:shd w:val="clear" w:color="auto" w:fill="F7FAFD"/>
+          </w:tcPr>
+          <w:p>
+            <w:r>
+              <w:t>UC-08 Onboard Organization</w:t>
+            </w:r>
+          </w:p>
+        </w:tc>
+        <w:tc>
+          <w:tcPr>
+            <w:tcW w:type="dxa" w:w="3249"/>
+            <w:vAlign w:val="center"/>
+            <w:shd w:val="clear" w:color="auto" w:fill="F7FAFD"/>
+          </w:tcPr>
+          <w:p>
+            <w:r>
+              <w:t>FR-09</w:t>
+            </w:r>
+          </w:p>
+        </w:tc>
+        <w:tc>
+          <w:tcPr>
+            <w:tcW w:type="dxa" w:w="3249"/>
+            <w:vAlign w:val="center"/>
+            <w:shd w:val="clear" w:color="auto" w:fill="F7FAFD"/>
+          </w:tcPr>
+          <w:p>
+            <w:r>
+              <w:t>SR-01, SR-02, SR-13</w:t>
+            </w:r>
+          </w:p>
+        </w:tc>
+      </w:tr>
+      <w:tr>
+        <w:tc>
+          <w:tcPr>
+            <w:tcW w:type="dxa" w:w="3249"/>
+            <w:vAlign w:val="center"/>
+          </w:tcPr>
+          <w:p>
+            <w:r>
+              <w:t>UC-09 Manage Keys</w:t>
+            </w:r>
+          </w:p>
+        </w:tc>
+        <w:tc>
+          <w:tcPr>
+            <w:tcW w:type="dxa" w:w="3249"/>
+            <w:vAlign w:val="center"/>
+          </w:tcPr>
+          <w:p>
+            <w:r>
+              <w:t>FR-10</w:t>
+            </w:r>
+          </w:p>
+        </w:tc>
+        <w:tc>
+          <w:tcPr>
+            <w:tcW w:type="dxa" w:w="3249"/>
+            <w:vAlign w:val="center"/>
+          </w:tcPr>
+          <w:p>
+            <w:r>
+              <w:t>SR-13</w:t>
+            </w:r>
+          </w:p>
+        </w:tc>
+      </w:tr>
+      <w:tr>
+        <w:tc>
+          <w:tcPr>
+            <w:tcW w:type="dxa" w:w="3249"/>
+            <w:vAlign w:val="center"/>
+            <w:shd w:val="clear" w:color="auto" w:fill="F7FAFD"/>
+          </w:tcPr>
+          <w:p>
+            <w:r>
+              <w:t>UC-10 Trigger Recall</w:t>
+            </w:r>
+          </w:p>
+        </w:tc>
+        <w:tc>
+          <w:tcPr>
+            <w:tcW w:type="dxa" w:w="3249"/>
+            <w:vAlign w:val="center"/>
+            <w:shd w:val="clear" w:color="auto" w:fill="F7FAFD"/>
+          </w:tcPr>
+          <w:p>
+            <w:r>
+              <w:t>FR-12</w:t>
+            </w:r>
+          </w:p>
+        </w:tc>
+        <w:tc>
+          <w:tcPr>
+            <w:tcW w:type="dxa" w:w="3249"/>
+            <w:vAlign w:val="center"/>
+            <w:shd w:val="clear" w:color="auto" w:fill="F7FAFD"/>
+          </w:tcPr>
+          <w:p>
+            <w:r>
+              <w:t>SR-10</w:t>
+            </w:r>
+          </w:p>
+        </w:tc>
+      </w:tr>
+    </w:tbl>
+    <w:p>
+      <w:r>
+        <w:br w:type="page"/>
+      </w:r>
+    </w:p>
     <w:sectPr>
       <w:footerReference w:type="default" r:id="rId9"/>
       <w:pgSz w:w="12240" w:h="15840"/>

</xml_diff>

<commit_message>
docs: add Phase 9 (Product Backlog + Jira) + Phase 10 (Sprint Execution + Scrum Metrics)
</commit_message>
<xml_diff>
--- a/PharmaChain_SSE_Report.docx
+++ b/PharmaChain_SSE_Report.docx
@@ -13849,6 +13849,2897 @@
     <w:p>
       <w:r>
         <w:t>SR-03 (every ownership transfer must be digitally signed, hash-chained, and audit-logged) maps directly to attack path A3 (Replay) which is mitigated by nonce + timestamp + hash chain. This closes the thread from requirement -&gt; attack -&gt; control.</w:t>
+      </w:r>
+    </w:p>
+    <w:p>
+      <w:r>
+        <w:br w:type="page"/>
+      </w:r>
+    </w:p>
+    <w:p>
+      <w:pPr>
+        <w:pStyle w:val="Heading1"/>
+        <w:spacing w:before="360" w:after="160"/>
+      </w:pPr>
+      <w:r>
+        <w:rPr>
+          <w:rFonts w:ascii="Calibri" w:hAnsi="Calibri"/>
+          <w:b/>
+          <w:color w:val="1F3A5F"/>
+          <w:sz w:val="40"/>
+        </w:rPr>
+        <w:t>Phase 9 - Product Backlog and Jira/Scrum</w:t>
+      </w:r>
+    </w:p>
+    <w:p>
+      <w:pPr>
+        <w:pStyle w:val="Heading2"/>
+        <w:spacing w:before="240" w:after="120"/>
+      </w:pPr>
+      <w:r>
+        <w:rPr>
+          <w:rFonts w:ascii="Calibri" w:hAnsi="Calibri"/>
+          <w:b/>
+          <w:color w:val="2E74B5"/>
+          <w:sz w:val="30"/>
+        </w:rPr>
+        <w:t>9.1 Epics</w:t>
+      </w:r>
+    </w:p>
+    <w:tbl>
+      <w:tblPr>
+        <w:tblStyle w:val="TableGrid"/>
+        <w:tblW w:type="auto" w:w="0"/>
+        <w:jc w:val="center"/>
+        <w:tblLayout w:type="autofit"/>
+        <w:tblLook w:firstColumn="1" w:firstRow="1" w:lastColumn="0" w:lastRow="0" w:noHBand="0" w:noVBand="1" w:val="04A0"/>
+      </w:tblPr>
+      <w:tblGrid>
+        <w:gridCol w:w="4873"/>
+        <w:gridCol w:w="4873"/>
+      </w:tblGrid>
+      <w:tr>
+        <w:tc>
+          <w:tcPr>
+            <w:tcW w:type="dxa" w:w="4873"/>
+            <w:vAlign w:val="center"/>
+            <w:shd w:val="clear" w:color="auto" w:fill="1F3A5F"/>
+          </w:tcPr>
+          <w:p>
+            <w:r>
+              <w:rPr>
+                <w:b/>
+                <w:color w:val="FFFFFF"/>
+                <w:sz w:val="21"/>
+              </w:rPr>
+              <w:t>Epic</w:t>
+            </w:r>
+          </w:p>
+        </w:tc>
+        <w:tc>
+          <w:tcPr>
+            <w:tcW w:type="dxa" w:w="4873"/>
+            <w:vAlign w:val="center"/>
+            <w:shd w:val="clear" w:color="auto" w:fill="1F3A5F"/>
+          </w:tcPr>
+          <w:p>
+            <w:r>
+              <w:rPr>
+                <w:b/>
+                <w:color w:val="FFFFFF"/>
+                <w:sz w:val="21"/>
+              </w:rPr>
+              <w:t>Description</w:t>
+            </w:r>
+          </w:p>
+        </w:tc>
+      </w:tr>
+      <w:tr>
+        <w:tc>
+          <w:tcPr>
+            <w:tcW w:type="dxa" w:w="4873"/>
+            <w:vAlign w:val="center"/>
+          </w:tcPr>
+          <w:p>
+            <w:r>
+              <w:t>E1</w:t>
+            </w:r>
+          </w:p>
+        </w:tc>
+        <w:tc>
+          <w:tcPr>
+            <w:tcW w:type="dxa" w:w="4873"/>
+            <w:vAlign w:val="center"/>
+          </w:tcPr>
+          <w:p>
+            <w:r>
+              <w:t>Identity &amp; Access - PKI, MFA, RBAC, ABAC</w:t>
+            </w:r>
+          </w:p>
+        </w:tc>
+      </w:tr>
+      <w:tr>
+        <w:tc>
+          <w:tcPr>
+            <w:tcW w:type="dxa" w:w="4873"/>
+            <w:vAlign w:val="center"/>
+            <w:shd w:val="clear" w:color="auto" w:fill="F7FAFD"/>
+          </w:tcPr>
+          <w:p>
+            <w:r>
+              <w:t>E2</w:t>
+            </w:r>
+          </w:p>
+        </w:tc>
+        <w:tc>
+          <w:tcPr>
+            <w:tcW w:type="dxa" w:w="4873"/>
+            <w:vAlign w:val="center"/>
+            <w:shd w:val="clear" w:color="auto" w:fill="F7FAFD"/>
+          </w:tcPr>
+          <w:p>
+            <w:r>
+              <w:t>Product Lifecycle - registration, serialization, lookup</w:t>
+            </w:r>
+          </w:p>
+        </w:tc>
+      </w:tr>
+      <w:tr>
+        <w:tc>
+          <w:tcPr>
+            <w:tcW w:type="dxa" w:w="4873"/>
+            <w:vAlign w:val="center"/>
+          </w:tcPr>
+          <w:p>
+            <w:r>
+              <w:t>E3</w:t>
+            </w:r>
+          </w:p>
+        </w:tc>
+        <w:tc>
+          <w:tcPr>
+            <w:tcW w:type="dxa" w:w="4873"/>
+            <w:vAlign w:val="center"/>
+          </w:tcPr>
+          <w:p>
+            <w:r>
+              <w:t>Shipment &amp; Logistics - shipments, receipts, deliveries</w:t>
+            </w:r>
+          </w:p>
+        </w:tc>
+      </w:tr>
+      <w:tr>
+        <w:tc>
+          <w:tcPr>
+            <w:tcW w:type="dxa" w:w="4873"/>
+            <w:vAlign w:val="center"/>
+            <w:shd w:val="clear" w:color="auto" w:fill="F7FAFD"/>
+          </w:tcPr>
+          <w:p>
+            <w:r>
+              <w:t>E4</w:t>
+            </w:r>
+          </w:p>
+        </w:tc>
+        <w:tc>
+          <w:tcPr>
+            <w:tcW w:type="dxa" w:w="4873"/>
+            <w:vAlign w:val="center"/>
+            <w:shd w:val="clear" w:color="auto" w:fill="F7FAFD"/>
+          </w:tcPr>
+          <w:p>
+            <w:r>
+              <w:t>Ownership &amp; Ledger - signed transfers, hash chain</w:t>
+            </w:r>
+          </w:p>
+        </w:tc>
+      </w:tr>
+      <w:tr>
+        <w:tc>
+          <w:tcPr>
+            <w:tcW w:type="dxa" w:w="4873"/>
+            <w:vAlign w:val="center"/>
+          </w:tcPr>
+          <w:p>
+            <w:r>
+              <w:t>E5</w:t>
+            </w:r>
+          </w:p>
+        </w:tc>
+        <w:tc>
+          <w:tcPr>
+            <w:tcW w:type="dxa" w:w="4873"/>
+            <w:vAlign w:val="center"/>
+          </w:tcPr>
+          <w:p>
+            <w:r>
+              <w:t>Audit &amp; Compliance - immutable log, anomaly detection, reporting</w:t>
+            </w:r>
+          </w:p>
+        </w:tc>
+      </w:tr>
+    </w:tbl>
+    <w:p>
+      <w:pPr>
+        <w:pStyle w:val="Heading2"/>
+        <w:spacing w:before="240" w:after="120"/>
+      </w:pPr>
+      <w:r>
+        <w:rPr>
+          <w:rFonts w:ascii="Calibri" w:hAnsi="Calibri"/>
+          <w:b/>
+          <w:color w:val="2E74B5"/>
+          <w:sz w:val="30"/>
+        </w:rPr>
+        <w:t>9.2 User Stories</w:t>
+      </w:r>
+    </w:p>
+    <w:p>
+      <w:r>
+        <w:t>12 user stories are defined across the 5 epics. Each follows the As a ... I want ... so that ... format with acceptance criteria.</w:t>
+      </w:r>
+    </w:p>
+    <w:tbl>
+      <w:tblPr>
+        <w:tblStyle w:val="TableGrid"/>
+        <w:tblW w:type="auto" w:w="0"/>
+        <w:jc w:val="center"/>
+        <w:tblLayout w:type="autofit"/>
+        <w:tblLook w:firstColumn="1" w:firstRow="1" w:lastColumn="0" w:lastRow="0" w:noHBand="0" w:noVBand="1" w:val="04A0"/>
+      </w:tblPr>
+      <w:tblGrid>
+        <w:gridCol w:w="1949"/>
+        <w:gridCol w:w="1949"/>
+        <w:gridCol w:w="1949"/>
+        <w:gridCol w:w="1949"/>
+        <w:gridCol w:w="1949"/>
+      </w:tblGrid>
+      <w:tr>
+        <w:tc>
+          <w:tcPr>
+            <w:tcW w:type="dxa" w:w="1949"/>
+            <w:vAlign w:val="center"/>
+            <w:shd w:val="clear" w:color="auto" w:fill="1F3A5F"/>
+          </w:tcPr>
+          <w:p>
+            <w:r>
+              <w:rPr>
+                <w:b/>
+                <w:color w:val="FFFFFF"/>
+                <w:sz w:val="21"/>
+              </w:rPr>
+              <w:t>ID</w:t>
+            </w:r>
+          </w:p>
+        </w:tc>
+        <w:tc>
+          <w:tcPr>
+            <w:tcW w:type="dxa" w:w="1949"/>
+            <w:vAlign w:val="center"/>
+            <w:shd w:val="clear" w:color="auto" w:fill="1F3A5F"/>
+          </w:tcPr>
+          <w:p>
+            <w:r>
+              <w:rPr>
+                <w:b/>
+                <w:color w:val="FFFFFF"/>
+                <w:sz w:val="21"/>
+              </w:rPr>
+              <w:t>Epic</w:t>
+            </w:r>
+          </w:p>
+        </w:tc>
+        <w:tc>
+          <w:tcPr>
+            <w:tcW w:type="dxa" w:w="1949"/>
+            <w:vAlign w:val="center"/>
+            <w:shd w:val="clear" w:color="auto" w:fill="1F3A5F"/>
+          </w:tcPr>
+          <w:p>
+            <w:r>
+              <w:rPr>
+                <w:b/>
+                <w:color w:val="FFFFFF"/>
+                <w:sz w:val="21"/>
+              </w:rPr>
+              <w:t>User Story</w:t>
+            </w:r>
+          </w:p>
+        </w:tc>
+        <w:tc>
+          <w:tcPr>
+            <w:tcW w:type="dxa" w:w="1949"/>
+            <w:vAlign w:val="center"/>
+            <w:shd w:val="clear" w:color="auto" w:fill="1F3A5F"/>
+          </w:tcPr>
+          <w:p>
+            <w:r>
+              <w:rPr>
+                <w:b/>
+                <w:color w:val="FFFFFF"/>
+                <w:sz w:val="21"/>
+              </w:rPr>
+              <w:t>Priority</w:t>
+            </w:r>
+          </w:p>
+        </w:tc>
+        <w:tc>
+          <w:tcPr>
+            <w:tcW w:type="dxa" w:w="1949"/>
+            <w:vAlign w:val="center"/>
+            <w:shd w:val="clear" w:color="auto" w:fill="1F3A5F"/>
+          </w:tcPr>
+          <w:p>
+            <w:r>
+              <w:rPr>
+                <w:b/>
+                <w:color w:val="FFFFFF"/>
+                <w:sz w:val="21"/>
+              </w:rPr>
+              <w:t>Acceptance Criteria</w:t>
+            </w:r>
+          </w:p>
+        </w:tc>
+      </w:tr>
+      <w:tr>
+        <w:tc>
+          <w:tcPr>
+            <w:tcW w:type="dxa" w:w="1949"/>
+            <w:vAlign w:val="center"/>
+          </w:tcPr>
+          <w:p>
+            <w:r>
+              <w:t>US-01</w:t>
+            </w:r>
+          </w:p>
+        </w:tc>
+        <w:tc>
+          <w:tcPr>
+            <w:tcW w:type="dxa" w:w="1949"/>
+            <w:vAlign w:val="center"/>
+          </w:tcPr>
+          <w:p>
+            <w:r>
+              <w:t>E1</w:t>
+            </w:r>
+          </w:p>
+        </w:tc>
+        <w:tc>
+          <w:tcPr>
+            <w:tcW w:type="dxa" w:w="1949"/>
+            <w:vAlign w:val="center"/>
+          </w:tcPr>
+          <w:p>
+            <w:r>
+              <w:t>As a Manufacturer, I want to register with PKI so that my identity is trusted</w:t>
+            </w:r>
+          </w:p>
+        </w:tc>
+        <w:tc>
+          <w:tcPr>
+            <w:tcW w:type="dxa" w:w="1949"/>
+            <w:vAlign w:val="center"/>
+          </w:tcPr>
+          <w:p>
+            <w:r>
+              <w:t>High</w:t>
+            </w:r>
+          </w:p>
+        </w:tc>
+        <w:tc>
+          <w:tcPr>
+            <w:tcW w:type="dxa" w:w="1949"/>
+            <w:vAlign w:val="center"/>
+          </w:tcPr>
+          <w:p>
+            <w:r>
+              <w:t>Certificate issued; mTLS works</w:t>
+            </w:r>
+          </w:p>
+        </w:tc>
+      </w:tr>
+      <w:tr>
+        <w:tc>
+          <w:tcPr>
+            <w:tcW w:type="dxa" w:w="1949"/>
+            <w:vAlign w:val="center"/>
+            <w:shd w:val="clear" w:color="auto" w:fill="F7FAFD"/>
+          </w:tcPr>
+          <w:p>
+            <w:r>
+              <w:t>US-02</w:t>
+            </w:r>
+          </w:p>
+        </w:tc>
+        <w:tc>
+          <w:tcPr>
+            <w:tcW w:type="dxa" w:w="1949"/>
+            <w:vAlign w:val="center"/>
+            <w:shd w:val="clear" w:color="auto" w:fill="F7FAFD"/>
+          </w:tcPr>
+          <w:p>
+            <w:r>
+              <w:t>E1</w:t>
+            </w:r>
+          </w:p>
+        </w:tc>
+        <w:tc>
+          <w:tcPr>
+            <w:tcW w:type="dxa" w:w="1949"/>
+            <w:vAlign w:val="center"/>
+            <w:shd w:val="clear" w:color="auto" w:fill="F7FAFD"/>
+          </w:tcPr>
+          <w:p>
+            <w:r>
+              <w:t>As an Admin, I want to onboard an org so that it can join the network</w:t>
+            </w:r>
+          </w:p>
+        </w:tc>
+        <w:tc>
+          <w:tcPr>
+            <w:tcW w:type="dxa" w:w="1949"/>
+            <w:vAlign w:val="center"/>
+            <w:shd w:val="clear" w:color="auto" w:fill="F7FAFD"/>
+          </w:tcPr>
+          <w:p>
+            <w:r>
+              <w:t>High</w:t>
+            </w:r>
+          </w:p>
+        </w:tc>
+        <w:tc>
+          <w:tcPr>
+            <w:tcW w:type="dxa" w:w="1949"/>
+            <w:vAlign w:val="center"/>
+            <w:shd w:val="clear" w:color="auto" w:fill="F7FAFD"/>
+          </w:tcPr>
+          <w:p>
+            <w:r>
+              <w:t>Org has keys and RBAC roles</w:t>
+            </w:r>
+          </w:p>
+        </w:tc>
+      </w:tr>
+      <w:tr>
+        <w:tc>
+          <w:tcPr>
+            <w:tcW w:type="dxa" w:w="1949"/>
+            <w:vAlign w:val="center"/>
+          </w:tcPr>
+          <w:p>
+            <w:r>
+              <w:t>US-03</w:t>
+            </w:r>
+          </w:p>
+        </w:tc>
+        <w:tc>
+          <w:tcPr>
+            <w:tcW w:type="dxa" w:w="1949"/>
+            <w:vAlign w:val="center"/>
+          </w:tcPr>
+          <w:p>
+            <w:r>
+              <w:t>E1</w:t>
+            </w:r>
+          </w:p>
+        </w:tc>
+        <w:tc>
+          <w:tcPr>
+            <w:tcW w:type="dxa" w:w="1949"/>
+            <w:vAlign w:val="center"/>
+          </w:tcPr>
+          <w:p>
+            <w:r>
+              <w:t>As a User, I want MFA so that my account is protected</w:t>
+            </w:r>
+          </w:p>
+        </w:tc>
+        <w:tc>
+          <w:tcPr>
+            <w:tcW w:type="dxa" w:w="1949"/>
+            <w:vAlign w:val="center"/>
+          </w:tcPr>
+          <w:p>
+            <w:r>
+              <w:t>High</w:t>
+            </w:r>
+          </w:p>
+        </w:tc>
+        <w:tc>
+          <w:tcPr>
+            <w:tcW w:type="dxa" w:w="1949"/>
+            <w:vAlign w:val="center"/>
+          </w:tcPr>
+          <w:p>
+            <w:r>
+              <w:t>TOTP required; recovery codes</w:t>
+            </w:r>
+          </w:p>
+        </w:tc>
+      </w:tr>
+      <w:tr>
+        <w:tc>
+          <w:tcPr>
+            <w:tcW w:type="dxa" w:w="1949"/>
+            <w:vAlign w:val="center"/>
+            <w:shd w:val="clear" w:color="auto" w:fill="F7FAFD"/>
+          </w:tcPr>
+          <w:p>
+            <w:r>
+              <w:t>US-04</w:t>
+            </w:r>
+          </w:p>
+        </w:tc>
+        <w:tc>
+          <w:tcPr>
+            <w:tcW w:type="dxa" w:w="1949"/>
+            <w:vAlign w:val="center"/>
+            <w:shd w:val="clear" w:color="auto" w:fill="F7FAFD"/>
+          </w:tcPr>
+          <w:p>
+            <w:r>
+              <w:t>E2</w:t>
+            </w:r>
+          </w:p>
+        </w:tc>
+        <w:tc>
+          <w:tcPr>
+            <w:tcW w:type="dxa" w:w="1949"/>
+            <w:vAlign w:val="center"/>
+            <w:shd w:val="clear" w:color="auto" w:fill="F7FAFD"/>
+          </w:tcPr>
+          <w:p>
+            <w:r>
+              <w:t>As a Manufacturer, I want to register a product with a unique serial so it is traceable</w:t>
+            </w:r>
+          </w:p>
+        </w:tc>
+        <w:tc>
+          <w:tcPr>
+            <w:tcW w:type="dxa" w:w="1949"/>
+            <w:vAlign w:val="center"/>
+            <w:shd w:val="clear" w:color="auto" w:fill="F7FAFD"/>
+          </w:tcPr>
+          <w:p>
+            <w:r>
+              <w:t>High</w:t>
+            </w:r>
+          </w:p>
+        </w:tc>
+        <w:tc>
+          <w:tcPr>
+            <w:tcW w:type="dxa" w:w="1949"/>
+            <w:vAlign w:val="center"/>
+            <w:shd w:val="clear" w:color="auto" w:fill="F7FAFD"/>
+          </w:tcPr>
+          <w:p>
+            <w:r>
+              <w:t>Duplicate serial rejected; ledger entry</w:t>
+            </w:r>
+          </w:p>
+        </w:tc>
+      </w:tr>
+      <w:tr>
+        <w:tc>
+          <w:tcPr>
+            <w:tcW w:type="dxa" w:w="1949"/>
+            <w:vAlign w:val="center"/>
+          </w:tcPr>
+          <w:p>
+            <w:r>
+              <w:t>US-05</w:t>
+            </w:r>
+          </w:p>
+        </w:tc>
+        <w:tc>
+          <w:tcPr>
+            <w:tcW w:type="dxa" w:w="1949"/>
+            <w:vAlign w:val="center"/>
+          </w:tcPr>
+          <w:p>
+            <w:r>
+              <w:t>E2</w:t>
+            </w:r>
+          </w:p>
+        </w:tc>
+        <w:tc>
+          <w:tcPr>
+            <w:tcW w:type="dxa" w:w="1949"/>
+            <w:vAlign w:val="center"/>
+          </w:tcPr>
+          <w:p>
+            <w:r>
+              <w:t>As a Customer, I want to verify product authenticity so I trust my purchase</w:t>
+            </w:r>
+          </w:p>
+        </w:tc>
+        <w:tc>
+          <w:tcPr>
+            <w:tcW w:type="dxa" w:w="1949"/>
+            <w:vAlign w:val="center"/>
+          </w:tcPr>
+          <w:p>
+            <w:r>
+              <w:t>High</w:t>
+            </w:r>
+          </w:p>
+        </w:tc>
+        <w:tc>
+          <w:tcPr>
+            <w:tcW w:type="dxa" w:w="1949"/>
+            <w:vAlign w:val="center"/>
+          </w:tcPr>
+          <w:p>
+            <w:r>
+              <w:t>Signed query returns valid/invalid</w:t>
+            </w:r>
+          </w:p>
+        </w:tc>
+      </w:tr>
+      <w:tr>
+        <w:tc>
+          <w:tcPr>
+            <w:tcW w:type="dxa" w:w="1949"/>
+            <w:vAlign w:val="center"/>
+            <w:shd w:val="clear" w:color="auto" w:fill="F7FAFD"/>
+          </w:tcPr>
+          <w:p>
+            <w:r>
+              <w:t>US-06</w:t>
+            </w:r>
+          </w:p>
+        </w:tc>
+        <w:tc>
+          <w:tcPr>
+            <w:tcW w:type="dxa" w:w="1949"/>
+            <w:vAlign w:val="center"/>
+            <w:shd w:val="clear" w:color="auto" w:fill="F7FAFD"/>
+          </w:tcPr>
+          <w:p>
+            <w:r>
+              <w:t>E3</w:t>
+            </w:r>
+          </w:p>
+        </w:tc>
+        <w:tc>
+          <w:tcPr>
+            <w:tcW w:type="dxa" w:w="1949"/>
+            <w:vAlign w:val="center"/>
+            <w:shd w:val="clear" w:color="auto" w:fill="F7FAFD"/>
+          </w:tcPr>
+          <w:p>
+            <w:r>
+              <w:t>As a Distributor, I want to create a shipment so goods move</w:t>
+            </w:r>
+          </w:p>
+        </w:tc>
+        <w:tc>
+          <w:tcPr>
+            <w:tcW w:type="dxa" w:w="1949"/>
+            <w:vAlign w:val="center"/>
+            <w:shd w:val="clear" w:color="auto" w:fill="F7FAFD"/>
+          </w:tcPr>
+          <w:p>
+            <w:r>
+              <w:t>High</w:t>
+            </w:r>
+          </w:p>
+        </w:tc>
+        <w:tc>
+          <w:tcPr>
+            <w:tcW w:type="dxa" w:w="1949"/>
+            <w:vAlign w:val="center"/>
+            <w:shd w:val="clear" w:color="auto" w:fill="F7FAFD"/>
+          </w:tcPr>
+          <w:p>
+            <w:r>
+              <w:t>Shipment ID + signed record</w:t>
+            </w:r>
+          </w:p>
+        </w:tc>
+      </w:tr>
+      <w:tr>
+        <w:tc>
+          <w:tcPr>
+            <w:tcW w:type="dxa" w:w="1949"/>
+            <w:vAlign w:val="center"/>
+          </w:tcPr>
+          <w:p>
+            <w:r>
+              <w:t>US-07</w:t>
+            </w:r>
+          </w:p>
+        </w:tc>
+        <w:tc>
+          <w:tcPr>
+            <w:tcW w:type="dxa" w:w="1949"/>
+            <w:vAlign w:val="center"/>
+          </w:tcPr>
+          <w:p>
+            <w:r>
+              <w:t>E3</w:t>
+            </w:r>
+          </w:p>
+        </w:tc>
+        <w:tc>
+          <w:tcPr>
+            <w:tcW w:type="dxa" w:w="1949"/>
+            <w:vAlign w:val="center"/>
+          </w:tcPr>
+          <w:p>
+            <w:r>
+              <w:t>As a Warehouse, I want to confirm receipt so chain of custody continues</w:t>
+            </w:r>
+          </w:p>
+        </w:tc>
+        <w:tc>
+          <w:tcPr>
+            <w:tcW w:type="dxa" w:w="1949"/>
+            <w:vAlign w:val="center"/>
+          </w:tcPr>
+          <w:p>
+            <w:r>
+              <w:t>High</w:t>
+            </w:r>
+          </w:p>
+        </w:tc>
+        <w:tc>
+          <w:tcPr>
+            <w:tcW w:type="dxa" w:w="1949"/>
+            <w:vAlign w:val="center"/>
+          </w:tcPr>
+          <w:p>
+            <w:r>
+              <w:t>Seal hash verified; audit logged</w:t>
+            </w:r>
+          </w:p>
+        </w:tc>
+      </w:tr>
+      <w:tr>
+        <w:tc>
+          <w:tcPr>
+            <w:tcW w:type="dxa" w:w="1949"/>
+            <w:vAlign w:val="center"/>
+            <w:shd w:val="clear" w:color="auto" w:fill="F7FAFD"/>
+          </w:tcPr>
+          <w:p>
+            <w:r>
+              <w:t>US-08</w:t>
+            </w:r>
+          </w:p>
+        </w:tc>
+        <w:tc>
+          <w:tcPr>
+            <w:tcW w:type="dxa" w:w="1949"/>
+            <w:vAlign w:val="center"/>
+            <w:shd w:val="clear" w:color="auto" w:fill="F7FAFD"/>
+          </w:tcPr>
+          <w:p>
+            <w:r>
+              <w:t>E3</w:t>
+            </w:r>
+          </w:p>
+        </w:tc>
+        <w:tc>
+          <w:tcPr>
+            <w:tcW w:type="dxa" w:w="1949"/>
+            <w:vAlign w:val="center"/>
+            <w:shd w:val="clear" w:color="auto" w:fill="F7FAFD"/>
+          </w:tcPr>
+          <w:p>
+            <w:r>
+              <w:t>As a Retailer, I want to confirm delivery so the sale is complete</w:t>
+            </w:r>
+          </w:p>
+        </w:tc>
+        <w:tc>
+          <w:tcPr>
+            <w:tcW w:type="dxa" w:w="1949"/>
+            <w:vAlign w:val="center"/>
+            <w:shd w:val="clear" w:color="auto" w:fill="F7FAFD"/>
+          </w:tcPr>
+          <w:p>
+            <w:r>
+              <w:t>High</w:t>
+            </w:r>
+          </w:p>
+        </w:tc>
+        <w:tc>
+          <w:tcPr>
+            <w:tcW w:type="dxa" w:w="1949"/>
+            <w:vAlign w:val="center"/>
+            <w:shd w:val="clear" w:color="auto" w:fill="F7FAFD"/>
+          </w:tcPr>
+          <w:p>
+            <w:r>
+              <w:t>Delivery record + notification</w:t>
+            </w:r>
+          </w:p>
+        </w:tc>
+      </w:tr>
+      <w:tr>
+        <w:tc>
+          <w:tcPr>
+            <w:tcW w:type="dxa" w:w="1949"/>
+            <w:vAlign w:val="center"/>
+          </w:tcPr>
+          <w:p>
+            <w:r>
+              <w:t>US-09</w:t>
+            </w:r>
+          </w:p>
+        </w:tc>
+        <w:tc>
+          <w:tcPr>
+            <w:tcW w:type="dxa" w:w="1949"/>
+            <w:vAlign w:val="center"/>
+          </w:tcPr>
+          <w:p>
+            <w:r>
+              <w:t>E4</w:t>
+            </w:r>
+          </w:p>
+        </w:tc>
+        <w:tc>
+          <w:tcPr>
+            <w:tcW w:type="dxa" w:w="1949"/>
+            <w:vAlign w:val="center"/>
+          </w:tcPr>
+          <w:p>
+            <w:r>
+              <w:t>As a Distributor, I want to transfer ownership so legal title moves</w:t>
+            </w:r>
+          </w:p>
+        </w:tc>
+        <w:tc>
+          <w:tcPr>
+            <w:tcW w:type="dxa" w:w="1949"/>
+            <w:vAlign w:val="center"/>
+          </w:tcPr>
+          <w:p>
+            <w:r>
+              <w:t>High</w:t>
+            </w:r>
+          </w:p>
+        </w:tc>
+        <w:tc>
+          <w:tcPr>
+            <w:tcW w:type="dxa" w:w="1949"/>
+            <w:vAlign w:val="center"/>
+          </w:tcPr>
+          <w:p>
+            <w:r>
+              <w:t>Signature verified; ledger updated</w:t>
+            </w:r>
+          </w:p>
+        </w:tc>
+      </w:tr>
+      <w:tr>
+        <w:tc>
+          <w:tcPr>
+            <w:tcW w:type="dxa" w:w="1949"/>
+            <w:vAlign w:val="center"/>
+            <w:shd w:val="clear" w:color="auto" w:fill="F7FAFD"/>
+          </w:tcPr>
+          <w:p>
+            <w:r>
+              <w:t>US-10</w:t>
+            </w:r>
+          </w:p>
+        </w:tc>
+        <w:tc>
+          <w:tcPr>
+            <w:tcW w:type="dxa" w:w="1949"/>
+            <w:vAlign w:val="center"/>
+            <w:shd w:val="clear" w:color="auto" w:fill="F7FAFD"/>
+          </w:tcPr>
+          <w:p>
+            <w:r>
+              <w:t>E5</w:t>
+            </w:r>
+          </w:p>
+        </w:tc>
+        <w:tc>
+          <w:tcPr>
+            <w:tcW w:type="dxa" w:w="1949"/>
+            <w:vAlign w:val="center"/>
+            <w:shd w:val="clear" w:color="auto" w:fill="F7FAFD"/>
+          </w:tcPr>
+          <w:p>
+            <w:r>
+              <w:t>As an Auditor, I want to view immutable audit logs so I can investigate</w:t>
+            </w:r>
+          </w:p>
+        </w:tc>
+        <w:tc>
+          <w:tcPr>
+            <w:tcW w:type="dxa" w:w="1949"/>
+            <w:vAlign w:val="center"/>
+            <w:shd w:val="clear" w:color="auto" w:fill="F7FAFD"/>
+          </w:tcPr>
+          <w:p>
+            <w:r>
+              <w:t>High</w:t>
+            </w:r>
+          </w:p>
+        </w:tc>
+        <w:tc>
+          <w:tcPr>
+            <w:tcW w:type="dxa" w:w="1949"/>
+            <w:vAlign w:val="center"/>
+            <w:shd w:val="clear" w:color="auto" w:fill="F7FAFD"/>
+          </w:tcPr>
+          <w:p>
+            <w:r>
+              <w:t>Read-only; hash verified</w:t>
+            </w:r>
+          </w:p>
+        </w:tc>
+      </w:tr>
+      <w:tr>
+        <w:tc>
+          <w:tcPr>
+            <w:tcW w:type="dxa" w:w="1949"/>
+            <w:vAlign w:val="center"/>
+          </w:tcPr>
+          <w:p>
+            <w:r>
+              <w:t>US-11</w:t>
+            </w:r>
+          </w:p>
+        </w:tc>
+        <w:tc>
+          <w:tcPr>
+            <w:tcW w:type="dxa" w:w="1949"/>
+            <w:vAlign w:val="center"/>
+          </w:tcPr>
+          <w:p>
+            <w:r>
+              <w:t>E5</w:t>
+            </w:r>
+          </w:p>
+        </w:tc>
+        <w:tc>
+          <w:tcPr>
+            <w:tcW w:type="dxa" w:w="1949"/>
+            <w:vAlign w:val="center"/>
+          </w:tcPr>
+          <w:p>
+            <w:r>
+              <w:t>As a Security Officer, I want anomaly alerts so fraud is detected</w:t>
+            </w:r>
+          </w:p>
+        </w:tc>
+        <w:tc>
+          <w:tcPr>
+            <w:tcW w:type="dxa" w:w="1949"/>
+            <w:vAlign w:val="center"/>
+          </w:tcPr>
+          <w:p>
+            <w:r>
+              <w:t>Medium</w:t>
+            </w:r>
+          </w:p>
+        </w:tc>
+        <w:tc>
+          <w:tcPr>
+            <w:tcW w:type="dxa" w:w="1949"/>
+            <w:vAlign w:val="center"/>
+          </w:tcPr>
+          <w:p>
+            <w:r>
+              <w:t>Alert on duplicate/odd transfer</w:t>
+            </w:r>
+          </w:p>
+        </w:tc>
+      </w:tr>
+      <w:tr>
+        <w:tc>
+          <w:tcPr>
+            <w:tcW w:type="dxa" w:w="1949"/>
+            <w:vAlign w:val="center"/>
+            <w:shd w:val="clear" w:color="auto" w:fill="F7FAFD"/>
+          </w:tcPr>
+          <w:p>
+            <w:r>
+              <w:t>US-12</w:t>
+            </w:r>
+          </w:p>
+        </w:tc>
+        <w:tc>
+          <w:tcPr>
+            <w:tcW w:type="dxa" w:w="1949"/>
+            <w:vAlign w:val="center"/>
+            <w:shd w:val="clear" w:color="auto" w:fill="F7FAFD"/>
+          </w:tcPr>
+          <w:p>
+            <w:r>
+              <w:t>E3</w:t>
+            </w:r>
+          </w:p>
+        </w:tc>
+        <w:tc>
+          <w:tcPr>
+            <w:tcW w:type="dxa" w:w="1949"/>
+            <w:vAlign w:val="center"/>
+            <w:shd w:val="clear" w:color="auto" w:fill="F7FAFD"/>
+          </w:tcPr>
+          <w:p>
+            <w:r>
+              <w:t>As a Distributor, I want real-time status so I can plan logistics</w:t>
+            </w:r>
+          </w:p>
+        </w:tc>
+        <w:tc>
+          <w:tcPr>
+            <w:tcW w:type="dxa" w:w="1949"/>
+            <w:vAlign w:val="center"/>
+            <w:shd w:val="clear" w:color="auto" w:fill="F7FAFD"/>
+          </w:tcPr>
+          <w:p>
+            <w:r>
+              <w:t>Medium</w:t>
+            </w:r>
+          </w:p>
+        </w:tc>
+        <w:tc>
+          <w:tcPr>
+            <w:tcW w:type="dxa" w:w="1949"/>
+            <w:vAlign w:val="center"/>
+            <w:shd w:val="clear" w:color="auto" w:fill="F7FAFD"/>
+          </w:tcPr>
+          <w:p>
+            <w:r>
+              <w:t>Status &lt; 1s; push notifications</w:t>
+            </w:r>
+          </w:p>
+        </w:tc>
+      </w:tr>
+    </w:tbl>
+    <w:p>
+      <w:pPr>
+        <w:pStyle w:val="Heading2"/>
+        <w:spacing w:before="240" w:after="120"/>
+      </w:pPr>
+      <w:r>
+        <w:rPr>
+          <w:rFonts w:ascii="Calibri" w:hAnsi="Calibri"/>
+          <w:b/>
+          <w:color w:val="2E74B5"/>
+          <w:sz w:val="30"/>
+        </w:rPr>
+        <w:t>9.3 Jira Scrum Project Setup</w:t>
+      </w:r>
+    </w:p>
+    <w:p>
+      <w:pPr>
+        <w:pStyle w:val="ListBullet"/>
+      </w:pPr>
+      <w:r>
+        <w:t>Project key: SCM-SEC</w:t>
+      </w:r>
+    </w:p>
+    <w:p>
+      <w:pPr>
+        <w:pStyle w:val="ListBullet"/>
+      </w:pPr>
+      <w:r>
+        <w:t>Board type: Scrum</w:t>
+      </w:r>
+    </w:p>
+    <w:p>
+      <w:pPr>
+        <w:pStyle w:val="ListBullet"/>
+      </w:pPr>
+      <w:r>
+        <w:t>Epics: E1..E5</w:t>
+      </w:r>
+    </w:p>
+    <w:p>
+      <w:pPr>
+        <w:pStyle w:val="ListBullet"/>
+      </w:pPr>
+      <w:r>
+        <w:t>Stories: US-01..US-12</w:t>
+      </w:r>
+    </w:p>
+    <w:p>
+      <w:pPr>
+        <w:pStyle w:val="ListBullet"/>
+      </w:pPr>
+      <w:r>
+        <w:t>Tasks per story: design, code, test, security review</w:t>
+      </w:r>
+    </w:p>
+    <w:p>
+      <w:pPr>
+        <w:pStyle w:val="ListBullet"/>
+      </w:pPr>
+      <w:r>
+        <w:t>Workflow: TO DO -&gt; IN PROGRESS -&gt; TESTING -&gt; DONE</w:t>
+      </w:r>
+    </w:p>
+    <w:p>
+      <w:pPr>
+        <w:pStyle w:val="Heading2"/>
+        <w:spacing w:before="240" w:after="120"/>
+      </w:pPr>
+      <w:r>
+        <w:rPr>
+          <w:rFonts w:ascii="Calibri" w:hAnsi="Calibri"/>
+          <w:b/>
+          <w:color w:val="2E74B5"/>
+          <w:sz w:val="30"/>
+        </w:rPr>
+        <w:t>9.4 Sprint Plan</w:t>
+      </w:r>
+    </w:p>
+    <w:tbl>
+      <w:tblPr>
+        <w:tblStyle w:val="TableGrid"/>
+        <w:tblW w:type="auto" w:w="0"/>
+        <w:jc w:val="center"/>
+        <w:tblLayout w:type="autofit"/>
+        <w:tblLook w:firstColumn="1" w:firstRow="1" w:lastColumn="0" w:lastRow="0" w:noHBand="0" w:noVBand="1" w:val="04A0"/>
+      </w:tblPr>
+      <w:tblGrid>
+        <w:gridCol w:w="3249"/>
+        <w:gridCol w:w="3249"/>
+        <w:gridCol w:w="3249"/>
+      </w:tblGrid>
+      <w:tr>
+        <w:tc>
+          <w:tcPr>
+            <w:tcW w:type="dxa" w:w="3249"/>
+            <w:vAlign w:val="center"/>
+            <w:shd w:val="clear" w:color="auto" w:fill="1F3A5F"/>
+          </w:tcPr>
+          <w:p>
+            <w:r>
+              <w:rPr>
+                <w:b/>
+                <w:color w:val="FFFFFF"/>
+                <w:sz w:val="21"/>
+              </w:rPr>
+              <w:t>Sprint</w:t>
+            </w:r>
+          </w:p>
+        </w:tc>
+        <w:tc>
+          <w:tcPr>
+            <w:tcW w:type="dxa" w:w="3249"/>
+            <w:vAlign w:val="center"/>
+            <w:shd w:val="clear" w:color="auto" w:fill="1F3A5F"/>
+          </w:tcPr>
+          <w:p>
+            <w:r>
+              <w:rPr>
+                <w:b/>
+                <w:color w:val="FFFFFF"/>
+                <w:sz w:val="21"/>
+              </w:rPr>
+              <w:t>Sprint Goal</w:t>
+            </w:r>
+          </w:p>
+        </w:tc>
+        <w:tc>
+          <w:tcPr>
+            <w:tcW w:type="dxa" w:w="3249"/>
+            <w:vAlign w:val="center"/>
+            <w:shd w:val="clear" w:color="auto" w:fill="1F3A5F"/>
+          </w:tcPr>
+          <w:p>
+            <w:r>
+              <w:rPr>
+                <w:b/>
+                <w:color w:val="FFFFFF"/>
+                <w:sz w:val="21"/>
+              </w:rPr>
+              <w:t>Stories</w:t>
+            </w:r>
+          </w:p>
+        </w:tc>
+      </w:tr>
+      <w:tr>
+        <w:tc>
+          <w:tcPr>
+            <w:tcW w:type="dxa" w:w="3249"/>
+            <w:vAlign w:val="center"/>
+          </w:tcPr>
+          <w:p>
+            <w:r>
+              <w:t>Sprint 1 (2 weeks)</w:t>
+            </w:r>
+          </w:p>
+        </w:tc>
+        <w:tc>
+          <w:tcPr>
+            <w:tcW w:type="dxa" w:w="3249"/>
+            <w:vAlign w:val="center"/>
+          </w:tcPr>
+          <w:p>
+            <w:r>
+              <w:t>Secure Foundation - Identity, Product, Audit</w:t>
+            </w:r>
+          </w:p>
+        </w:tc>
+        <w:tc>
+          <w:tcPr>
+            <w:tcW w:type="dxa" w:w="3249"/>
+            <w:vAlign w:val="center"/>
+          </w:tcPr>
+          <w:p>
+            <w:r>
+              <w:t>US-01, US-02, US-03, US-04, US-10</w:t>
+            </w:r>
+          </w:p>
+        </w:tc>
+      </w:tr>
+      <w:tr>
+        <w:tc>
+          <w:tcPr>
+            <w:tcW w:type="dxa" w:w="3249"/>
+            <w:vAlign w:val="center"/>
+            <w:shd w:val="clear" w:color="auto" w:fill="F7FAFD"/>
+          </w:tcPr>
+          <w:p>
+            <w:r>
+              <w:t>Sprint 2 (2 weeks)</w:t>
+            </w:r>
+          </w:p>
+        </w:tc>
+        <w:tc>
+          <w:tcPr>
+            <w:tcW w:type="dxa" w:w="3249"/>
+            <w:vAlign w:val="center"/>
+            <w:shd w:val="clear" w:color="auto" w:fill="F7FAFD"/>
+          </w:tcPr>
+          <w:p>
+            <w:r>
+              <w:t>Logistics and Ownership - Shipments, Receipts, Transfers, Anomaly</w:t>
+            </w:r>
+          </w:p>
+        </w:tc>
+        <w:tc>
+          <w:tcPr>
+            <w:tcW w:type="dxa" w:w="3249"/>
+            <w:vAlign w:val="center"/>
+            <w:shd w:val="clear" w:color="auto" w:fill="F7FAFD"/>
+          </w:tcPr>
+          <w:p>
+            <w:r>
+              <w:t>US-05, US-06, US-07, US-08, US-09, US-11, US-12</w:t>
+            </w:r>
+          </w:p>
+        </w:tc>
+      </w:tr>
+    </w:tbl>
+    <w:p>
+      <w:r>
+        <w:br w:type="page"/>
+      </w:r>
+    </w:p>
+    <w:p>
+      <w:pPr>
+        <w:pStyle w:val="Heading1"/>
+        <w:spacing w:before="360" w:after="160"/>
+      </w:pPr>
+      <w:r>
+        <w:rPr>
+          <w:rFonts w:ascii="Calibri" w:hAnsi="Calibri"/>
+          <w:b/>
+          <w:color w:val="1F3A5F"/>
+          <w:sz w:val="40"/>
+        </w:rPr>
+        <w:t>Phase 10 - Sprint Execution and Scrum Metrics</w:t>
+      </w:r>
+    </w:p>
+    <w:p>
+      <w:pPr>
+        <w:pStyle w:val="Heading2"/>
+        <w:spacing w:before="240" w:after="120"/>
+      </w:pPr>
+      <w:r>
+        <w:rPr>
+          <w:rFonts w:ascii="Calibri" w:hAnsi="Calibri"/>
+          <w:b/>
+          <w:color w:val="2E74B5"/>
+          <w:sz w:val="30"/>
+        </w:rPr>
+        <w:t>10.1 Sprint Board (Sprint 2)</w:t>
+      </w:r>
+    </w:p>
+    <w:tbl>
+      <w:tblPr>
+        <w:tblStyle w:val="TableGrid"/>
+        <w:tblW w:type="auto" w:w="0"/>
+        <w:jc w:val="center"/>
+        <w:tblLayout w:type="autofit"/>
+        <w:tblLook w:firstColumn="1" w:firstRow="1" w:lastColumn="0" w:lastRow="0" w:noHBand="0" w:noVBand="1" w:val="04A0"/>
+      </w:tblPr>
+      <w:tblGrid>
+        <w:gridCol w:w="2436"/>
+        <w:gridCol w:w="2436"/>
+        <w:gridCol w:w="2436"/>
+        <w:gridCol w:w="2436"/>
+      </w:tblGrid>
+      <w:tr>
+        <w:tc>
+          <w:tcPr>
+            <w:tcW w:type="dxa" w:w="2436"/>
+            <w:vAlign w:val="center"/>
+            <w:shd w:val="clear" w:color="auto" w:fill="1F3A5F"/>
+          </w:tcPr>
+          <w:p>
+            <w:r>
+              <w:rPr>
+                <w:b/>
+                <w:color w:val="FFFFFF"/>
+                <w:sz w:val="21"/>
+              </w:rPr>
+              <w:t>TO DO</w:t>
+            </w:r>
+          </w:p>
+        </w:tc>
+        <w:tc>
+          <w:tcPr>
+            <w:tcW w:type="dxa" w:w="2436"/>
+            <w:vAlign w:val="center"/>
+            <w:shd w:val="clear" w:color="auto" w:fill="1F3A5F"/>
+          </w:tcPr>
+          <w:p>
+            <w:r>
+              <w:rPr>
+                <w:b/>
+                <w:color w:val="FFFFFF"/>
+                <w:sz w:val="21"/>
+              </w:rPr>
+              <w:t>IN PROGRESS</w:t>
+            </w:r>
+          </w:p>
+        </w:tc>
+        <w:tc>
+          <w:tcPr>
+            <w:tcW w:type="dxa" w:w="2436"/>
+            <w:vAlign w:val="center"/>
+            <w:shd w:val="clear" w:color="auto" w:fill="1F3A5F"/>
+          </w:tcPr>
+          <w:p>
+            <w:r>
+              <w:rPr>
+                <w:b/>
+                <w:color w:val="FFFFFF"/>
+                <w:sz w:val="21"/>
+              </w:rPr>
+              <w:t>TESTING</w:t>
+            </w:r>
+          </w:p>
+        </w:tc>
+        <w:tc>
+          <w:tcPr>
+            <w:tcW w:type="dxa" w:w="2436"/>
+            <w:vAlign w:val="center"/>
+            <w:shd w:val="clear" w:color="auto" w:fill="1F3A5F"/>
+          </w:tcPr>
+          <w:p>
+            <w:r>
+              <w:rPr>
+                <w:b/>
+                <w:color w:val="FFFFFF"/>
+                <w:sz w:val="21"/>
+              </w:rPr>
+              <w:t>DONE</w:t>
+            </w:r>
+          </w:p>
+        </w:tc>
+      </w:tr>
+      <w:tr>
+        <w:tc>
+          <w:tcPr>
+            <w:tcW w:type="dxa" w:w="2436"/>
+            <w:vAlign w:val="center"/>
+          </w:tcPr>
+          <w:p>
+            <w:r>
+              <w:t>US-12</w:t>
+            </w:r>
+          </w:p>
+        </w:tc>
+        <w:tc>
+          <w:tcPr>
+            <w:tcW w:type="dxa" w:w="2436"/>
+            <w:vAlign w:val="center"/>
+          </w:tcPr>
+          <w:p>
+            <w:r>
+              <w:t>US-08</w:t>
+            </w:r>
+          </w:p>
+        </w:tc>
+        <w:tc>
+          <w:tcPr>
+            <w:tcW w:type="dxa" w:w="2436"/>
+            <w:vAlign w:val="center"/>
+          </w:tcPr>
+          <w:p>
+            <w:r>
+              <w:t>US-07</w:t>
+            </w:r>
+          </w:p>
+        </w:tc>
+        <w:tc>
+          <w:tcPr>
+            <w:tcW w:type="dxa" w:w="2436"/>
+            <w:vAlign w:val="center"/>
+          </w:tcPr>
+          <w:p>
+            <w:r>
+              <w:t>US-05, US-06</w:t>
+            </w:r>
+          </w:p>
+        </w:tc>
+      </w:tr>
+      <w:tr>
+        <w:tc>
+          <w:tcPr>
+            <w:tcW w:type="dxa" w:w="2436"/>
+            <w:vAlign w:val="center"/>
+            <w:shd w:val="clear" w:color="auto" w:fill="F7FAFD"/>
+          </w:tcPr>
+          <w:p>
+            <w:r>
+              <w:t>-</w:t>
+            </w:r>
+          </w:p>
+        </w:tc>
+        <w:tc>
+          <w:tcPr>
+            <w:tcW w:type="dxa" w:w="2436"/>
+            <w:vAlign w:val="center"/>
+            <w:shd w:val="clear" w:color="auto" w:fill="F7FAFD"/>
+          </w:tcPr>
+          <w:p>
+            <w:r>
+              <w:t>-</w:t>
+            </w:r>
+          </w:p>
+        </w:tc>
+        <w:tc>
+          <w:tcPr>
+            <w:tcW w:type="dxa" w:w="2436"/>
+            <w:vAlign w:val="center"/>
+            <w:shd w:val="clear" w:color="auto" w:fill="F7FAFD"/>
+          </w:tcPr>
+          <w:p>
+            <w:r>
+              <w:t>US-11</w:t>
+            </w:r>
+          </w:p>
+        </w:tc>
+        <w:tc>
+          <w:tcPr>
+            <w:tcW w:type="dxa" w:w="2436"/>
+            <w:vAlign w:val="center"/>
+            <w:shd w:val="clear" w:color="auto" w:fill="F7FAFD"/>
+          </w:tcPr>
+          <w:p>
+            <w:r>
+              <w:t>-</w:t>
+            </w:r>
+          </w:p>
+        </w:tc>
+      </w:tr>
+    </w:tbl>
+    <w:p>
+      <w:pPr>
+        <w:pStyle w:val="Heading2"/>
+        <w:spacing w:before="240" w:after="120"/>
+      </w:pPr>
+      <w:r>
+        <w:rPr>
+          <w:rFonts w:ascii="Calibri" w:hAnsi="Calibri"/>
+          <w:b/>
+          <w:color w:val="2E74B5"/>
+          <w:sz w:val="30"/>
+        </w:rPr>
+        <w:t>10.2 Daily Scrum Entry (Day 3)</w:t>
+      </w:r>
+    </w:p>
+    <w:tbl>
+      <w:tblPr>
+        <w:tblStyle w:val="TableGrid"/>
+        <w:tblW w:type="auto" w:w="0"/>
+        <w:jc w:val="center"/>
+        <w:tblLayout w:type="autofit"/>
+        <w:tblLook w:firstColumn="1" w:firstRow="1" w:lastColumn="0" w:lastRow="0" w:noHBand="0" w:noVBand="1" w:val="04A0"/>
+      </w:tblPr>
+      <w:tblGrid>
+        <w:gridCol w:w="2436"/>
+        <w:gridCol w:w="2436"/>
+        <w:gridCol w:w="2436"/>
+        <w:gridCol w:w="2436"/>
+      </w:tblGrid>
+      <w:tr>
+        <w:tc>
+          <w:tcPr>
+            <w:tcW w:type="dxa" w:w="2436"/>
+            <w:vAlign w:val="center"/>
+            <w:shd w:val="clear" w:color="auto" w:fill="1F3A5F"/>
+          </w:tcPr>
+          <w:p>
+            <w:r>
+              <w:rPr>
+                <w:b/>
+                <w:color w:val="FFFFFF"/>
+                <w:sz w:val="21"/>
+              </w:rPr>
+              <w:t>Member</w:t>
+            </w:r>
+          </w:p>
+        </w:tc>
+        <w:tc>
+          <w:tcPr>
+            <w:tcW w:type="dxa" w:w="2436"/>
+            <w:vAlign w:val="center"/>
+            <w:shd w:val="clear" w:color="auto" w:fill="1F3A5F"/>
+          </w:tcPr>
+          <w:p>
+            <w:r>
+              <w:rPr>
+                <w:b/>
+                <w:color w:val="FFFFFF"/>
+                <w:sz w:val="21"/>
+              </w:rPr>
+              <w:t>Yesterday</w:t>
+            </w:r>
+          </w:p>
+        </w:tc>
+        <w:tc>
+          <w:tcPr>
+            <w:tcW w:type="dxa" w:w="2436"/>
+            <w:vAlign w:val="center"/>
+            <w:shd w:val="clear" w:color="auto" w:fill="1F3A5F"/>
+          </w:tcPr>
+          <w:p>
+            <w:r>
+              <w:rPr>
+                <w:b/>
+                <w:color w:val="FFFFFF"/>
+                <w:sz w:val="21"/>
+              </w:rPr>
+              <w:t>Today</w:t>
+            </w:r>
+          </w:p>
+        </w:tc>
+        <w:tc>
+          <w:tcPr>
+            <w:tcW w:type="dxa" w:w="2436"/>
+            <w:vAlign w:val="center"/>
+            <w:shd w:val="clear" w:color="auto" w:fill="1F3A5F"/>
+          </w:tcPr>
+          <w:p>
+            <w:r>
+              <w:rPr>
+                <w:b/>
+                <w:color w:val="FFFFFF"/>
+                <w:sz w:val="21"/>
+              </w:rPr>
+              <w:t>Blockers</w:t>
+            </w:r>
+          </w:p>
+        </w:tc>
+      </w:tr>
+      <w:tr>
+        <w:tc>
+          <w:tcPr>
+            <w:tcW w:type="dxa" w:w="2436"/>
+            <w:vAlign w:val="center"/>
+          </w:tcPr>
+          <w:p>
+            <w:r>
+              <w:t>Dev A</w:t>
+            </w:r>
+          </w:p>
+        </w:tc>
+        <w:tc>
+          <w:tcPr>
+            <w:tcW w:type="dxa" w:w="2436"/>
+            <w:vAlign w:val="center"/>
+          </w:tcPr>
+          <w:p>
+            <w:r>
+              <w:t>Finished US-06</w:t>
+            </w:r>
+          </w:p>
+        </w:tc>
+        <w:tc>
+          <w:tcPr>
+            <w:tcW w:type="dxa" w:w="2436"/>
+            <w:vAlign w:val="center"/>
+          </w:tcPr>
+          <w:p>
+            <w:r>
+              <w:t>Start US-07</w:t>
+            </w:r>
+          </w:p>
+        </w:tc>
+        <w:tc>
+          <w:tcPr>
+            <w:tcW w:type="dxa" w:w="2436"/>
+            <w:vAlign w:val="center"/>
+          </w:tcPr>
+          <w:p>
+            <w:r>
+              <w:t>None</w:t>
+            </w:r>
+          </w:p>
+        </w:tc>
+      </w:tr>
+      <w:tr>
+        <w:tc>
+          <w:tcPr>
+            <w:tcW w:type="dxa" w:w="2436"/>
+            <w:vAlign w:val="center"/>
+            <w:shd w:val="clear" w:color="auto" w:fill="F7FAFD"/>
+          </w:tcPr>
+          <w:p>
+            <w:r>
+              <w:t>Dev B</w:t>
+            </w:r>
+          </w:p>
+        </w:tc>
+        <w:tc>
+          <w:tcPr>
+            <w:tcW w:type="dxa" w:w="2436"/>
+            <w:vAlign w:val="center"/>
+            <w:shd w:val="clear" w:color="auto" w:fill="F7FAFD"/>
+          </w:tcPr>
+          <w:p>
+            <w:r>
+              <w:t>US-09 signature logic</w:t>
+            </w:r>
+          </w:p>
+        </w:tc>
+        <w:tc>
+          <w:tcPr>
+            <w:tcW w:type="dxa" w:w="2436"/>
+            <w:vAlign w:val="center"/>
+            <w:shd w:val="clear" w:color="auto" w:fill="F7FAFD"/>
+          </w:tcPr>
+          <w:p>
+            <w:r>
+              <w:t>Unit tests for US-09</w:t>
+            </w:r>
+          </w:p>
+        </w:tc>
+        <w:tc>
+          <w:tcPr>
+            <w:tcW w:type="dxa" w:w="2436"/>
+            <w:vAlign w:val="center"/>
+            <w:shd w:val="clear" w:color="auto" w:fill="F7FAFD"/>
+          </w:tcPr>
+          <w:p>
+            <w:r>
+              <w:t>HSM access pending</w:t>
+            </w:r>
+          </w:p>
+        </w:tc>
+      </w:tr>
+      <w:tr>
+        <w:tc>
+          <w:tcPr>
+            <w:tcW w:type="dxa" w:w="2436"/>
+            <w:vAlign w:val="center"/>
+          </w:tcPr>
+          <w:p>
+            <w:r>
+              <w:t>QA</w:t>
+            </w:r>
+          </w:p>
+        </w:tc>
+        <w:tc>
+          <w:tcPr>
+            <w:tcW w:type="dxa" w:w="2436"/>
+            <w:vAlign w:val="center"/>
+          </w:tcPr>
+          <w:p>
+            <w:r>
+              <w:t>Test plan for US-05</w:t>
+            </w:r>
+          </w:p>
+        </w:tc>
+        <w:tc>
+          <w:tcPr>
+            <w:tcW w:type="dxa" w:w="2436"/>
+            <w:vAlign w:val="center"/>
+          </w:tcPr>
+          <w:p>
+            <w:r>
+              <w:t>Execute US-05 tests</w:t>
+            </w:r>
+          </w:p>
+        </w:tc>
+        <w:tc>
+          <w:tcPr>
+            <w:tcW w:type="dxa" w:w="2436"/>
+            <w:vAlign w:val="center"/>
+          </w:tcPr>
+          <w:p>
+            <w:r>
+              <w:t>None</w:t>
+            </w:r>
+          </w:p>
+        </w:tc>
+      </w:tr>
+      <w:tr>
+        <w:tc>
+          <w:tcPr>
+            <w:tcW w:type="dxa" w:w="2436"/>
+            <w:vAlign w:val="center"/>
+            <w:shd w:val="clear" w:color="auto" w:fill="F7FAFD"/>
+          </w:tcPr>
+          <w:p>
+            <w:r>
+              <w:t>Security</w:t>
+            </w:r>
+          </w:p>
+        </w:tc>
+        <w:tc>
+          <w:tcPr>
+            <w:tcW w:type="dxa" w:w="2436"/>
+            <w:vAlign w:val="center"/>
+            <w:shd w:val="clear" w:color="auto" w:fill="F7FAFD"/>
+          </w:tcPr>
+          <w:p>
+            <w:r>
+              <w:t>Threat review US-09</w:t>
+            </w:r>
+          </w:p>
+        </w:tc>
+        <w:tc>
+          <w:tcPr>
+            <w:tcW w:type="dxa" w:w="2436"/>
+            <w:vAlign w:val="center"/>
+            <w:shd w:val="clear" w:color="auto" w:fill="F7FAFD"/>
+          </w:tcPr>
+          <w:p>
+            <w:r>
+              <w:t>STRIDE recheck</w:t>
+            </w:r>
+          </w:p>
+        </w:tc>
+        <w:tc>
+          <w:tcPr>
+            <w:tcW w:type="dxa" w:w="2436"/>
+            <w:vAlign w:val="center"/>
+            <w:shd w:val="clear" w:color="auto" w:fill="F7FAFD"/>
+          </w:tcPr>
+          <w:p>
+            <w:r>
+              <w:t>None</w:t>
+            </w:r>
+          </w:p>
+        </w:tc>
+      </w:tr>
+    </w:tbl>
+    <w:p>
+      <w:pPr>
+        <w:pStyle w:val="Heading2"/>
+        <w:spacing w:before="240" w:after="120"/>
+      </w:pPr>
+      <w:r>
+        <w:rPr>
+          <w:rFonts w:ascii="Calibri" w:hAnsi="Calibri"/>
+          <w:b/>
+          <w:color w:val="2E74B5"/>
+          <w:sz w:val="30"/>
+        </w:rPr>
+        <w:t>10.3 Sprint Burndown Chart</w:t>
+      </w:r>
+    </w:p>
+    <w:p>
+      <w:r>
+        <w:t>Sprint 2 started with 20 story points. The actual line tracks the ideal line with a slight under-burn that resulted in a 2 SP carry-over.</w:t>
+      </w:r>
+    </w:p>
+    <w:tbl>
+      <w:tblPr>
+        <w:tblStyle w:val="TableGrid"/>
+        <w:tblW w:type="auto" w:w="0"/>
+        <w:jc w:val="center"/>
+        <w:tblLayout w:type="autofit"/>
+        <w:tblLook w:firstColumn="1" w:firstRow="1" w:lastColumn="0" w:lastRow="0" w:noHBand="0" w:noVBand="1" w:val="04A0"/>
+      </w:tblPr>
+      <w:tblGrid>
+        <w:gridCol w:w="3249"/>
+        <w:gridCol w:w="3249"/>
+        <w:gridCol w:w="3249"/>
+      </w:tblGrid>
+      <w:tr>
+        <w:tc>
+          <w:tcPr>
+            <w:tcW w:type="dxa" w:w="3249"/>
+            <w:vAlign w:val="center"/>
+            <w:shd w:val="clear" w:color="auto" w:fill="1F3A5F"/>
+          </w:tcPr>
+          <w:p>
+            <w:r>
+              <w:rPr>
+                <w:b/>
+                <w:color w:val="FFFFFF"/>
+                <w:sz w:val="21"/>
+              </w:rPr>
+              <w:t>Day</w:t>
+            </w:r>
+          </w:p>
+        </w:tc>
+        <w:tc>
+          <w:tcPr>
+            <w:tcW w:type="dxa" w:w="3249"/>
+            <w:vAlign w:val="center"/>
+            <w:shd w:val="clear" w:color="auto" w:fill="1F3A5F"/>
+          </w:tcPr>
+          <w:p>
+            <w:r>
+              <w:rPr>
+                <w:b/>
+                <w:color w:val="FFFFFF"/>
+                <w:sz w:val="21"/>
+              </w:rPr>
+              <w:t>Ideal SP</w:t>
+            </w:r>
+          </w:p>
+        </w:tc>
+        <w:tc>
+          <w:tcPr>
+            <w:tcW w:type="dxa" w:w="3249"/>
+            <w:vAlign w:val="center"/>
+            <w:shd w:val="clear" w:color="auto" w:fill="1F3A5F"/>
+          </w:tcPr>
+          <w:p>
+            <w:r>
+              <w:rPr>
+                <w:b/>
+                <w:color w:val="FFFFFF"/>
+                <w:sz w:val="21"/>
+              </w:rPr>
+              <w:t>Actual SP</w:t>
+            </w:r>
+          </w:p>
+        </w:tc>
+      </w:tr>
+      <w:tr>
+        <w:tc>
+          <w:tcPr>
+            <w:tcW w:type="dxa" w:w="3249"/>
+            <w:vAlign w:val="center"/>
+          </w:tcPr>
+          <w:p>
+            <w:r>
+              <w:t>0</w:t>
+            </w:r>
+          </w:p>
+        </w:tc>
+        <w:tc>
+          <w:tcPr>
+            <w:tcW w:type="dxa" w:w="3249"/>
+            <w:vAlign w:val="center"/>
+          </w:tcPr>
+          <w:p>
+            <w:r>
+              <w:t>20</w:t>
+            </w:r>
+          </w:p>
+        </w:tc>
+        <w:tc>
+          <w:tcPr>
+            <w:tcW w:type="dxa" w:w="3249"/>
+            <w:vAlign w:val="center"/>
+          </w:tcPr>
+          <w:p>
+            <w:r>
+              <w:t>20</w:t>
+            </w:r>
+          </w:p>
+        </w:tc>
+      </w:tr>
+      <w:tr>
+        <w:tc>
+          <w:tcPr>
+            <w:tcW w:type="dxa" w:w="3249"/>
+            <w:vAlign w:val="center"/>
+            <w:shd w:val="clear" w:color="auto" w:fill="F7FAFD"/>
+          </w:tcPr>
+          <w:p>
+            <w:r>
+              <w:t>2</w:t>
+            </w:r>
+          </w:p>
+        </w:tc>
+        <w:tc>
+          <w:tcPr>
+            <w:tcW w:type="dxa" w:w="3249"/>
+            <w:vAlign w:val="center"/>
+            <w:shd w:val="clear" w:color="auto" w:fill="F7FAFD"/>
+          </w:tcPr>
+          <w:p>
+            <w:r>
+              <w:t>16</w:t>
+            </w:r>
+          </w:p>
+        </w:tc>
+        <w:tc>
+          <w:tcPr>
+            <w:tcW w:type="dxa" w:w="3249"/>
+            <w:vAlign w:val="center"/>
+            <w:shd w:val="clear" w:color="auto" w:fill="F7FAFD"/>
+          </w:tcPr>
+          <w:p>
+            <w:r>
+              <w:t>17</w:t>
+            </w:r>
+          </w:p>
+        </w:tc>
+      </w:tr>
+      <w:tr>
+        <w:tc>
+          <w:tcPr>
+            <w:tcW w:type="dxa" w:w="3249"/>
+            <w:vAlign w:val="center"/>
+          </w:tcPr>
+          <w:p>
+            <w:r>
+              <w:t>4</w:t>
+            </w:r>
+          </w:p>
+        </w:tc>
+        <w:tc>
+          <w:tcPr>
+            <w:tcW w:type="dxa" w:w="3249"/>
+            <w:vAlign w:val="center"/>
+          </w:tcPr>
+          <w:p>
+            <w:r>
+              <w:t>12</w:t>
+            </w:r>
+          </w:p>
+        </w:tc>
+        <w:tc>
+          <w:tcPr>
+            <w:tcW w:type="dxa" w:w="3249"/>
+            <w:vAlign w:val="center"/>
+          </w:tcPr>
+          <w:p>
+            <w:r>
+              <w:t>13</w:t>
+            </w:r>
+          </w:p>
+        </w:tc>
+      </w:tr>
+      <w:tr>
+        <w:tc>
+          <w:tcPr>
+            <w:tcW w:type="dxa" w:w="3249"/>
+            <w:vAlign w:val="center"/>
+            <w:shd w:val="clear" w:color="auto" w:fill="F7FAFD"/>
+          </w:tcPr>
+          <w:p>
+            <w:r>
+              <w:t>6</w:t>
+            </w:r>
+          </w:p>
+        </w:tc>
+        <w:tc>
+          <w:tcPr>
+            <w:tcW w:type="dxa" w:w="3249"/>
+            <w:vAlign w:val="center"/>
+            <w:shd w:val="clear" w:color="auto" w:fill="F7FAFD"/>
+          </w:tcPr>
+          <w:p>
+            <w:r>
+              <w:t>8</w:t>
+            </w:r>
+          </w:p>
+        </w:tc>
+        <w:tc>
+          <w:tcPr>
+            <w:tcW w:type="dxa" w:w="3249"/>
+            <w:vAlign w:val="center"/>
+            <w:shd w:val="clear" w:color="auto" w:fill="F7FAFD"/>
+          </w:tcPr>
+          <w:p>
+            <w:r>
+              <w:t>9</w:t>
+            </w:r>
+          </w:p>
+        </w:tc>
+      </w:tr>
+      <w:tr>
+        <w:tc>
+          <w:tcPr>
+            <w:tcW w:type="dxa" w:w="3249"/>
+            <w:vAlign w:val="center"/>
+          </w:tcPr>
+          <w:p>
+            <w:r>
+              <w:t>8</w:t>
+            </w:r>
+          </w:p>
+        </w:tc>
+        <w:tc>
+          <w:tcPr>
+            <w:tcW w:type="dxa" w:w="3249"/>
+            <w:vAlign w:val="center"/>
+          </w:tcPr>
+          <w:p>
+            <w:r>
+              <w:t>4</w:t>
+            </w:r>
+          </w:p>
+        </w:tc>
+        <w:tc>
+          <w:tcPr>
+            <w:tcW w:type="dxa" w:w="3249"/>
+            <w:vAlign w:val="center"/>
+          </w:tcPr>
+          <w:p>
+            <w:r>
+              <w:t>5</w:t>
+            </w:r>
+          </w:p>
+        </w:tc>
+      </w:tr>
+      <w:tr>
+        <w:tc>
+          <w:tcPr>
+            <w:tcW w:type="dxa" w:w="3249"/>
+            <w:vAlign w:val="center"/>
+            <w:shd w:val="clear" w:color="auto" w:fill="F7FAFD"/>
+          </w:tcPr>
+          <w:p>
+            <w:r>
+              <w:t>10</w:t>
+            </w:r>
+          </w:p>
+        </w:tc>
+        <w:tc>
+          <w:tcPr>
+            <w:tcW w:type="dxa" w:w="3249"/>
+            <w:vAlign w:val="center"/>
+            <w:shd w:val="clear" w:color="auto" w:fill="F7FAFD"/>
+          </w:tcPr>
+          <w:p>
+            <w:r>
+              <w:t>0</w:t>
+            </w:r>
+          </w:p>
+        </w:tc>
+        <w:tc>
+          <w:tcPr>
+            <w:tcW w:type="dxa" w:w="3249"/>
+            <w:vAlign w:val="center"/>
+            <w:shd w:val="clear" w:color="auto" w:fill="F7FAFD"/>
+          </w:tcPr>
+          <w:p>
+            <w:r>
+              <w:t>2 (carry-over US-12)</w:t>
+            </w:r>
+          </w:p>
+        </w:tc>
+      </w:tr>
+    </w:tbl>
+    <w:p>
+      <w:pPr>
+        <w:pStyle w:val="Heading2"/>
+        <w:spacing w:before="240" w:after="120"/>
+      </w:pPr>
+      <w:r>
+        <w:rPr>
+          <w:rFonts w:ascii="Calibri" w:hAnsi="Calibri"/>
+          <w:b/>
+          <w:color w:val="2E74B5"/>
+          <w:sz w:val="30"/>
+        </w:rPr>
+        <w:t>10.4 Scrum Metrics</w:t>
+      </w:r>
+    </w:p>
+    <w:tbl>
+      <w:tblPr>
+        <w:tblStyle w:val="TableGrid"/>
+        <w:tblW w:type="auto" w:w="0"/>
+        <w:jc w:val="center"/>
+        <w:tblLayout w:type="autofit"/>
+        <w:tblLook w:firstColumn="1" w:firstRow="1" w:lastColumn="0" w:lastRow="0" w:noHBand="0" w:noVBand="1" w:val="04A0"/>
+      </w:tblPr>
+      <w:tblGrid>
+        <w:gridCol w:w="4873"/>
+        <w:gridCol w:w="4873"/>
+      </w:tblGrid>
+      <w:tr>
+        <w:tc>
+          <w:tcPr>
+            <w:tcW w:type="dxa" w:w="4873"/>
+            <w:vAlign w:val="center"/>
+            <w:shd w:val="clear" w:color="auto" w:fill="1F3A5F"/>
+          </w:tcPr>
+          <w:p>
+            <w:r>
+              <w:rPr>
+                <w:b/>
+                <w:color w:val="FFFFFF"/>
+                <w:sz w:val="21"/>
+              </w:rPr>
+              <w:t>Metric</w:t>
+            </w:r>
+          </w:p>
+        </w:tc>
+        <w:tc>
+          <w:tcPr>
+            <w:tcW w:type="dxa" w:w="4873"/>
+            <w:vAlign w:val="center"/>
+            <w:shd w:val="clear" w:color="auto" w:fill="1F3A5F"/>
+          </w:tcPr>
+          <w:p>
+            <w:r>
+              <w:rPr>
+                <w:b/>
+                <w:color w:val="FFFFFF"/>
+                <w:sz w:val="21"/>
+              </w:rPr>
+              <w:t>Value</w:t>
+            </w:r>
+          </w:p>
+        </w:tc>
+      </w:tr>
+      <w:tr>
+        <w:tc>
+          <w:tcPr>
+            <w:tcW w:type="dxa" w:w="4873"/>
+            <w:vAlign w:val="center"/>
+          </w:tcPr>
+          <w:p>
+            <w:r>
+              <w:t>Velocity (Sprint 1)</w:t>
+            </w:r>
+          </w:p>
+        </w:tc>
+        <w:tc>
+          <w:tcPr>
+            <w:tcW w:type="dxa" w:w="4873"/>
+            <w:vAlign w:val="center"/>
+          </w:tcPr>
+          <w:p>
+            <w:r>
+              <w:t>18 story points</w:t>
+            </w:r>
+          </w:p>
+        </w:tc>
+      </w:tr>
+      <w:tr>
+        <w:tc>
+          <w:tcPr>
+            <w:tcW w:type="dxa" w:w="4873"/>
+            <w:vAlign w:val="center"/>
+            <w:shd w:val="clear" w:color="auto" w:fill="F7FAFD"/>
+          </w:tcPr>
+          <w:p>
+            <w:r>
+              <w:t>Velocity (Sprint 2)</w:t>
+            </w:r>
+          </w:p>
+        </w:tc>
+        <w:tc>
+          <w:tcPr>
+            <w:tcW w:type="dxa" w:w="4873"/>
+            <w:vAlign w:val="center"/>
+            <w:shd w:val="clear" w:color="auto" w:fill="F7FAFD"/>
+          </w:tcPr>
+          <w:p>
+            <w:r>
+              <w:t>18 story points</w:t>
+            </w:r>
+          </w:p>
+        </w:tc>
+      </w:tr>
+      <w:tr>
+        <w:tc>
+          <w:tcPr>
+            <w:tcW w:type="dxa" w:w="4873"/>
+            <w:vAlign w:val="center"/>
+          </w:tcPr>
+          <w:p>
+            <w:r>
+              <w:t>Average velocity</w:t>
+            </w:r>
+          </w:p>
+        </w:tc>
+        <w:tc>
+          <w:tcPr>
+            <w:tcW w:type="dxa" w:w="4873"/>
+            <w:vAlign w:val="center"/>
+          </w:tcPr>
+          <w:p>
+            <w:r>
+              <w:t>18 story points</w:t>
+            </w:r>
+          </w:p>
+        </w:tc>
+      </w:tr>
+      <w:tr>
+        <w:tc>
+          <w:tcPr>
+            <w:tcW w:type="dxa" w:w="4873"/>
+            <w:vAlign w:val="center"/>
+            <w:shd w:val="clear" w:color="auto" w:fill="F7FAFD"/>
+          </w:tcPr>
+          <w:p>
+            <w:r>
+              <w:t>Defects found</w:t>
+            </w:r>
+          </w:p>
+        </w:tc>
+        <w:tc>
+          <w:tcPr>
+            <w:tcW w:type="dxa" w:w="4873"/>
+            <w:vAlign w:val="center"/>
+            <w:shd w:val="clear" w:color="auto" w:fill="F7FAFD"/>
+          </w:tcPr>
+          <w:p>
+            <w:r>
+              <w:t>4 (1 High, 2 Medium, 1 Low)</w:t>
+            </w:r>
+          </w:p>
+        </w:tc>
+      </w:tr>
+      <w:tr>
+        <w:tc>
+          <w:tcPr>
+            <w:tcW w:type="dxa" w:w="4873"/>
+            <w:vAlign w:val="center"/>
+          </w:tcPr>
+          <w:p>
+            <w:r>
+              <w:t>Defects fixed</w:t>
+            </w:r>
+          </w:p>
+        </w:tc>
+        <w:tc>
+          <w:tcPr>
+            <w:tcW w:type="dxa" w:w="4873"/>
+            <w:vAlign w:val="center"/>
+          </w:tcPr>
+          <w:p>
+            <w:r>
+              <w:t>3</w:t>
+            </w:r>
+          </w:p>
+        </w:tc>
+      </w:tr>
+      <w:tr>
+        <w:tc>
+          <w:tcPr>
+            <w:tcW w:type="dxa" w:w="4873"/>
+            <w:vAlign w:val="center"/>
+            <w:shd w:val="clear" w:color="auto" w:fill="F7FAFD"/>
+          </w:tcPr>
+          <w:p>
+            <w:r>
+              <w:t>Defects carried over</w:t>
+            </w:r>
+          </w:p>
+        </w:tc>
+        <w:tc>
+          <w:tcPr>
+            <w:tcW w:type="dxa" w:w="4873"/>
+            <w:vAlign w:val="center"/>
+            <w:shd w:val="clear" w:color="auto" w:fill="F7FAFD"/>
+          </w:tcPr>
+          <w:p>
+            <w:r>
+              <w:t>1 (Low)</w:t>
+            </w:r>
+          </w:p>
+        </w:tc>
+      </w:tr>
+      <w:tr>
+        <w:tc>
+          <w:tcPr>
+            <w:tcW w:type="dxa" w:w="4873"/>
+            <w:vAlign w:val="center"/>
+          </w:tcPr>
+          <w:p>
+            <w:r>
+              <w:t>Stories completed</w:t>
+            </w:r>
+          </w:p>
+        </w:tc>
+        <w:tc>
+          <w:tcPr>
+            <w:tcW w:type="dxa" w:w="4873"/>
+            <w:vAlign w:val="center"/>
+          </w:tcPr>
+          <w:p>
+            <w:r>
+              <w:t>11 of 12</w:t>
+            </w:r>
+          </w:p>
+        </w:tc>
+      </w:tr>
+      <w:tr>
+        <w:tc>
+          <w:tcPr>
+            <w:tcW w:type="dxa" w:w="4873"/>
+            <w:vAlign w:val="center"/>
+            <w:shd w:val="clear" w:color="auto" w:fill="F7FAFD"/>
+          </w:tcPr>
+          <w:p>
+            <w:r>
+              <w:t>Carry-over</w:t>
+            </w:r>
+          </w:p>
+        </w:tc>
+        <w:tc>
+          <w:tcPr>
+            <w:tcW w:type="dxa" w:w="4873"/>
+            <w:vAlign w:val="center"/>
+            <w:shd w:val="clear" w:color="auto" w:fill="F7FAFD"/>
+          </w:tcPr>
+          <w:p>
+            <w:r>
+              <w:t>US-12 (real-time status)</w:t>
+            </w:r>
+          </w:p>
+        </w:tc>
+      </w:tr>
+    </w:tbl>
+    <w:p>
+      <w:pPr>
+        <w:pStyle w:val="Heading2"/>
+        <w:spacing w:before="240" w:after="120"/>
+      </w:pPr>
+      <w:r>
+        <w:rPr>
+          <w:rFonts w:ascii="Calibri" w:hAnsi="Calibri"/>
+          <w:b/>
+          <w:color w:val="2E74B5"/>
+          <w:sz w:val="30"/>
+        </w:rPr>
+        <w:t>10.5 Defect Log</w:t>
+      </w:r>
+    </w:p>
+    <w:tbl>
+      <w:tblPr>
+        <w:tblStyle w:val="TableGrid"/>
+        <w:tblW w:type="auto" w:w="0"/>
+        <w:jc w:val="center"/>
+        <w:tblLayout w:type="autofit"/>
+        <w:tblLook w:firstColumn="1" w:firstRow="1" w:lastColumn="0" w:lastRow="0" w:noHBand="0" w:noVBand="1" w:val="04A0"/>
+      </w:tblPr>
+      <w:tblGrid>
+        <w:gridCol w:w="1949"/>
+        <w:gridCol w:w="1949"/>
+        <w:gridCol w:w="1949"/>
+        <w:gridCol w:w="1949"/>
+        <w:gridCol w:w="1949"/>
+      </w:tblGrid>
+      <w:tr>
+        <w:tc>
+          <w:tcPr>
+            <w:tcW w:type="dxa" w:w="1949"/>
+            <w:vAlign w:val="center"/>
+            <w:shd w:val="clear" w:color="auto" w:fill="1F3A5F"/>
+          </w:tcPr>
+          <w:p>
+            <w:r>
+              <w:rPr>
+                <w:b/>
+                <w:color w:val="FFFFFF"/>
+                <w:sz w:val="21"/>
+              </w:rPr>
+              <w:t>ID</w:t>
+            </w:r>
+          </w:p>
+        </w:tc>
+        <w:tc>
+          <w:tcPr>
+            <w:tcW w:type="dxa" w:w="1949"/>
+            <w:vAlign w:val="center"/>
+            <w:shd w:val="clear" w:color="auto" w:fill="1F3A5F"/>
+          </w:tcPr>
+          <w:p>
+            <w:r>
+              <w:rPr>
+                <w:b/>
+                <w:color w:val="FFFFFF"/>
+                <w:sz w:val="21"/>
+              </w:rPr>
+              <w:t>Severity</w:t>
+            </w:r>
+          </w:p>
+        </w:tc>
+        <w:tc>
+          <w:tcPr>
+            <w:tcW w:type="dxa" w:w="1949"/>
+            <w:vAlign w:val="center"/>
+            <w:shd w:val="clear" w:color="auto" w:fill="1F3A5F"/>
+          </w:tcPr>
+          <w:p>
+            <w:r>
+              <w:rPr>
+                <w:b/>
+                <w:color w:val="FFFFFF"/>
+                <w:sz w:val="21"/>
+              </w:rPr>
+              <w:t>Description</w:t>
+            </w:r>
+          </w:p>
+        </w:tc>
+        <w:tc>
+          <w:tcPr>
+            <w:tcW w:type="dxa" w:w="1949"/>
+            <w:vAlign w:val="center"/>
+            <w:shd w:val="clear" w:color="auto" w:fill="1F3A5F"/>
+          </w:tcPr>
+          <w:p>
+            <w:r>
+              <w:rPr>
+                <w:b/>
+                <w:color w:val="FFFFFF"/>
+                <w:sz w:val="21"/>
+              </w:rPr>
+              <w:t>Fix</w:t>
+            </w:r>
+          </w:p>
+        </w:tc>
+        <w:tc>
+          <w:tcPr>
+            <w:tcW w:type="dxa" w:w="1949"/>
+            <w:vAlign w:val="center"/>
+            <w:shd w:val="clear" w:color="auto" w:fill="1F3A5F"/>
+          </w:tcPr>
+          <w:p>
+            <w:r>
+              <w:rPr>
+                <w:b/>
+                <w:color w:val="FFFFFF"/>
+                <w:sz w:val="21"/>
+              </w:rPr>
+              <w:t>Status</w:t>
+            </w:r>
+          </w:p>
+        </w:tc>
+      </w:tr>
+      <w:tr>
+        <w:tc>
+          <w:tcPr>
+            <w:tcW w:type="dxa" w:w="1949"/>
+            <w:vAlign w:val="center"/>
+          </w:tcPr>
+          <w:p>
+            <w:r>
+              <w:t>DEF-001</w:t>
+            </w:r>
+          </w:p>
+        </w:tc>
+        <w:tc>
+          <w:tcPr>
+            <w:tcW w:type="dxa" w:w="1949"/>
+            <w:vAlign w:val="center"/>
+          </w:tcPr>
+          <w:p>
+            <w:r>
+              <w:t>High</w:t>
+            </w:r>
+          </w:p>
+        </w:tc>
+        <w:tc>
+          <w:tcPr>
+            <w:tcW w:type="dxa" w:w="1949"/>
+            <w:vAlign w:val="center"/>
+          </w:tcPr>
+          <w:p>
+            <w:r>
+              <w:t>Replay in ownership transfer API</w:t>
+            </w:r>
+          </w:p>
+        </w:tc>
+        <w:tc>
+          <w:tcPr>
+            <w:tcW w:type="dxa" w:w="1949"/>
+            <w:vAlign w:val="center"/>
+          </w:tcPr>
+          <w:p>
+            <w:r>
+              <w:t>Nonce + timestamp validation</w:t>
+            </w:r>
+          </w:p>
+        </w:tc>
+        <w:tc>
+          <w:tcPr>
+            <w:tcW w:type="dxa" w:w="1949"/>
+            <w:vAlign w:val="center"/>
+          </w:tcPr>
+          <w:p>
+            <w:r>
+              <w:t>Fixed</w:t>
+            </w:r>
+          </w:p>
+        </w:tc>
+      </w:tr>
+      <w:tr>
+        <w:tc>
+          <w:tcPr>
+            <w:tcW w:type="dxa" w:w="1949"/>
+            <w:vAlign w:val="center"/>
+            <w:shd w:val="clear" w:color="auto" w:fill="F7FAFD"/>
+          </w:tcPr>
+          <w:p>
+            <w:r>
+              <w:t>DEF-002</w:t>
+            </w:r>
+          </w:p>
+        </w:tc>
+        <w:tc>
+          <w:tcPr>
+            <w:tcW w:type="dxa" w:w="1949"/>
+            <w:vAlign w:val="center"/>
+            <w:shd w:val="clear" w:color="auto" w:fill="F7FAFD"/>
+          </w:tcPr>
+          <w:p>
+            <w:r>
+              <w:t>Medium</w:t>
+            </w:r>
+          </w:p>
+        </w:tc>
+        <w:tc>
+          <w:tcPr>
+            <w:tcW w:type="dxa" w:w="1949"/>
+            <w:vAlign w:val="center"/>
+            <w:shd w:val="clear" w:color="auto" w:fill="F7FAFD"/>
+          </w:tcPr>
+          <w:p>
+            <w:r>
+              <w:t>Duplicate serial race condition</w:t>
+            </w:r>
+          </w:p>
+        </w:tc>
+        <w:tc>
+          <w:tcPr>
+            <w:tcW w:type="dxa" w:w="1949"/>
+            <w:vAlign w:val="center"/>
+            <w:shd w:val="clear" w:color="auto" w:fill="F7FAFD"/>
+          </w:tcPr>
+          <w:p>
+            <w:r>
+              <w:t>DB unique constraint + transaction</w:t>
+            </w:r>
+          </w:p>
+        </w:tc>
+        <w:tc>
+          <w:tcPr>
+            <w:tcW w:type="dxa" w:w="1949"/>
+            <w:vAlign w:val="center"/>
+            <w:shd w:val="clear" w:color="auto" w:fill="F7FAFD"/>
+          </w:tcPr>
+          <w:p>
+            <w:r>
+              <w:t>Fixed</w:t>
+            </w:r>
+          </w:p>
+        </w:tc>
+      </w:tr>
+      <w:tr>
+        <w:tc>
+          <w:tcPr>
+            <w:tcW w:type="dxa" w:w="1949"/>
+            <w:vAlign w:val="center"/>
+          </w:tcPr>
+          <w:p>
+            <w:r>
+              <w:t>DEF-003</w:t>
+            </w:r>
+          </w:p>
+        </w:tc>
+        <w:tc>
+          <w:tcPr>
+            <w:tcW w:type="dxa" w:w="1949"/>
+            <w:vAlign w:val="center"/>
+          </w:tcPr>
+          <w:p>
+            <w:r>
+              <w:t>Medium</w:t>
+            </w:r>
+          </w:p>
+        </w:tc>
+        <w:tc>
+          <w:tcPr>
+            <w:tcW w:type="dxa" w:w="1949"/>
+            <w:vAlign w:val="center"/>
+          </w:tcPr>
+          <w:p>
+            <w:r>
+              <w:t>Anomaly alert fired on legitimate night shift</w:t>
+            </w:r>
+          </w:p>
+        </w:tc>
+        <w:tc>
+          <w:tcPr>
+            <w:tcW w:type="dxa" w:w="1949"/>
+            <w:vAlign w:val="center"/>
+          </w:tcPr>
+          <w:p>
+            <w:r>
+              <w:t>Refined rule (shift-aware)</w:t>
+            </w:r>
+          </w:p>
+        </w:tc>
+        <w:tc>
+          <w:tcPr>
+            <w:tcW w:type="dxa" w:w="1949"/>
+            <w:vAlign w:val="center"/>
+          </w:tcPr>
+          <w:p>
+            <w:r>
+              <w:t>Fixed</w:t>
+            </w:r>
+          </w:p>
+        </w:tc>
+      </w:tr>
+      <w:tr>
+        <w:tc>
+          <w:tcPr>
+            <w:tcW w:type="dxa" w:w="1949"/>
+            <w:vAlign w:val="center"/>
+            <w:shd w:val="clear" w:color="auto" w:fill="F7FAFD"/>
+          </w:tcPr>
+          <w:p>
+            <w:r>
+              <w:t>DEF-004</w:t>
+            </w:r>
+          </w:p>
+        </w:tc>
+        <w:tc>
+          <w:tcPr>
+            <w:tcW w:type="dxa" w:w="1949"/>
+            <w:vAlign w:val="center"/>
+            <w:shd w:val="clear" w:color="auto" w:fill="F7FAFD"/>
+          </w:tcPr>
+          <w:p>
+            <w:r>
+              <w:t>Low</w:t>
+            </w:r>
+          </w:p>
+        </w:tc>
+        <w:tc>
+          <w:tcPr>
+            <w:tcW w:type="dxa" w:w="1949"/>
+            <w:vAlign w:val="center"/>
+            <w:shd w:val="clear" w:color="auto" w:fill="F7FAFD"/>
+          </w:tcPr>
+          <w:p>
+            <w:r>
+              <w:t>Timestamp formatting inconsistency</w:t>
+            </w:r>
+          </w:p>
+        </w:tc>
+        <w:tc>
+          <w:tcPr>
+            <w:tcW w:type="dxa" w:w="1949"/>
+            <w:vAlign w:val="center"/>
+            <w:shd w:val="clear" w:color="auto" w:fill="F7FAFD"/>
+          </w:tcPr>
+          <w:p>
+            <w:r>
+              <w:t>Deferred to Sprint 3</w:t>
+            </w:r>
+          </w:p>
+        </w:tc>
+        <w:tc>
+          <w:tcPr>
+            <w:tcW w:type="dxa" w:w="1949"/>
+            <w:vAlign w:val="center"/>
+            <w:shd w:val="clear" w:color="auto" w:fill="F7FAFD"/>
+          </w:tcPr>
+          <w:p>
+            <w:r>
+              <w:t>Open</w:t>
+            </w:r>
+          </w:p>
+        </w:tc>
+      </w:tr>
+    </w:tbl>
+    <w:p>
+      <w:pPr>
+        <w:pStyle w:val="Heading2"/>
+        <w:spacing w:before="240" w:after="120"/>
+      </w:pPr>
+      <w:r>
+        <w:rPr>
+          <w:rFonts w:ascii="Calibri" w:hAnsi="Calibri"/>
+          <w:b/>
+          <w:color w:val="2E74B5"/>
+          <w:sz w:val="30"/>
+        </w:rPr>
+        <w:t>10.6 Sprint Review Outcome</w:t>
+      </w:r>
+    </w:p>
+    <w:p>
+      <w:r>
+        <w:t>Stakeholders (Manufacturer, Distributor, Auditor) accepted 11 stories. The team demonstrated end-to-end flow: product registration -&gt; shipment -&gt; warehouse receipt -&gt; ownership transfer -&gt; audit trail.</w:t>
+      </w:r>
+    </w:p>
+    <w:p>
+      <w:r>
+        <w:t>Retailer requested better anomaly alert UI for non-technical operators. This was added to the Sprint 3 backlog.</w:t>
+      </w:r>
+    </w:p>
+    <w:p>
+      <w:pPr>
+        <w:pStyle w:val="Heading2"/>
+        <w:spacing w:before="240" w:after="120"/>
+      </w:pPr>
+      <w:r>
+        <w:rPr>
+          <w:rFonts w:ascii="Calibri" w:hAnsi="Calibri"/>
+          <w:b/>
+          <w:color w:val="2E74B5"/>
+          <w:sz w:val="30"/>
+        </w:rPr>
+        <w:t>10.7 Sprint Retrospective</w:t>
+      </w:r>
+    </w:p>
+    <w:tbl>
+      <w:tblPr>
+        <w:tblStyle w:val="TableGrid"/>
+        <w:tblW w:type="auto" w:w="0"/>
+        <w:jc w:val="center"/>
+        <w:tblLayout w:type="autofit"/>
+        <w:tblLook w:firstColumn="1" w:firstRow="1" w:lastColumn="0" w:lastRow="0" w:noHBand="0" w:noVBand="1" w:val="04A0"/>
+      </w:tblPr>
+      <w:tblGrid>
+        <w:gridCol w:w="4873"/>
+        <w:gridCol w:w="4873"/>
+      </w:tblGrid>
+      <w:tr>
+        <w:tc>
+          <w:tcPr>
+            <w:tcW w:type="dxa" w:w="4873"/>
+            <w:vAlign w:val="center"/>
+            <w:shd w:val="clear" w:color="auto" w:fill="1F3A5F"/>
+          </w:tcPr>
+          <w:p>
+            <w:r>
+              <w:rPr>
+                <w:b/>
+                <w:color w:val="FFFFFF"/>
+                <w:sz w:val="21"/>
+              </w:rPr>
+              <w:t>What Went Well</w:t>
+            </w:r>
+          </w:p>
+        </w:tc>
+        <w:tc>
+          <w:tcPr>
+            <w:tcW w:type="dxa" w:w="4873"/>
+            <w:vAlign w:val="center"/>
+            <w:shd w:val="clear" w:color="auto" w:fill="1F3A5F"/>
+          </w:tcPr>
+          <w:p>
+            <w:r>
+              <w:rPr>
+                <w:b/>
+                <w:color w:val="FFFFFF"/>
+                <w:sz w:val="21"/>
+              </w:rPr>
+              <w:t>What To Improve</w:t>
+            </w:r>
+          </w:p>
+        </w:tc>
+      </w:tr>
+      <w:tr>
+        <w:tc>
+          <w:tcPr>
+            <w:tcW w:type="dxa" w:w="4873"/>
+            <w:vAlign w:val="center"/>
+          </w:tcPr>
+          <w:p>
+            <w:r>
+              <w:t>Cross-org daily scrums surfaced blockers early</w:t>
+            </w:r>
+          </w:p>
+        </w:tc>
+        <w:tc>
+          <w:tcPr>
+            <w:tcW w:type="dxa" w:w="4873"/>
+            <w:vAlign w:val="center"/>
+          </w:tcPr>
+          <w:p>
+            <w:r>
+              <w:t>Add HSM access earlier in the sprint</w:t>
+            </w:r>
+          </w:p>
+        </w:tc>
+      </w:tr>
+      <w:tr>
+        <w:tc>
+          <w:tcPr>
+            <w:tcW w:type="dxa" w:w="4873"/>
+            <w:vAlign w:val="center"/>
+            <w:shd w:val="clear" w:color="auto" w:fill="F7FAFD"/>
+          </w:tcPr>
+          <w:p>
+            <w:r>
+              <w:t>Security review as part of Definition of Done caught replay bug</w:t>
+            </w:r>
+          </w:p>
+        </w:tc>
+        <w:tc>
+          <w:tcPr>
+            <w:tcW w:type="dxa" w:w="4873"/>
+            <w:vAlign w:val="center"/>
+            <w:shd w:val="clear" w:color="auto" w:fill="F7FAFD"/>
+          </w:tcPr>
+          <w:p>
+            <w:r>
+              <w:t>Pair-program security-critical stories (US-09)</w:t>
+            </w:r>
+          </w:p>
+        </w:tc>
+      </w:tr>
+      <w:tr>
+        <w:tc>
+          <w:tcPr>
+            <w:tcW w:type="dxa" w:w="4873"/>
+            <w:vAlign w:val="center"/>
+          </w:tcPr>
+          <w:p>
+            <w:r>
+              <w:t>Velocity stable at 18 SP across both sprints</w:t>
+            </w:r>
+          </w:p>
+        </w:tc>
+        <w:tc>
+          <w:tcPr>
+            <w:tcW w:type="dxa" w:w="4873"/>
+            <w:vAlign w:val="center"/>
+          </w:tcPr>
+          <w:p>
+            <w:r>
+              <w:t>Refine carry-over estimation</w:t>
+            </w:r>
+          </w:p>
+        </w:tc>
+      </w:tr>
+    </w:tbl>
+    <w:p>
+      <w:pPr>
+        <w:pStyle w:val="Heading3"/>
+        <w:spacing w:before="160" w:after="80"/>
+      </w:pPr>
+      <w:r>
+        <w:rPr>
+          <w:rFonts w:ascii="Calibri" w:hAnsi="Calibri"/>
+          <w:b/>
+          <w:color w:val="1F3A5F"/>
+          <w:sz w:val="25"/>
+        </w:rPr>
+        <w:t>Two Improvement Actions for Sprint 3</w:t>
+      </w:r>
+    </w:p>
+    <w:p>
+      <w:pPr>
+        <w:pStyle w:val="ListBullet"/>
+      </w:pPr>
+      <w:r>
+        <w:t>Provision HSM development keys before Sprint 3 planning (owner: DevOps).</w:t>
+      </w:r>
+    </w:p>
+    <w:p>
+      <w:pPr>
+        <w:pStyle w:val="ListBullet"/>
+      </w:pPr>
+      <w:r>
+        <w:t>Adopt pair programming on all signature-related stories (owner: Dev Team).</w:t>
       </w:r>
     </w:p>
     <w:p>

</xml_diff>

<commit_message>
jira: add timeline view + dependencies; embed timeline in Phase 9
</commit_message>
<xml_diff>
--- a/PharmaChain_SSE_Report.docx
+++ b/PharmaChain_SSE_Report.docx
@@ -9559,7 +9559,7 @@
           </w:tcPr>
           <w:p>
             <w:r>
-              <w:t>Consistency (all orgs see same layout), Error prevention (required fields), Visibility (trust badges)</w:t>
+              <w:t>Consistency, Error prevention, Visibility</w:t>
             </w:r>
           </w:p>
         </w:tc>
@@ -9876,7 +9876,7 @@
           </w:tcPr>
           <w:p>
             <w:r>
-              <w:t>Feedback (real-time), Consistency (same form layout), Visibility (status badges)</w:t>
+              <w:t>Feedback, Consistency, Visibility</w:t>
             </w:r>
           </w:p>
         </w:tc>
@@ -10193,7 +10193,7 @@
           </w:tcPr>
           <w:p>
             <w:r>
-              <w:t>Navigation (breadcrumbs), User control (cancel/back), Consistency (colors)</w:t>
+              <w:t>Navigation, User control, Consistency</w:t>
             </w:r>
           </w:p>
         </w:tc>
@@ -10510,7 +10510,7 @@
           </w:tcPr>
           <w:p>
             <w:r>
-              <w:t>Consistency (same layout), Visibility (chain status), Error prevention (no edit controls)</w:t>
+              <w:t>Consistency, Visibility, Error prevention</w:t>
             </w:r>
           </w:p>
         </w:tc>
@@ -12782,7 +12782,7 @@
           </w:tcPr>
           <w:p>
             <w:r>
-              <w:t>Server-side signature verification, never trust QR alone</w:t>
+              <w:t>Server-side signature verification</w:t>
             </w:r>
           </w:p>
         </w:tc>
@@ -12958,7 +12958,7 @@
           </w:tcPr>
           <w:p>
             <w:r>
-              <w:t>ABAC check per org, UUIDv4 IDs, schema validation</w:t>
+              <w:t>ABAC check per org, UUIDv4 IDs</w:t>
             </w:r>
           </w:p>
         </w:tc>
@@ -13020,7 +13020,7 @@
           </w:tcPr>
           <w:p>
             <w:r>
-              <w:t>Private buckets + signed URLs + audit access logs</w:t>
+              <w:t>Private buckets + signed URLs + audit logs</w:t>
             </w:r>
           </w:p>
         </w:tc>
@@ -13872,6 +13872,138 @@
       </w:r>
     </w:p>
     <w:p>
+      <w:r>
+        <w:t>The PharmaChain backlog was managed in a live Jira Cloud Scrum project (site: j33v4n.atlassian.net, project key: SCMSEC). The backlog, sprint boards, and burndown charts below are direct screenshots from Jira.</w:t>
+      </w:r>
+    </w:p>
+    <w:p>
+      <w:pPr>
+        <w:pStyle w:val="Heading2"/>
+        <w:spacing w:before="240" w:after="120"/>
+      </w:pPr>
+      <w:r>
+        <w:rPr>
+          <w:rFonts w:ascii="Calibri" w:hAnsi="Calibri"/>
+          <w:b/>
+          <w:color w:val="2E74B5"/>
+          <w:sz w:val="30"/>
+        </w:rPr>
+        <w:t>9.0 Live Jira Backlog (Evidence)</w:t>
+      </w:r>
+    </w:p>
+    <w:p>
+      <w:pPr>
+        <w:jc w:val="center"/>
+      </w:pPr>
+      <w:r>
+        <w:drawing>
+          <wp:inline xmlns:a="http://schemas.openxmlformats.org/drawingml/2006/main" xmlns:pic="http://schemas.openxmlformats.org/drawingml/2006/picture">
+            <wp:extent cx="5486400" cy="2796988"/>
+            <wp:docPr id="11" name="Picture 11"/>
+            <wp:cNvGraphicFramePr>
+              <a:graphicFrameLocks noChangeAspect="1"/>
+            </wp:cNvGraphicFramePr>
+            <a:graphic>
+              <a:graphicData uri="http://schemas.openxmlformats.org/drawingml/2006/picture">
+                <pic:pic>
+                  <pic:nvPicPr>
+                    <pic:cNvPr id="0" name="01-backlog.png"/>
+                    <pic:cNvPicPr/>
+                  </pic:nvPicPr>
+                  <pic:blipFill>
+                    <a:blip r:embed="rId20"/>
+                    <a:stretch>
+                      <a:fillRect/>
+                    </a:stretch>
+                  </pic:blipFill>
+                  <pic:spPr>
+                    <a:xfrm>
+                      <a:off x="0" y="0"/>
+                      <a:ext cx="5486400" cy="2796988"/>
+                    </a:xfrm>
+                    <a:prstGeom prst="rect"/>
+                  </pic:spPr>
+                </pic:pic>
+              </a:graphicData>
+            </a:graphic>
+          </wp:inline>
+        </w:drawing>
+      </w:r>
+    </w:p>
+    <w:p>
+      <w:pPr>
+        <w:jc w:val="center"/>
+      </w:pPr>
+      <w:r>
+        <w:rPr>
+          <w:i/>
+          <w:color w:val="555555"/>
+          <w:sz w:val="20"/>
+        </w:rPr>
+        <w:t>Figure 9.1 - Jira backlog showing 5 epics, 12 stories, 2 sprints</w:t>
+      </w:r>
+    </w:p>
+    <w:p/>
+    <w:p/>
+    <w:p>
+      <w:r>
+        <w:t>The Timeline view below shows story start/due dates and the dependency arrows between blocked and blocking stories.</w:t>
+      </w:r>
+    </w:p>
+    <w:p>
+      <w:pPr>
+        <w:jc w:val="center"/>
+      </w:pPr>
+      <w:r>
+        <w:drawing>
+          <wp:inline xmlns:a="http://schemas.openxmlformats.org/drawingml/2006/main" xmlns:pic="http://schemas.openxmlformats.org/drawingml/2006/picture">
+            <wp:extent cx="5486400" cy="2849880"/>
+            <wp:docPr id="12" name="Picture 12"/>
+            <wp:cNvGraphicFramePr>
+              <a:graphicFrameLocks noChangeAspect="1"/>
+            </wp:cNvGraphicFramePr>
+            <a:graphic>
+              <a:graphicData uri="http://schemas.openxmlformats.org/drawingml/2006/picture">
+                <pic:pic>
+                  <pic:nvPicPr>
+                    <pic:cNvPr id="0" name="05-timeline.png"/>
+                    <pic:cNvPicPr/>
+                  </pic:nvPicPr>
+                  <pic:blipFill>
+                    <a:blip r:embed="rId21"/>
+                    <a:stretch>
+                      <a:fillRect/>
+                    </a:stretch>
+                  </pic:blipFill>
+                  <pic:spPr>
+                    <a:xfrm>
+                      <a:off x="0" y="0"/>
+                      <a:ext cx="5486400" cy="2849880"/>
+                    </a:xfrm>
+                    <a:prstGeom prst="rect"/>
+                  </pic:spPr>
+                </pic:pic>
+              </a:graphicData>
+            </a:graphic>
+          </wp:inline>
+        </w:drawing>
+      </w:r>
+    </w:p>
+    <w:p>
+      <w:pPr>
+        <w:jc w:val="center"/>
+      </w:pPr>
+      <w:r>
+        <w:rPr>
+          <w:i/>
+          <w:color w:val="555555"/>
+          <w:sz w:val="20"/>
+        </w:rPr>
+        <w:t>Figure 9.2 - Jira Timeline view with dependencies</w:t>
+      </w:r>
+    </w:p>
+    <w:p/>
+    <w:p>
       <w:pPr>
         <w:pStyle w:val="Heading2"/>
         <w:spacing w:before="240" w:after="120"/>
@@ -13942,7 +14074,7 @@
           </w:tcPr>
           <w:p>
             <w:r>
-              <w:t>E1</w:t>
+              <w:t>E1 (SCMSEC-1)</w:t>
             </w:r>
           </w:p>
         </w:tc>
@@ -13967,7 +14099,7 @@
           </w:tcPr>
           <w:p>
             <w:r>
-              <w:t>E2</w:t>
+              <w:t>E2 (SCMSEC-2)</w:t>
             </w:r>
           </w:p>
         </w:tc>
@@ -13992,7 +14124,7 @@
           </w:tcPr>
           <w:p>
             <w:r>
-              <w:t>E3</w:t>
+              <w:t>E3 (SCMSEC-3)</w:t>
             </w:r>
           </w:p>
         </w:tc>
@@ -14017,7 +14149,7 @@
           </w:tcPr>
           <w:p>
             <w:r>
-              <w:t>E4</w:t>
+              <w:t>E4 (SCMSEC-4)</w:t>
             </w:r>
           </w:p>
         </w:tc>
@@ -14042,7 +14174,7 @@
           </w:tcPr>
           <w:p>
             <w:r>
-              <w:t>E5</w:t>
+              <w:t>E5 (SCMSEC-5)</w:t>
             </w:r>
           </w:p>
         </w:tc>
@@ -14189,7 +14321,7 @@
           </w:tcPr>
           <w:p>
             <w:r>
-              <w:t>US-01</w:t>
+              <w:t>SCMSEC-6</w:t>
             </w:r>
           </w:p>
         </w:tc>
@@ -14247,7 +14379,7 @@
           </w:tcPr>
           <w:p>
             <w:r>
-              <w:t>US-02</w:t>
+              <w:t>SCMSEC-7</w:t>
             </w:r>
           </w:p>
         </w:tc>
@@ -14308,7 +14440,7 @@
           </w:tcPr>
           <w:p>
             <w:r>
-              <w:t>US-03</w:t>
+              <w:t>SCMSEC-8</w:t>
             </w:r>
           </w:p>
         </w:tc>
@@ -14366,7 +14498,7 @@
           </w:tcPr>
           <w:p>
             <w:r>
-              <w:t>US-04</w:t>
+              <w:t>SCMSEC-9</w:t>
             </w:r>
           </w:p>
         </w:tc>
@@ -14427,7 +14559,7 @@
           </w:tcPr>
           <w:p>
             <w:r>
-              <w:t>US-05</w:t>
+              <w:t>SCMSEC-10</w:t>
             </w:r>
           </w:p>
         </w:tc>
@@ -14485,7 +14617,7 @@
           </w:tcPr>
           <w:p>
             <w:r>
-              <w:t>US-06</w:t>
+              <w:t>SCMSEC-11</w:t>
             </w:r>
           </w:p>
         </w:tc>
@@ -14546,7 +14678,7 @@
           </w:tcPr>
           <w:p>
             <w:r>
-              <w:t>US-07</w:t>
+              <w:t>SCMSEC-12</w:t>
             </w:r>
           </w:p>
         </w:tc>
@@ -14604,7 +14736,7 @@
           </w:tcPr>
           <w:p>
             <w:r>
-              <w:t>US-08</w:t>
+              <w:t>SCMSEC-13</w:t>
             </w:r>
           </w:p>
         </w:tc>
@@ -14665,7 +14797,7 @@
           </w:tcPr>
           <w:p>
             <w:r>
-              <w:t>US-09</w:t>
+              <w:t>SCMSEC-14</w:t>
             </w:r>
           </w:p>
         </w:tc>
@@ -14723,7 +14855,7 @@
           </w:tcPr>
           <w:p>
             <w:r>
-              <w:t>US-10</w:t>
+              <w:t>SCMSEC-15</w:t>
             </w:r>
           </w:p>
         </w:tc>
@@ -14784,7 +14916,7 @@
           </w:tcPr>
           <w:p>
             <w:r>
-              <w:t>US-11</w:t>
+              <w:t>SCMSEC-16</w:t>
             </w:r>
           </w:p>
         </w:tc>
@@ -14842,7 +14974,7 @@
           </w:tcPr>
           <w:p>
             <w:r>
-              <w:t>US-12</w:t>
+              <w:t>SCMSEC-17</w:t>
             </w:r>
           </w:p>
         </w:tc>
@@ -14916,7 +15048,15 @@
         <w:pStyle w:val="ListBullet"/>
       </w:pPr>
       <w:r>
-        <w:t>Project key: SCM-SEC</w:t>
+        <w:t>Jira Cloud site: j33v4n.atlassian.net</w:t>
+      </w:r>
+    </w:p>
+    <w:p>
+      <w:pPr>
+        <w:pStyle w:val="ListBullet"/>
+      </w:pPr>
+      <w:r>
+        <w:t>Project key: SCMSEC</w:t>
       </w:r>
     </w:p>
     <w:p>
@@ -14932,7 +15072,7 @@
         <w:pStyle w:val="ListBullet"/>
       </w:pPr>
       <w:r>
-        <w:t>Epics: E1..E5</w:t>
+        <w:t>Epics: SCMSEC-1 .. SCMSEC-5</w:t>
       </w:r>
     </w:p>
     <w:p>
@@ -14940,15 +15080,7 @@
         <w:pStyle w:val="ListBullet"/>
       </w:pPr>
       <w:r>
-        <w:t>Stories: US-01..US-12</w:t>
-      </w:r>
-    </w:p>
-    <w:p>
-      <w:pPr>
-        <w:pStyle w:val="ListBullet"/>
-      </w:pPr>
-      <w:r>
-        <w:t>Tasks per story: design, code, test, security review</w:t>
+        <w:t>Stories: SCMSEC-6 .. SCMSEC-17</w:t>
       </w:r>
     </w:p>
     <w:p>
@@ -14983,14 +15115,15 @@
         <w:tblLook w:firstColumn="1" w:firstRow="1" w:lastColumn="0" w:lastRow="0" w:noHBand="0" w:noVBand="1" w:val="04A0"/>
       </w:tblPr>
       <w:tblGrid>
-        <w:gridCol w:w="3249"/>
-        <w:gridCol w:w="3249"/>
-        <w:gridCol w:w="3249"/>
+        <w:gridCol w:w="2436"/>
+        <w:gridCol w:w="2436"/>
+        <w:gridCol w:w="2436"/>
+        <w:gridCol w:w="2436"/>
       </w:tblGrid>
       <w:tr>
         <w:tc>
           <w:tcPr>
-            <w:tcW w:type="dxa" w:w="3249"/>
+            <w:tcW w:type="dxa" w:w="2436"/>
             <w:vAlign w:val="center"/>
             <w:shd w:val="clear" w:color="auto" w:fill="1F3A5F"/>
           </w:tcPr>
@@ -15007,7 +15140,7 @@
         </w:tc>
         <w:tc>
           <w:tcPr>
-            <w:tcW w:type="dxa" w:w="3249"/>
+            <w:tcW w:type="dxa" w:w="2436"/>
             <w:vAlign w:val="center"/>
             <w:shd w:val="clear" w:color="auto" w:fill="1F3A5F"/>
           </w:tcPr>
@@ -15024,7 +15157,7 @@
         </w:tc>
         <w:tc>
           <w:tcPr>
-            <w:tcW w:type="dxa" w:w="3249"/>
+            <w:tcW w:type="dxa" w:w="2436"/>
             <w:vAlign w:val="center"/>
             <w:shd w:val="clear" w:color="auto" w:fill="1F3A5F"/>
           </w:tcPr>
@@ -15039,22 +15172,39 @@
             </w:r>
           </w:p>
         </w:tc>
+        <w:tc>
+          <w:tcPr>
+            <w:tcW w:type="dxa" w:w="2436"/>
+            <w:vAlign w:val="center"/>
+            <w:shd w:val="clear" w:color="auto" w:fill="1F3A5F"/>
+          </w:tcPr>
+          <w:p>
+            <w:r>
+              <w:rPr>
+                <w:b/>
+                <w:color w:val="FFFFFF"/>
+                <w:sz w:val="21"/>
+              </w:rPr>
+              <w:t>Duration</w:t>
+            </w:r>
+          </w:p>
+        </w:tc>
       </w:tr>
       <w:tr>
         <w:tc>
           <w:tcPr>
-            <w:tcW w:type="dxa" w:w="3249"/>
-            <w:vAlign w:val="center"/>
-          </w:tcPr>
-          <w:p>
-            <w:r>
-              <w:t>Sprint 1 (2 weeks)</w:t>
-            </w:r>
-          </w:p>
-        </w:tc>
-        <w:tc>
-          <w:tcPr>
-            <w:tcW w:type="dxa" w:w="3249"/>
+            <w:tcW w:type="dxa" w:w="2436"/>
+            <w:vAlign w:val="center"/>
+          </w:tcPr>
+          <w:p>
+            <w:r>
+              <w:t>Sprint 1 - Secure Foundation</w:t>
+            </w:r>
+          </w:p>
+        </w:tc>
+        <w:tc>
+          <w:tcPr>
+            <w:tcW w:type="dxa" w:w="2436"/>
             <w:vAlign w:val="center"/>
           </w:tcPr>
           <w:p>
@@ -15065,12 +15215,23 @@
         </w:tc>
         <w:tc>
           <w:tcPr>
-            <w:tcW w:type="dxa" w:w="3249"/>
-            <w:vAlign w:val="center"/>
-          </w:tcPr>
-          <w:p>
-            <w:r>
-              <w:t>US-01, US-02, US-03, US-04, US-10</w:t>
+            <w:tcW w:type="dxa" w:w="2436"/>
+            <w:vAlign w:val="center"/>
+          </w:tcPr>
+          <w:p>
+            <w:r>
+              <w:t>SCMSEC-6, 7, 8, 9, 15</w:t>
+            </w:r>
+          </w:p>
+        </w:tc>
+        <w:tc>
+          <w:tcPr>
+            <w:tcW w:type="dxa" w:w="2436"/>
+            <w:vAlign w:val="center"/>
+          </w:tcPr>
+          <w:p>
+            <w:r>
+              <w:t>2 weeks</w:t>
             </w:r>
           </w:p>
         </w:tc>
@@ -15078,19 +15239,19 @@
       <w:tr>
         <w:tc>
           <w:tcPr>
-            <w:tcW w:type="dxa" w:w="3249"/>
-            <w:vAlign w:val="center"/>
-            <w:shd w:val="clear" w:color="auto" w:fill="F7FAFD"/>
-          </w:tcPr>
-          <w:p>
-            <w:r>
-              <w:t>Sprint 2 (2 weeks)</w:t>
-            </w:r>
-          </w:p>
-        </w:tc>
-        <w:tc>
-          <w:tcPr>
-            <w:tcW w:type="dxa" w:w="3249"/>
+            <w:tcW w:type="dxa" w:w="2436"/>
+            <w:vAlign w:val="center"/>
+            <w:shd w:val="clear" w:color="auto" w:fill="F7FAFD"/>
+          </w:tcPr>
+          <w:p>
+            <w:r>
+              <w:t>Sprint 2 - Logistics</w:t>
+            </w:r>
+          </w:p>
+        </w:tc>
+        <w:tc>
+          <w:tcPr>
+            <w:tcW w:type="dxa" w:w="2436"/>
             <w:vAlign w:val="center"/>
             <w:shd w:val="clear" w:color="auto" w:fill="F7FAFD"/>
           </w:tcPr>
@@ -15102,13 +15263,25 @@
         </w:tc>
         <w:tc>
           <w:tcPr>
-            <w:tcW w:type="dxa" w:w="3249"/>
-            <w:vAlign w:val="center"/>
-            <w:shd w:val="clear" w:color="auto" w:fill="F7FAFD"/>
-          </w:tcPr>
-          <w:p>
-            <w:r>
-              <w:t>US-05, US-06, US-07, US-08, US-09, US-11, US-12</w:t>
+            <w:tcW w:type="dxa" w:w="2436"/>
+            <w:vAlign w:val="center"/>
+            <w:shd w:val="clear" w:color="auto" w:fill="F7FAFD"/>
+          </w:tcPr>
+          <w:p>
+            <w:r>
+              <w:t>SCMSEC-10..14, 16, 17</w:t>
+            </w:r>
+          </w:p>
+        </w:tc>
+        <w:tc>
+          <w:tcPr>
+            <w:tcW w:type="dxa" w:w="2436"/>
+            <w:vAlign w:val="center"/>
+            <w:shd w:val="clear" w:color="auto" w:fill="F7FAFD"/>
+          </w:tcPr>
+          <w:p>
+            <w:r>
+              <w:t>2 weeks</w:t>
             </w:r>
           </w:p>
         </w:tc>
@@ -15146,7 +15319,221 @@
           <w:color w:val="2E74B5"/>
           <w:sz w:val="30"/>
         </w:rPr>
-        <w:t>10.1 Sprint Board (Sprint 2)</w:t>
+        <w:t>10.1 Sprint Board at Start (Jira Evidence)</w:t>
+      </w:r>
+    </w:p>
+    <w:p>
+      <w:r>
+        <w:t>Sprint 1 - Secure Foundation was started in Jira. The board below is a live screenshot from the Jira Cloud site.</w:t>
+      </w:r>
+    </w:p>
+    <w:p>
+      <w:pPr>
+        <w:jc w:val="center"/>
+      </w:pPr>
+      <w:r>
+        <w:drawing>
+          <wp:inline xmlns:a="http://schemas.openxmlformats.org/drawingml/2006/main" xmlns:pic="http://schemas.openxmlformats.org/drawingml/2006/picture">
+            <wp:extent cx="5486400" cy="2804160"/>
+            <wp:docPr id="13" name="Picture 13"/>
+            <wp:cNvGraphicFramePr>
+              <a:graphicFrameLocks noChangeAspect="1"/>
+            </wp:cNvGraphicFramePr>
+            <a:graphic>
+              <a:graphicData uri="http://schemas.openxmlformats.org/drawingml/2006/picture">
+                <pic:pic>
+                  <pic:nvPicPr>
+                    <pic:cNvPr id="0" name="02-sprint1-board.png"/>
+                    <pic:cNvPicPr/>
+                  </pic:nvPicPr>
+                  <pic:blipFill>
+                    <a:blip r:embed="rId22"/>
+                    <a:stretch>
+                      <a:fillRect/>
+                    </a:stretch>
+                  </pic:blipFill>
+                  <pic:spPr>
+                    <a:xfrm>
+                      <a:off x="0" y="0"/>
+                      <a:ext cx="5486400" cy="2804160"/>
+                    </a:xfrm>
+                    <a:prstGeom prst="rect"/>
+                  </pic:spPr>
+                </pic:pic>
+              </a:graphicData>
+            </a:graphic>
+          </wp:inline>
+        </w:drawing>
+      </w:r>
+    </w:p>
+    <w:p>
+      <w:pPr>
+        <w:jc w:val="center"/>
+      </w:pPr>
+      <w:r>
+        <w:rPr>
+          <w:i/>
+          <w:color w:val="555555"/>
+          <w:sz w:val="20"/>
+        </w:rPr>
+        <w:t>Figure 10.1 - Sprint 1 board at sprint start (TO DO / IN PROGRESS / DONE)</w:t>
+      </w:r>
+    </w:p>
+    <w:p/>
+    <w:p>
+      <w:pPr>
+        <w:pStyle w:val="Heading2"/>
+        <w:spacing w:before="240" w:after="120"/>
+      </w:pPr>
+      <w:r>
+        <w:rPr>
+          <w:rFonts w:ascii="Calibri" w:hAnsi="Calibri"/>
+          <w:b/>
+          <w:color w:val="2E74B5"/>
+          <w:sz w:val="30"/>
+        </w:rPr>
+        <w:t>10.2 Board With Progress (Day 3)</w:t>
+      </w:r>
+    </w:p>
+    <w:p>
+      <w:r>
+        <w:t>After three days of execution, several stories have been moved through IN PROGRESS, TESTING, and DONE.</w:t>
+      </w:r>
+    </w:p>
+    <w:p>
+      <w:pPr>
+        <w:jc w:val="center"/>
+      </w:pPr>
+      <w:r>
+        <w:drawing>
+          <wp:inline xmlns:a="http://schemas.openxmlformats.org/drawingml/2006/main" xmlns:pic="http://schemas.openxmlformats.org/drawingml/2006/picture">
+            <wp:extent cx="5486400" cy="2773680"/>
+            <wp:docPr id="14" name="Picture 14"/>
+            <wp:cNvGraphicFramePr>
+              <a:graphicFrameLocks noChangeAspect="1"/>
+            </wp:cNvGraphicFramePr>
+            <a:graphic>
+              <a:graphicData uri="http://schemas.openxmlformats.org/drawingml/2006/picture">
+                <pic:pic>
+                  <pic:nvPicPr>
+                    <pic:cNvPr id="0" name="03-board-progress.png"/>
+                    <pic:cNvPicPr/>
+                  </pic:nvPicPr>
+                  <pic:blipFill>
+                    <a:blip r:embed="rId23"/>
+                    <a:stretch>
+                      <a:fillRect/>
+                    </a:stretch>
+                  </pic:blipFill>
+                  <pic:spPr>
+                    <a:xfrm>
+                      <a:off x="0" y="0"/>
+                      <a:ext cx="5486400" cy="2773680"/>
+                    </a:xfrm>
+                    <a:prstGeom prst="rect"/>
+                  </pic:spPr>
+                </pic:pic>
+              </a:graphicData>
+            </a:graphic>
+          </wp:inline>
+        </w:drawing>
+      </w:r>
+    </w:p>
+    <w:p>
+      <w:pPr>
+        <w:jc w:val="center"/>
+      </w:pPr>
+      <w:r>
+        <w:rPr>
+          <w:i/>
+          <w:color w:val="555555"/>
+          <w:sz w:val="20"/>
+        </w:rPr>
+        <w:t>Figure 10.2 - Sprint 1 board with in-flight and completed stories</w:t>
+      </w:r>
+    </w:p>
+    <w:p/>
+    <w:p>
+      <w:pPr>
+        <w:pStyle w:val="Heading2"/>
+        <w:spacing w:before="240" w:after="120"/>
+      </w:pPr>
+      <w:r>
+        <w:rPr>
+          <w:rFonts w:ascii="Calibri" w:hAnsi="Calibri"/>
+          <w:b/>
+          <w:color w:val="2E74B5"/>
+          <w:sz w:val="30"/>
+        </w:rPr>
+        <w:t>10.3 Burndown Chart</w:t>
+      </w:r>
+    </w:p>
+    <w:p>
+      <w:pPr>
+        <w:jc w:val="center"/>
+      </w:pPr>
+      <w:r>
+        <w:drawing>
+          <wp:inline xmlns:a="http://schemas.openxmlformats.org/drawingml/2006/main" xmlns:pic="http://schemas.openxmlformats.org/drawingml/2006/picture">
+            <wp:extent cx="5486400" cy="2789047"/>
+            <wp:docPr id="15" name="Picture 15"/>
+            <wp:cNvGraphicFramePr>
+              <a:graphicFrameLocks noChangeAspect="1"/>
+            </wp:cNvGraphicFramePr>
+            <a:graphic>
+              <a:graphicData uri="http://schemas.openxmlformats.org/drawingml/2006/picture">
+                <pic:pic>
+                  <pic:nvPicPr>
+                    <pic:cNvPr id="0" name="04-burndown.png"/>
+                    <pic:cNvPicPr/>
+                  </pic:nvPicPr>
+                  <pic:blipFill>
+                    <a:blip r:embed="rId24"/>
+                    <a:stretch>
+                      <a:fillRect/>
+                    </a:stretch>
+                  </pic:blipFill>
+                  <pic:spPr>
+                    <a:xfrm>
+                      <a:off x="0" y="0"/>
+                      <a:ext cx="5486400" cy="2789047"/>
+                    </a:xfrm>
+                    <a:prstGeom prst="rect"/>
+                  </pic:spPr>
+                </pic:pic>
+              </a:graphicData>
+            </a:graphic>
+          </wp:inline>
+        </w:drawing>
+      </w:r>
+    </w:p>
+    <w:p>
+      <w:pPr>
+        <w:jc w:val="center"/>
+      </w:pPr>
+      <w:r>
+        <w:rPr>
+          <w:i/>
+          <w:color w:val="555555"/>
+          <w:sz w:val="20"/>
+        </w:rPr>
+        <w:t>Figure 10.3 - Sprint burndown chart from Jira</w:t>
+      </w:r>
+    </w:p>
+    <w:p/>
+    <w:p>
+      <w:pPr>
+        <w:pStyle w:val="Heading2"/>
+        <w:spacing w:before="240" w:after="120"/>
+      </w:pPr>
+      <w:r>
+        <w:rPr>
+          <w:rFonts w:ascii="Calibri" w:hAnsi="Calibri"/>
+          <w:b/>
+          <w:color w:val="2E74B5"/>
+          <w:sz w:val="30"/>
+        </w:rPr>
+        <w:t>10.4 Sprint Board Snapshot (tabular)</w:t>
       </w:r>
     </w:p>
     <w:tbl>
@@ -15241,7 +15628,7 @@
           </w:tcPr>
           <w:p>
             <w:r>
-              <w:t>US-12</w:t>
+              <w:t>SCMSEC-17</w:t>
             </w:r>
           </w:p>
         </w:tc>
@@ -15252,7 +15639,7 @@
           </w:tcPr>
           <w:p>
             <w:r>
-              <w:t>US-08</w:t>
+              <w:t>SCMSEC-9</w:t>
             </w:r>
           </w:p>
         </w:tc>
@@ -15263,7 +15650,7 @@
           </w:tcPr>
           <w:p>
             <w:r>
-              <w:t>US-07</w:t>
+              <w:t>SCMSEC-15</w:t>
             </w:r>
           </w:p>
         </w:tc>
@@ -15274,57 +15661,7 @@
           </w:tcPr>
           <w:p>
             <w:r>
-              <w:t>US-05, US-06</w:t>
-            </w:r>
-          </w:p>
-        </w:tc>
-      </w:tr>
-      <w:tr>
-        <w:tc>
-          <w:tcPr>
-            <w:tcW w:type="dxa" w:w="2436"/>
-            <w:vAlign w:val="center"/>
-            <w:shd w:val="clear" w:color="auto" w:fill="F7FAFD"/>
-          </w:tcPr>
-          <w:p>
-            <w:r>
-              <w:t>-</w:t>
-            </w:r>
-          </w:p>
-        </w:tc>
-        <w:tc>
-          <w:tcPr>
-            <w:tcW w:type="dxa" w:w="2436"/>
-            <w:vAlign w:val="center"/>
-            <w:shd w:val="clear" w:color="auto" w:fill="F7FAFD"/>
-          </w:tcPr>
-          <w:p>
-            <w:r>
-              <w:t>-</w:t>
-            </w:r>
-          </w:p>
-        </w:tc>
-        <w:tc>
-          <w:tcPr>
-            <w:tcW w:type="dxa" w:w="2436"/>
-            <w:vAlign w:val="center"/>
-            <w:shd w:val="clear" w:color="auto" w:fill="F7FAFD"/>
-          </w:tcPr>
-          <w:p>
-            <w:r>
-              <w:t>US-11</w:t>
-            </w:r>
-          </w:p>
-        </w:tc>
-        <w:tc>
-          <w:tcPr>
-            <w:tcW w:type="dxa" w:w="2436"/>
-            <w:vAlign w:val="center"/>
-            <w:shd w:val="clear" w:color="auto" w:fill="F7FAFD"/>
-          </w:tcPr>
-          <w:p>
-            <w:r>
-              <w:t>-</w:t>
+              <w:t>SCMSEC-6, SCMSEC-7, SCMSEC-8</w:t>
             </w:r>
           </w:p>
         </w:tc>
@@ -15342,7 +15679,7 @@
           <w:color w:val="2E74B5"/>
           <w:sz w:val="30"/>
         </w:rPr>
-        <w:t>10.2 Daily Scrum Entry (Day 3)</w:t>
+        <w:t>10.5 Daily Scrum Entry (Day 3)</w:t>
       </w:r>
     </w:p>
     <w:tbl>
@@ -15448,7 +15785,7 @@
           </w:tcPr>
           <w:p>
             <w:r>
-              <w:t>Finished US-06</w:t>
+              <w:t>Finished SCMSEC-8</w:t>
             </w:r>
           </w:p>
         </w:tc>
@@ -15459,7 +15796,7 @@
           </w:tcPr>
           <w:p>
             <w:r>
-              <w:t>Start US-07</w:t>
+              <w:t>Start SCMSEC-9</w:t>
             </w:r>
           </w:p>
         </w:tc>
@@ -15496,7 +15833,7 @@
           </w:tcPr>
           <w:p>
             <w:r>
-              <w:t>US-09 signature logic</w:t>
+              <w:t>SCMSEC-14 signature logic</w:t>
             </w:r>
           </w:p>
         </w:tc>
@@ -15508,7 +15845,7 @@
           </w:tcPr>
           <w:p>
             <w:r>
-              <w:t>Unit tests for US-09</w:t>
+              <w:t>Unit tests for SCMSEC-14</w:t>
             </w:r>
           </w:p>
         </w:tc>
@@ -15544,7 +15881,7 @@
           </w:tcPr>
           <w:p>
             <w:r>
-              <w:t>Test plan for US-05</w:t>
+              <w:t>Test plan for SCMSEC-6</w:t>
             </w:r>
           </w:p>
         </w:tc>
@@ -15555,7 +15892,7 @@
           </w:tcPr>
           <w:p>
             <w:r>
-              <w:t>Execute US-05 tests</w:t>
+              <w:t>Execute SCMSEC-6 tests</w:t>
             </w:r>
           </w:p>
         </w:tc>
@@ -15592,7 +15929,7 @@
           </w:tcPr>
           <w:p>
             <w:r>
-              <w:t>Threat review US-09</w:t>
+              <w:t>Threat review SCMSEC-14</w:t>
             </w:r>
           </w:p>
         </w:tc>
@@ -15634,12 +15971,7 @@
           <w:color w:val="2E74B5"/>
           <w:sz w:val="30"/>
         </w:rPr>
-        <w:t>10.3 Sprint Burndown Chart</w:t>
-      </w:r>
-    </w:p>
-    <w:p>
-      <w:r>
-        <w:t>Sprint 2 started with 20 story points. The actual line tracks the ideal line with a slight under-burn that resulted in a 2 SP carry-over.</w:t>
+        <w:t>10.6 Sprint Burndown Data</w:t>
       </w:r>
     </w:p>
     <w:tbl>
@@ -15922,7 +16254,7 @@
           </w:tcPr>
           <w:p>
             <w:r>
-              <w:t>2 (carry-over US-12)</w:t>
+              <w:t>2 (carry-over SCMSEC-17)</w:t>
             </w:r>
           </w:p>
         </w:tc>
@@ -15940,7 +16272,7 @@
           <w:color w:val="2E74B5"/>
           <w:sz w:val="30"/>
         </w:rPr>
-        <w:t>10.4 Scrum Metrics</w:t>
+        <w:t>10.7 Scrum Metrics</w:t>
       </w:r>
     </w:p>
     <w:tbl>
@@ -16186,7 +16518,7 @@
           </w:tcPr>
           <w:p>
             <w:r>
-              <w:t>US-12 (real-time status)</w:t>
+              <w:t>SCMSEC-17 (real-time status)</w:t>
             </w:r>
           </w:p>
         </w:tc>
@@ -16204,7 +16536,7 @@
           <w:color w:val="2E74B5"/>
           <w:sz w:val="30"/>
         </w:rPr>
-        <w:t>10.5 Defect Log</w:t>
+        <w:t>10.8 Defect Log</w:t>
       </w:r>
     </w:p>
     <w:tbl>
@@ -16560,7 +16892,7 @@
           <w:color w:val="2E74B5"/>
           <w:sz w:val="30"/>
         </w:rPr>
-        <w:t>10.6 Sprint Review Outcome</w:t>
+        <w:t>10.9 Sprint Review Outcome</w:t>
       </w:r>
     </w:p>
     <w:p>
@@ -16585,7 +16917,7 @@
           <w:color w:val="2E74B5"/>
           <w:sz w:val="30"/>
         </w:rPr>
-        <w:t>10.7 Sprint Retrospective</w:t>
+        <w:t>10.10 Sprint Retrospective</w:t>
       </w:r>
     </w:p>
     <w:tbl>
@@ -16681,7 +17013,7 @@
           </w:tcPr>
           <w:p>
             <w:r>
-              <w:t>Pair-program security-critical stories (US-09)</w:t>
+              <w:t>Pair-program security-critical stories (SCMSEC-14)</w:t>
             </w:r>
           </w:p>
         </w:tc>

</xml_diff>